<commit_message>
docs(sds): add 5 missing flows to Detailed Design (3.7-3.11)
Document Staff content authoring & submit-for-review, Admin user
management, Student support tickets, Staff broadcast notifications
(async fan-out + scheduled email), and published content lifecycle
(unpublish/archive/delete/restore) — each read from the actual
service/controller code and given a Class Diagram, Sequence Diagram,
Class Specifications, and Database Queries matching the format of the
existing 6 flows. Restores the Template2 SDS docx (needed by the build
script) that was dropped in an earlier merge.

Co-Authored-By: Claude Sonnet 5 <noreply@anthropic.com>
</commit_message>
<xml_diff>
--- a/docs/07-Release-Documents/SDS_Document_v2.docx
+++ b/docs/07-Release-Documents/SDS_Document_v2.docx
@@ -1,46 +1,7 @@
 
 <file path=word/document.xml><?xml version="1.0" encoding="utf-8"?>
-<w:document xmlns:wpc="http://schemas.microsoft.com/office/word/2010/wordprocessingCanvas" xmlns:cx="http://schemas.microsoft.com/office/drawing/2014/chartex" xmlns:cx1="http://schemas.microsoft.com/office/drawing/2015/9/8/chartex" xmlns:mc="http://schemas.openxmlformats.org/markup-compatibility/2006" xmlns:o="urn:schemas-microsoft-com:office:office" xmlns:r="http://schemas.openxmlformats.org/officeDocument/2006/relationships" xmlns:m="http://schemas.openxmlformats.org/officeDocument/2006/math" xmlns:v="urn:schemas-microsoft-com:vml" xmlns:wp14="http://schemas.microsoft.com/office/word/2010/wordprocessingDrawing" xmlns:wp="http://schemas.openxmlformats.org/drawingml/2006/wordprocessingDrawing" xmlns:w10="urn:schemas-microsoft-com:office:word" xmlns:w="http://schemas.openxmlformats.org/wordprocessingml/2006/main" xmlns:w14="http://schemas.microsoft.com/office/word/2010/wordml" xmlns:w15="http://schemas.microsoft.com/office/word/2012/wordml" xmlns:w16se="http://schemas.microsoft.com/office/word/2015/wordml/symex" xmlns:wpg="http://schemas.microsoft.com/office/word/2010/wordprocessingGroup" xmlns:wpi="http://schemas.microsoft.com/office/word/2010/wordprocessingInk" xmlns:wne="http://schemas.microsoft.com/office/word/2006/wordml" xmlns:wps="http://schemas.microsoft.com/office/word/2010/wordprocessingShape" mc:Ignorable="w14 w15 w16se wp14">
+<w:document xmlns:wpc="http://schemas.microsoft.com/office/word/2010/wordprocessingCanvas" xmlns:cx="http://schemas.microsoft.com/office/drawing/2014/chartex" xmlns:cx1="http://schemas.microsoft.com/office/drawing/2015/9/8/chartex" xmlns:cx2="http://schemas.microsoft.com/office/drawing/2015/10/21/chartex" xmlns:cx3="http://schemas.microsoft.com/office/drawing/2016/5/9/chartex" xmlns:cx4="http://schemas.microsoft.com/office/drawing/2016/5/10/chartex" xmlns:cx5="http://schemas.microsoft.com/office/drawing/2016/5/11/chartex" xmlns:cx6="http://schemas.microsoft.com/office/drawing/2016/5/12/chartex" xmlns:cx7="http://schemas.microsoft.com/office/drawing/2016/5/13/chartex" xmlns:cx8="http://schemas.microsoft.com/office/drawing/2016/5/14/chartex" xmlns:mc="http://schemas.openxmlformats.org/markup-compatibility/2006" xmlns:aink="http://schemas.microsoft.com/office/drawing/2016/ink" xmlns:am3d="http://schemas.microsoft.com/office/drawing/2017/model3d" xmlns:o="urn:schemas-microsoft-com:office:office" xmlns:r="http://schemas.openxmlformats.org/officeDocument/2006/relationships" xmlns:m="http://schemas.openxmlformats.org/officeDocument/2006/math" xmlns:v="urn:schemas-microsoft-com:vml" xmlns:wp14="http://schemas.microsoft.com/office/word/2010/wordprocessingDrawing" xmlns:wp="http://schemas.openxmlformats.org/drawingml/2006/wordprocessingDrawing" xmlns:w10="urn:schemas-microsoft-com:office:word" xmlns:w="http://schemas.openxmlformats.org/wordprocessingml/2006/main" xmlns:w14="http://schemas.microsoft.com/office/word/2010/wordml" xmlns:w15="http://schemas.microsoft.com/office/word/2012/wordml" xmlns:w16cex="http://schemas.microsoft.com/office/word/2018/wordml/cex" xmlns:w16cid="http://schemas.microsoft.com/office/word/2016/wordml/cid" xmlns:w16="http://schemas.microsoft.com/office/word/2018/wordml" xmlns:w16sdtdh="http://schemas.microsoft.com/office/word/2020/wordml/sdtdatahash" xmlns:w16se="http://schemas.microsoft.com/office/word/2015/wordml/symex" xmlns:wpg="http://schemas.microsoft.com/office/word/2010/wordprocessingGroup" xmlns:wpi="http://schemas.microsoft.com/office/word/2010/wordprocessingInk" xmlns:wne="http://schemas.microsoft.com/office/word/2006/wordml" xmlns:wps="http://schemas.microsoft.com/office/word/2010/wordprocessingShape" mc:Ignorable="w14 w15 w16se w16cid w16 w16cex w16sdtdh wp14">
   <w:body>
-    <w:p>
-      <w:pPr>
-        <w:jc w:val="center"/>
-      </w:pPr>
-      <w:r>
-        <w:drawing>
-          <wp:inline xmlns:a="http://schemas.openxmlformats.org/drawingml/2006/main" xmlns:pic="http://schemas.openxmlformats.org/drawingml/2006/picture">
-            <wp:extent cx="1280160" cy="393547"/>
-            <wp:docPr id="1" name="Picture 1"/>
-            <wp:cNvGraphicFramePr>
-              <a:graphicFrameLocks noChangeAspect="1"/>
-            </wp:cNvGraphicFramePr>
-            <a:graphic>
-              <a:graphicData uri="http://schemas.openxmlformats.org/drawingml/2006/picture">
-                <pic:pic>
-                  <pic:nvPicPr>
-                    <pic:cNvPr id="0" name="image.png"/>
-                    <pic:cNvPicPr/>
-                  </pic:nvPicPr>
-                  <pic:blipFill>
-                    <a:blip r:embed="rId8"/>
-                    <a:stretch>
-                      <a:fillRect/>
-                    </a:stretch>
-                  </pic:blipFill>
-                  <pic:spPr>
-                    <a:xfrm>
-                      <a:off x="0" y="0"/>
-                      <a:ext cx="1280160" cy="393547"/>
-                    </a:xfrm>
-                    <a:prstGeom prst="rect"/>
-                  </pic:spPr>
-                </pic:pic>
-              </a:graphicData>
-            </a:graphic>
-          </wp:inline>
-        </w:drawing>
-      </w:r>
-    </w:p>
     <w:p>
       <w:pPr>
         <w:jc w:val="center"/>
@@ -386,6 +347,48 @@
           </w:p>
         </w:tc>
       </w:tr>
+      <w:tr>
+        <w:tc>
+          <w:tcPr>
+            <w:tcW w:type="dxa" w:w="2412"/>
+          </w:tcPr>
+          <w:p>
+            <w:r>
+              <w:t>2026-07-27</w:t>
+            </w:r>
+          </w:p>
+        </w:tc>
+        <w:tc>
+          <w:tcPr>
+            <w:tcW w:type="dxa" w:w="2412"/>
+          </w:tcPr>
+          <w:p>
+            <w:r>
+              <w:t>A</w:t>
+            </w:r>
+          </w:p>
+        </w:tc>
+        <w:tc>
+          <w:tcPr>
+            <w:tcW w:type="dxa" w:w="2412"/>
+          </w:tcPr>
+          <w:p>
+            <w:r>
+              <w:t>AI Agent</w:t>
+            </w:r>
+          </w:p>
+        </w:tc>
+        <w:tc>
+          <w:tcPr>
+            <w:tcW w:type="dxa" w:w="2412"/>
+          </w:tcPr>
+          <w:p>
+            <w:r>
+              <w:t>Added 5 flows that were missing from section 3 (3.7 Staff Content Authoring &amp; Submit for Review, 3.8 Admin User Management, 3.9 Student Support Ticket, 3.10 Staff Broadcast Notification, 3.11 Published Content Lifecycle), each read directly from source and covering a distinct backend module (staffcontent, admin, support, notification, publishedcontent) not previously documented.</w:t>
+            </w:r>
+          </w:p>
+        </w:tc>
+      </w:tr>
     </w:tbl>
     <w:p>
       <w:r>
@@ -435,8 +438,8 @@
       <w:r>
         <w:drawing>
           <wp:inline xmlns:a="http://schemas.openxmlformats.org/drawingml/2006/main" xmlns:pic="http://schemas.openxmlformats.org/drawingml/2006/picture">
-            <wp:extent cx="5852160" cy="2062026"/>
-            <wp:docPr id="2" name="Picture 2"/>
+            <wp:extent cx="5852160" cy="3196558"/>
+            <wp:docPr id="1" name="Picture 1"/>
             <wp:cNvGraphicFramePr>
               <a:graphicFrameLocks noChangeAspect="1"/>
             </wp:cNvGraphicFramePr>
@@ -444,11 +447,11 @@
               <a:graphicData uri="http://schemas.openxmlformats.org/drawingml/2006/picture">
                 <pic:pic>
                   <pic:nvPicPr>
-                    <pic:cNvPr id="0" name="image.png"/>
+                    <pic:cNvPr id="0" name="architecture.png"/>
                     <pic:cNvPicPr/>
                   </pic:nvPicPr>
                   <pic:blipFill>
-                    <a:blip r:embed="rId10"/>
+                    <a:blip r:embed="rId18"/>
                     <a:stretch>
                       <a:fillRect/>
                     </a:stretch>
@@ -456,7 +459,7 @@
                   <pic:spPr>
                     <a:xfrm>
                       <a:off x="0" y="0"/>
-                      <a:ext cx="5852160" cy="2062026"/>
+                      <a:ext cx="5852160" cy="3196558"/>
                     </a:xfrm>
                     <a:prstGeom prst="rect"/>
                   </pic:spPr>
@@ -480,7 +483,7 @@
         <w:drawing>
           <wp:inline xmlns:a="http://schemas.openxmlformats.org/drawingml/2006/main" xmlns:pic="http://schemas.openxmlformats.org/drawingml/2006/picture">
             <wp:extent cx="5852160" cy="2538374"/>
-            <wp:docPr id="3" name="Picture 3"/>
+            <wp:docPr id="2" name="Picture 2"/>
             <wp:cNvGraphicFramePr>
               <a:graphicFrameLocks noChangeAspect="1"/>
             </wp:cNvGraphicFramePr>
@@ -492,7 +495,7 @@
                     <pic:cNvPicPr/>
                   </pic:nvPicPr>
                   <pic:blipFill>
-                    <a:blip r:embed="rId32"/>
+                    <a:blip r:embed="rId19"/>
                     <a:stretch>
                       <a:fillRect/>
                     </a:stretch>
@@ -1045,7 +1048,7 @@
         <w:drawing>
           <wp:inline xmlns:a="http://schemas.openxmlformats.org/drawingml/2006/main" xmlns:pic="http://schemas.openxmlformats.org/drawingml/2006/picture">
             <wp:extent cx="5852160" cy="1950146"/>
-            <wp:docPr id="4" name="Picture 4"/>
+            <wp:docPr id="3" name="Picture 3"/>
             <wp:cNvGraphicFramePr>
               <a:graphicFrameLocks noChangeAspect="1"/>
             </wp:cNvGraphicFramePr>
@@ -1057,7 +1060,7 @@
                     <pic:cNvPicPr/>
                   </pic:nvPicPr>
                   <pic:blipFill>
-                    <a:blip r:embed="rId33"/>
+                    <a:blip r:embed="rId20"/>
                     <a:stretch>
                       <a:fillRect/>
                     </a:stretch>
@@ -10058,7 +10061,7 @@
         <w:drawing>
           <wp:inline xmlns:a="http://schemas.openxmlformats.org/drawingml/2006/main" xmlns:pic="http://schemas.openxmlformats.org/drawingml/2006/picture">
             <wp:extent cx="5852160" cy="2027601"/>
-            <wp:docPr id="5" name="Picture 5"/>
+            <wp:docPr id="4" name="Picture 4"/>
             <wp:cNvGraphicFramePr>
               <a:graphicFrameLocks noChangeAspect="1"/>
             </wp:cNvGraphicFramePr>
@@ -10066,11 +10069,11 @@
               <a:graphicData uri="http://schemas.openxmlformats.org/drawingml/2006/picture">
                 <pic:pic>
                   <pic:nvPicPr>
-                    <pic:cNvPr id="0" name="image.png"/>
+                    <pic:cNvPr id="0" name="state-test-attempt.png"/>
                     <pic:cNvPicPr/>
                   </pic:nvPicPr>
                   <pic:blipFill>
-                    <a:blip r:embed="rId14"/>
+                    <a:blip r:embed="rId21"/>
                     <a:stretch>
                       <a:fillRect/>
                     </a:stretch>
@@ -10112,7 +10115,7 @@
         <w:drawing>
           <wp:inline xmlns:a="http://schemas.openxmlformats.org/drawingml/2006/main" xmlns:pic="http://schemas.openxmlformats.org/drawingml/2006/picture">
             <wp:extent cx="5852160" cy="2265130"/>
-            <wp:docPr id="6" name="Picture 6"/>
+            <wp:docPr id="5" name="Picture 5"/>
             <wp:cNvGraphicFramePr>
               <a:graphicFrameLocks noChangeAspect="1"/>
             </wp:cNvGraphicFramePr>
@@ -10124,7 +10127,7 @@
                     <pic:cNvPicPr/>
                   </pic:nvPicPr>
                   <pic:blipFill>
-                    <a:blip r:embed="rId34"/>
+                    <a:blip r:embed="rId22"/>
                     <a:stretch>
                       <a:fillRect/>
                     </a:stretch>
@@ -10166,7 +10169,7 @@
         <w:drawing>
           <wp:inline xmlns:a="http://schemas.openxmlformats.org/drawingml/2006/main" xmlns:pic="http://schemas.openxmlformats.org/drawingml/2006/picture">
             <wp:extent cx="5852160" cy="1979407"/>
-            <wp:docPr id="7" name="Picture 7"/>
+            <wp:docPr id="6" name="Picture 6"/>
             <wp:cNvGraphicFramePr>
               <a:graphicFrameLocks noChangeAspect="1"/>
             </wp:cNvGraphicFramePr>
@@ -10178,7 +10181,7 @@
                     <pic:cNvPicPr/>
                   </pic:nvPicPr>
                   <pic:blipFill>
-                    <a:blip r:embed="rId35"/>
+                    <a:blip r:embed="rId23"/>
                     <a:stretch>
                       <a:fillRect/>
                     </a:stretch>
@@ -10236,7 +10239,7 @@
         <w:drawing>
           <wp:inline xmlns:a="http://schemas.openxmlformats.org/drawingml/2006/main" xmlns:pic="http://schemas.openxmlformats.org/drawingml/2006/picture">
             <wp:extent cx="5852160" cy="1832458"/>
-            <wp:docPr id="8" name="Picture 8"/>
+            <wp:docPr id="7" name="Picture 7"/>
             <wp:cNvGraphicFramePr>
               <a:graphicFrameLocks noChangeAspect="1"/>
             </wp:cNvGraphicFramePr>
@@ -10248,7 +10251,7 @@
                     <pic:cNvPicPr/>
                   </pic:nvPicPr>
                   <pic:blipFill>
-                    <a:blip r:embed="rId36"/>
+                    <a:blip r:embed="rId24"/>
                     <a:stretch>
                       <a:fillRect/>
                     </a:stretch>
@@ -10640,7 +10643,7 @@
         <w:drawing>
           <wp:inline xmlns:a="http://schemas.openxmlformats.org/drawingml/2006/main" xmlns:pic="http://schemas.openxmlformats.org/drawingml/2006/picture">
             <wp:extent cx="5852160" cy="2300630"/>
-            <wp:docPr id="9" name="Picture 9"/>
+            <wp:docPr id="8" name="Picture 8"/>
             <wp:cNvGraphicFramePr>
               <a:graphicFrameLocks noChangeAspect="1"/>
             </wp:cNvGraphicFramePr>
@@ -10652,7 +10655,7 @@
                     <pic:cNvPicPr/>
                   </pic:nvPicPr>
                   <pic:blipFill>
-                    <a:blip r:embed="rId37"/>
+                    <a:blip r:embed="rId25"/>
                     <a:stretch>
                       <a:fillRect/>
                     </a:stretch>
@@ -10681,132 +10684,163 @@
         <w:t>Database Queries</w:t>
       </w:r>
     </w:p>
-    <w:p>
-      <w:r>
-        <w:rPr>
-          <w:rFonts w:ascii="Consolas" w:hAnsi="Consolas"/>
-          <w:sz w:val="19"/>
-        </w:rPr>
-        <w:t>-- checkAccountType / login: look up the account by email</w:t>
-      </w:r>
-      <w:r>
-        <w:br/>
-      </w:r>
-      <w:r>
-        <w:rPr>
-          <w:rFonts w:ascii="Consolas" w:hAnsi="Consolas"/>
-          <w:sz w:val="19"/>
-        </w:rPr>
-        <w:t>SELECT * FROM student_users WHERE email = ? AND is_deleted = 0;</w:t>
-      </w:r>
-      <w:r>
-        <w:br/>
-      </w:r>
-      <w:r>
-        <w:rPr>
-          <w:rFonts w:ascii="Consolas" w:hAnsi="Consolas"/>
-          <w:sz w:val="19"/>
-        </w:rPr>
-      </w:r>
-      <w:r>
-        <w:br/>
-      </w:r>
-      <w:r>
-        <w:rPr>
-          <w:rFonts w:ascii="Consolas" w:hAnsi="Consolas"/>
-          <w:sz w:val="19"/>
-        </w:rPr>
-        <w:t>-- store the refresh token on successful login</w:t>
-      </w:r>
-      <w:r>
-        <w:br/>
-      </w:r>
-      <w:r>
-        <w:rPr>
-          <w:rFonts w:ascii="Consolas" w:hAnsi="Consolas"/>
-          <w:sz w:val="19"/>
-        </w:rPr>
-        <w:t>INSERT INTO auth_tokens (actor_type, actor_id, token_type, token_hash, expires_at, created_at)</w:t>
-      </w:r>
-      <w:r>
-        <w:br/>
-      </w:r>
-      <w:r>
-        <w:rPr>
-          <w:rFonts w:ascii="Consolas" w:hAnsi="Consolas"/>
-          <w:sz w:val="19"/>
-        </w:rPr>
-        <w:t>VALUES ('STUDENT', ?, 'REFRESH', ?, ?, GETDATE());</w:t>
-      </w:r>
-      <w:r>
-        <w:br/>
-      </w:r>
-      <w:r>
-        <w:rPr>
-          <w:rFonts w:ascii="Consolas" w:hAnsi="Consolas"/>
-          <w:sz w:val="19"/>
-        </w:rPr>
-      </w:r>
-      <w:r>
-        <w:br/>
-      </w:r>
-      <w:r>
-        <w:rPr>
-          <w:rFonts w:ascii="Consolas" w:hAnsi="Consolas"/>
-          <w:sz w:val="19"/>
-        </w:rPr>
-        <w:t>-- refresh(): look up a still-valid refresh token</w:t>
-      </w:r>
-      <w:r>
-        <w:br/>
-      </w:r>
-      <w:r>
-        <w:rPr>
-          <w:rFonts w:ascii="Consolas" w:hAnsi="Consolas"/>
-          <w:sz w:val="19"/>
-        </w:rPr>
-        <w:t>SELECT * FROM auth_tokens</w:t>
-      </w:r>
-      <w:r>
-        <w:br/>
-      </w:r>
-      <w:r>
-        <w:rPr>
-          <w:rFonts w:ascii="Consolas" w:hAnsi="Consolas"/>
-          <w:sz w:val="19"/>
-        </w:rPr>
-        <w:t>WHERE token_hash = ? AND token_type = 'REFRESH' AND expires_at &gt; GETDATE();</w:t>
-      </w:r>
-      <w:r>
-        <w:br/>
-      </w:r>
-      <w:r>
-        <w:rPr>
-          <w:rFonts w:ascii="Consolas" w:hAnsi="Consolas"/>
-          <w:sz w:val="19"/>
-        </w:rPr>
-      </w:r>
-      <w:r>
-        <w:br/>
-      </w:r>
-      <w:r>
-        <w:rPr>
-          <w:rFonts w:ascii="Consolas" w:hAnsi="Consolas"/>
-          <w:sz w:val="19"/>
-        </w:rPr>
-        <w:t>-- logout(): revoke the token (soft, no DELETE)</w:t>
-      </w:r>
-      <w:r>
-        <w:br/>
-      </w:r>
-      <w:r>
-        <w:rPr>
-          <w:rFonts w:ascii="Consolas" w:hAnsi="Consolas"/>
-          <w:sz w:val="19"/>
-        </w:rPr>
-        <w:t>UPDATE auth_tokens SET revoked_at = GETDATE() WHERE token_hash = ?;</w:t>
-      </w:r>
-    </w:p>
+    <w:tbl>
+      <w:tblPr>
+        <w:tblW w:type="auto" w:w="0"/>
+        <w:tblLayout w:type="autofit"/>
+        <w:tblLook w:firstColumn="1" w:firstRow="1" w:lastColumn="0" w:lastRow="0" w:noHBand="0" w:noVBand="1" w:val="04A0"/>
+      </w:tblPr>
+      <w:tblGrid>
+        <w:gridCol w:w="9648"/>
+      </w:tblGrid>
+      <w:tr>
+        <w:tc>
+          <w:tcPr>
+            <w:tcW w:type="dxa" w:w="9648"/>
+            <w:shd w:val="clear" w:color="auto" w:fill="F2F6FC"/>
+            <w:tcBorders>
+              <w:top w:val="single" w:sz="12" w:space="0" w:color="8EAADB"/>
+              <w:left w:val="single" w:sz="12" w:space="0" w:color="8EAADB"/>
+              <w:bottom w:val="single" w:sz="12" w:space="0" w:color="8EAADB"/>
+              <w:right w:val="single" w:sz="12" w:space="0" w:color="8EAADB"/>
+            </w:tcBorders>
+            <w:tcMar>
+              <w:top w:w="120" w:type="dxa"/>
+              <w:bottom w:w="120" w:type="dxa"/>
+              <w:left w:w="160" w:type="dxa"/>
+              <w:right w:w="160" w:type="dxa"/>
+            </w:tcMar>
+          </w:tcPr>
+          <w:p>
+            <w:r/>
+            <w:r>
+              <w:rPr>
+                <w:rFonts w:ascii="Consolas" w:hAnsi="Consolas"/>
+                <w:sz w:val="19"/>
+              </w:rPr>
+              <w:t>-- checkAccountType / login: look up the account by email</w:t>
+            </w:r>
+            <w:r>
+              <w:br/>
+            </w:r>
+            <w:r>
+              <w:rPr>
+                <w:rFonts w:ascii="Consolas" w:hAnsi="Consolas"/>
+                <w:sz w:val="19"/>
+              </w:rPr>
+              <w:t>SELECT * FROM student_users WHERE email = ? AND is_deleted = 0;</w:t>
+            </w:r>
+            <w:r>
+              <w:br/>
+            </w:r>
+            <w:r>
+              <w:rPr>
+                <w:rFonts w:ascii="Consolas" w:hAnsi="Consolas"/>
+                <w:sz w:val="19"/>
+              </w:rPr>
+            </w:r>
+            <w:r>
+              <w:br/>
+            </w:r>
+            <w:r>
+              <w:rPr>
+                <w:rFonts w:ascii="Consolas" w:hAnsi="Consolas"/>
+                <w:sz w:val="19"/>
+              </w:rPr>
+              <w:t>-- store the refresh token on successful login</w:t>
+            </w:r>
+            <w:r>
+              <w:br/>
+            </w:r>
+            <w:r>
+              <w:rPr>
+                <w:rFonts w:ascii="Consolas" w:hAnsi="Consolas"/>
+                <w:sz w:val="19"/>
+              </w:rPr>
+              <w:t>INSERT INTO auth_tokens (actor_type, actor_id, token_type, token_hash, expires_at, created_at)</w:t>
+            </w:r>
+            <w:r>
+              <w:br/>
+            </w:r>
+            <w:r>
+              <w:rPr>
+                <w:rFonts w:ascii="Consolas" w:hAnsi="Consolas"/>
+                <w:sz w:val="19"/>
+              </w:rPr>
+              <w:t>VALUES ('STUDENT', ?, 'REFRESH', ?, ?, GETDATE());</w:t>
+            </w:r>
+            <w:r>
+              <w:br/>
+            </w:r>
+            <w:r>
+              <w:rPr>
+                <w:rFonts w:ascii="Consolas" w:hAnsi="Consolas"/>
+                <w:sz w:val="19"/>
+              </w:rPr>
+            </w:r>
+            <w:r>
+              <w:br/>
+            </w:r>
+            <w:r>
+              <w:rPr>
+                <w:rFonts w:ascii="Consolas" w:hAnsi="Consolas"/>
+                <w:sz w:val="19"/>
+              </w:rPr>
+              <w:t>-- refresh(): look up a still-valid refresh token</w:t>
+            </w:r>
+            <w:r>
+              <w:br/>
+            </w:r>
+            <w:r>
+              <w:rPr>
+                <w:rFonts w:ascii="Consolas" w:hAnsi="Consolas"/>
+                <w:sz w:val="19"/>
+              </w:rPr>
+              <w:t>SELECT * FROM auth_tokens</w:t>
+            </w:r>
+            <w:r>
+              <w:br/>
+            </w:r>
+            <w:r>
+              <w:rPr>
+                <w:rFonts w:ascii="Consolas" w:hAnsi="Consolas"/>
+                <w:sz w:val="19"/>
+              </w:rPr>
+              <w:t>WHERE token_hash = ? AND token_type = 'REFRESH' AND expires_at &gt; GETDATE();</w:t>
+            </w:r>
+            <w:r>
+              <w:br/>
+            </w:r>
+            <w:r>
+              <w:rPr>
+                <w:rFonts w:ascii="Consolas" w:hAnsi="Consolas"/>
+                <w:sz w:val="19"/>
+              </w:rPr>
+            </w:r>
+            <w:r>
+              <w:br/>
+            </w:r>
+            <w:r>
+              <w:rPr>
+                <w:rFonts w:ascii="Consolas" w:hAnsi="Consolas"/>
+                <w:sz w:val="19"/>
+              </w:rPr>
+              <w:t>-- logout(): revoke the token (soft, no DELETE)</w:t>
+            </w:r>
+            <w:r>
+              <w:br/>
+            </w:r>
+            <w:r>
+              <w:rPr>
+                <w:rFonts w:ascii="Consolas" w:hAnsi="Consolas"/>
+                <w:sz w:val="19"/>
+              </w:rPr>
+              <w:t>UPDATE auth_tokens SET revoked_at = GETDATE() WHERE token_hash = ?;</w:t>
+            </w:r>
+          </w:p>
+        </w:tc>
+      </w:tr>
+    </w:tbl>
     <w:p>
       <w:pPr>
         <w:pStyle w:val="Heading3"/>
@@ -10828,7 +10862,7 @@
         <w:drawing>
           <wp:inline xmlns:a="http://schemas.openxmlformats.org/drawingml/2006/main" xmlns:pic="http://schemas.openxmlformats.org/drawingml/2006/picture">
             <wp:extent cx="5852160" cy="3471062"/>
-            <wp:docPr id="10" name="Picture 10"/>
+            <wp:docPr id="9" name="Picture 9"/>
             <wp:cNvGraphicFramePr>
               <a:graphicFrameLocks noChangeAspect="1"/>
             </wp:cNvGraphicFramePr>
@@ -10840,7 +10874,7 @@
                     <pic:cNvPicPr/>
                   </pic:nvPicPr>
                   <pic:blipFill>
-                    <a:blip r:embed="rId38"/>
+                    <a:blip r:embed="rId26"/>
                     <a:stretch>
                       <a:fillRect/>
                     </a:stretch>
@@ -11041,7 +11075,7 @@
         <w:drawing>
           <wp:inline xmlns:a="http://schemas.openxmlformats.org/drawingml/2006/main" xmlns:pic="http://schemas.openxmlformats.org/drawingml/2006/picture">
             <wp:extent cx="5852160" cy="2509114"/>
-            <wp:docPr id="11" name="Picture 11"/>
+            <wp:docPr id="10" name="Picture 10"/>
             <wp:cNvGraphicFramePr>
               <a:graphicFrameLocks noChangeAspect="1"/>
             </wp:cNvGraphicFramePr>
@@ -11053,7 +11087,7 @@
                     <pic:cNvPicPr/>
                   </pic:nvPicPr>
                   <pic:blipFill>
-                    <a:blip r:embed="rId39"/>
+                    <a:blip r:embed="rId27"/>
                     <a:stretch>
                       <a:fillRect/>
                     </a:stretch>
@@ -11082,240 +11116,271 @@
         <w:t>Database Queries</w:t>
       </w:r>
     </w:p>
-    <w:p>
-      <w:r>
-        <w:rPr>
-          <w:rFonts w:ascii="Consolas" w:hAnsi="Consolas"/>
-          <w:sz w:val="19"/>
-        </w:rPr>
-        <w:t>-- startQuiz(): check the quiz is published</w:t>
-      </w:r>
-      <w:r>
-        <w:br/>
-      </w:r>
-      <w:r>
-        <w:rPr>
-          <w:rFonts w:ascii="Consolas" w:hAnsi="Consolas"/>
-          <w:sz w:val="19"/>
-        </w:rPr>
-        <w:t>SELECT * FROM assessments</w:t>
-      </w:r>
-      <w:r>
-        <w:br/>
-      </w:r>
-      <w:r>
-        <w:rPr>
-          <w:rFonts w:ascii="Consolas" w:hAnsi="Consolas"/>
-          <w:sz w:val="19"/>
-        </w:rPr>
-        <w:t>WHERE id = ? AND assessment_type = 'QUIZ' AND status = 'PUBLISHED';</w:t>
-      </w:r>
-      <w:r>
-        <w:br/>
-      </w:r>
-      <w:r>
-        <w:rPr>
-          <w:rFonts w:ascii="Consolas" w:hAnsi="Consolas"/>
-          <w:sz w:val="19"/>
-        </w:rPr>
-      </w:r>
-      <w:r>
-        <w:br/>
-      </w:r>
-      <w:r>
-        <w:rPr>
-          <w:rFonts w:ascii="Consolas" w:hAnsi="Consolas"/>
-          <w:sz w:val="19"/>
-        </w:rPr>
-        <w:t>-- load the assigned questions, in display order</w:t>
-      </w:r>
-      <w:r>
-        <w:br/>
-      </w:r>
-      <w:r>
-        <w:rPr>
-          <w:rFonts w:ascii="Consolas" w:hAnsi="Consolas"/>
-          <w:sz w:val="19"/>
-        </w:rPr>
-        <w:t>SELECT qa.* FROM question_assignments qa</w:t>
-      </w:r>
-      <w:r>
-        <w:br/>
-      </w:r>
-      <w:r>
-        <w:rPr>
-          <w:rFonts w:ascii="Consolas" w:hAnsi="Consolas"/>
-          <w:sz w:val="19"/>
-        </w:rPr>
-        <w:t>WHERE qa.parent_type = 'ASSESSMENT' AND qa.parent_id = ?</w:t>
-      </w:r>
-      <w:r>
-        <w:br/>
-      </w:r>
-      <w:r>
-        <w:rPr>
-          <w:rFonts w:ascii="Consolas" w:hAnsi="Consolas"/>
-          <w:sz w:val="19"/>
-        </w:rPr>
-        <w:t>ORDER BY qa.display_order;</w:t>
-      </w:r>
-      <w:r>
-        <w:br/>
-      </w:r>
-      <w:r>
-        <w:rPr>
-          <w:rFonts w:ascii="Consolas" w:hAnsi="Consolas"/>
-          <w:sz w:val="19"/>
-        </w:rPr>
-      </w:r>
-      <w:r>
-        <w:br/>
-      </w:r>
-      <w:r>
-        <w:rPr>
-          <w:rFonts w:ascii="Consolas" w:hAnsi="Consolas"/>
-          <w:sz w:val="19"/>
-        </w:rPr>
-        <w:t>-- create a new attempt when the student starts the quiz</w:t>
-      </w:r>
-      <w:r>
-        <w:br/>
-      </w:r>
-      <w:r>
-        <w:rPr>
-          <w:rFonts w:ascii="Consolas" w:hAnsi="Consolas"/>
-          <w:sz w:val="19"/>
-        </w:rPr>
-        <w:t>INSERT INTO test_attempts (student_id, attempt_type, parent_type, parent_id, started_at, max_score, status)</w:t>
-      </w:r>
-      <w:r>
-        <w:br/>
-      </w:r>
-      <w:r>
-        <w:rPr>
-          <w:rFonts w:ascii="Consolas" w:hAnsi="Consolas"/>
-          <w:sz w:val="19"/>
-        </w:rPr>
-        <w:t>VALUES (?, 'QUIZ', 'ASSESSMENT', ?, GETDATE(), ?, 'IN_PROGRESS');</w:t>
-      </w:r>
-      <w:r>
-        <w:br/>
-      </w:r>
-      <w:r>
-        <w:rPr>
-          <w:rFonts w:ascii="Consolas" w:hAnsi="Consolas"/>
-          <w:sz w:val="19"/>
-        </w:rPr>
-      </w:r>
-      <w:r>
-        <w:br/>
-      </w:r>
-      <w:r>
-        <w:rPr>
-          <w:rFonts w:ascii="Consolas" w:hAnsi="Consolas"/>
-          <w:sz w:val="19"/>
-        </w:rPr>
-        <w:t>-- submitQuiz(): lock the attempt row to prevent duplicate submission</w:t>
-      </w:r>
-      <w:r>
-        <w:br/>
-      </w:r>
-      <w:r>
-        <w:rPr>
-          <w:rFonts w:ascii="Consolas" w:hAnsi="Consolas"/>
-          <w:sz w:val="19"/>
-        </w:rPr>
-        <w:t>SELECT * FROM test_attempts WITH (UPDLOCK, ROWLOCK) WHERE id = ?;</w:t>
-      </w:r>
-      <w:r>
-        <w:br/>
-      </w:r>
-      <w:r>
-        <w:rPr>
-          <w:rFonts w:ascii="Consolas" w:hAnsi="Consolas"/>
-          <w:sz w:val="19"/>
-        </w:rPr>
-      </w:r>
-      <w:r>
-        <w:br/>
-      </w:r>
-      <w:r>
-        <w:rPr>
-          <w:rFonts w:ascii="Consolas" w:hAnsi="Consolas"/>
-          <w:sz w:val="19"/>
-        </w:rPr>
-        <w:t>-- save each answer after grading</w:t>
-      </w:r>
-      <w:r>
-        <w:br/>
-      </w:r>
-      <w:r>
-        <w:rPr>
-          <w:rFonts w:ascii="Consolas" w:hAnsi="Consolas"/>
-          <w:sz w:val="19"/>
-        </w:rPr>
-        <w:t>INSERT INTO attempt_answers (attempt_id, question_id, selected_option, is_correct)</w:t>
-      </w:r>
-      <w:r>
-        <w:br/>
-      </w:r>
-      <w:r>
-        <w:rPr>
-          <w:rFonts w:ascii="Consolas" w:hAnsi="Consolas"/>
-          <w:sz w:val="19"/>
-        </w:rPr>
-        <w:t>VALUES (?, ?, ?, ?);</w:t>
-      </w:r>
-      <w:r>
-        <w:br/>
-      </w:r>
-      <w:r>
-        <w:rPr>
-          <w:rFonts w:ascii="Consolas" w:hAnsi="Consolas"/>
-          <w:sz w:val="19"/>
-        </w:rPr>
-      </w:r>
-      <w:r>
-        <w:br/>
-      </w:r>
-      <w:r>
-        <w:rPr>
-          <w:rFonts w:ascii="Consolas" w:hAnsi="Consolas"/>
-          <w:sz w:val="19"/>
-        </w:rPr>
-        <w:t>-- update the attempt after submission</w:t>
-      </w:r>
-      <w:r>
-        <w:br/>
-      </w:r>
-      <w:r>
-        <w:rPr>
-          <w:rFonts w:ascii="Consolas" w:hAnsi="Consolas"/>
-          <w:sz w:val="19"/>
-        </w:rPr>
-        <w:t>UPDATE test_attempts</w:t>
-      </w:r>
-      <w:r>
-        <w:br/>
-      </w:r>
-      <w:r>
-        <w:rPr>
-          <w:rFonts w:ascii="Consolas" w:hAnsi="Consolas"/>
-          <w:sz w:val="19"/>
-        </w:rPr>
-        <w:t>SET status = 'SUBMITTED', submitted_at = GETDATE(), score = ?</w:t>
-      </w:r>
-      <w:r>
-        <w:br/>
-      </w:r>
-      <w:r>
-        <w:rPr>
-          <w:rFonts w:ascii="Consolas" w:hAnsi="Consolas"/>
-          <w:sz w:val="19"/>
-        </w:rPr>
-        <w:t>WHERE id = ?;</w:t>
-      </w:r>
-    </w:p>
+    <w:tbl>
+      <w:tblPr>
+        <w:tblW w:type="auto" w:w="0"/>
+        <w:tblLayout w:type="autofit"/>
+        <w:tblLook w:firstColumn="1" w:firstRow="1" w:lastColumn="0" w:lastRow="0" w:noHBand="0" w:noVBand="1" w:val="04A0"/>
+      </w:tblPr>
+      <w:tblGrid>
+        <w:gridCol w:w="9648"/>
+      </w:tblGrid>
+      <w:tr>
+        <w:tc>
+          <w:tcPr>
+            <w:tcW w:type="dxa" w:w="9648"/>
+            <w:shd w:val="clear" w:color="auto" w:fill="F2F6FC"/>
+            <w:tcBorders>
+              <w:top w:val="single" w:sz="12" w:space="0" w:color="8EAADB"/>
+              <w:left w:val="single" w:sz="12" w:space="0" w:color="8EAADB"/>
+              <w:bottom w:val="single" w:sz="12" w:space="0" w:color="8EAADB"/>
+              <w:right w:val="single" w:sz="12" w:space="0" w:color="8EAADB"/>
+            </w:tcBorders>
+            <w:tcMar>
+              <w:top w:w="120" w:type="dxa"/>
+              <w:bottom w:w="120" w:type="dxa"/>
+              <w:left w:w="160" w:type="dxa"/>
+              <w:right w:w="160" w:type="dxa"/>
+            </w:tcMar>
+          </w:tcPr>
+          <w:p>
+            <w:r/>
+            <w:r>
+              <w:rPr>
+                <w:rFonts w:ascii="Consolas" w:hAnsi="Consolas"/>
+                <w:sz w:val="19"/>
+              </w:rPr>
+              <w:t>-- startQuiz(): check the quiz is published</w:t>
+            </w:r>
+            <w:r>
+              <w:br/>
+            </w:r>
+            <w:r>
+              <w:rPr>
+                <w:rFonts w:ascii="Consolas" w:hAnsi="Consolas"/>
+                <w:sz w:val="19"/>
+              </w:rPr>
+              <w:t>SELECT * FROM assessments</w:t>
+            </w:r>
+            <w:r>
+              <w:br/>
+            </w:r>
+            <w:r>
+              <w:rPr>
+                <w:rFonts w:ascii="Consolas" w:hAnsi="Consolas"/>
+                <w:sz w:val="19"/>
+              </w:rPr>
+              <w:t>WHERE id = ? AND assessment_type = 'QUIZ' AND status = 'PUBLISHED';</w:t>
+            </w:r>
+            <w:r>
+              <w:br/>
+            </w:r>
+            <w:r>
+              <w:rPr>
+                <w:rFonts w:ascii="Consolas" w:hAnsi="Consolas"/>
+                <w:sz w:val="19"/>
+              </w:rPr>
+            </w:r>
+            <w:r>
+              <w:br/>
+            </w:r>
+            <w:r>
+              <w:rPr>
+                <w:rFonts w:ascii="Consolas" w:hAnsi="Consolas"/>
+                <w:sz w:val="19"/>
+              </w:rPr>
+              <w:t>-- load the assigned questions, in display order</w:t>
+            </w:r>
+            <w:r>
+              <w:br/>
+            </w:r>
+            <w:r>
+              <w:rPr>
+                <w:rFonts w:ascii="Consolas" w:hAnsi="Consolas"/>
+                <w:sz w:val="19"/>
+              </w:rPr>
+              <w:t>SELECT qa.* FROM question_assignments qa</w:t>
+            </w:r>
+            <w:r>
+              <w:br/>
+            </w:r>
+            <w:r>
+              <w:rPr>
+                <w:rFonts w:ascii="Consolas" w:hAnsi="Consolas"/>
+                <w:sz w:val="19"/>
+              </w:rPr>
+              <w:t>WHERE qa.parent_type = 'ASSESSMENT' AND qa.parent_id = ?</w:t>
+            </w:r>
+            <w:r>
+              <w:br/>
+            </w:r>
+            <w:r>
+              <w:rPr>
+                <w:rFonts w:ascii="Consolas" w:hAnsi="Consolas"/>
+                <w:sz w:val="19"/>
+              </w:rPr>
+              <w:t>ORDER BY qa.display_order;</w:t>
+            </w:r>
+            <w:r>
+              <w:br/>
+            </w:r>
+            <w:r>
+              <w:rPr>
+                <w:rFonts w:ascii="Consolas" w:hAnsi="Consolas"/>
+                <w:sz w:val="19"/>
+              </w:rPr>
+            </w:r>
+            <w:r>
+              <w:br/>
+            </w:r>
+            <w:r>
+              <w:rPr>
+                <w:rFonts w:ascii="Consolas" w:hAnsi="Consolas"/>
+                <w:sz w:val="19"/>
+              </w:rPr>
+              <w:t>-- create a new attempt when the student starts the quiz</w:t>
+            </w:r>
+            <w:r>
+              <w:br/>
+            </w:r>
+            <w:r>
+              <w:rPr>
+                <w:rFonts w:ascii="Consolas" w:hAnsi="Consolas"/>
+                <w:sz w:val="19"/>
+              </w:rPr>
+              <w:t>INSERT INTO test_attempts (student_id, attempt_type, parent_type, parent_id, started_at, max_score, status)</w:t>
+            </w:r>
+            <w:r>
+              <w:br/>
+            </w:r>
+            <w:r>
+              <w:rPr>
+                <w:rFonts w:ascii="Consolas" w:hAnsi="Consolas"/>
+                <w:sz w:val="19"/>
+              </w:rPr>
+              <w:t>VALUES (?, 'QUIZ', 'ASSESSMENT', ?, GETDATE(), ?, 'IN_PROGRESS');</w:t>
+            </w:r>
+            <w:r>
+              <w:br/>
+            </w:r>
+            <w:r>
+              <w:rPr>
+                <w:rFonts w:ascii="Consolas" w:hAnsi="Consolas"/>
+                <w:sz w:val="19"/>
+              </w:rPr>
+            </w:r>
+            <w:r>
+              <w:br/>
+            </w:r>
+            <w:r>
+              <w:rPr>
+                <w:rFonts w:ascii="Consolas" w:hAnsi="Consolas"/>
+                <w:sz w:val="19"/>
+              </w:rPr>
+              <w:t>-- submitQuiz(): lock the attempt row to prevent duplicate submission</w:t>
+            </w:r>
+            <w:r>
+              <w:br/>
+            </w:r>
+            <w:r>
+              <w:rPr>
+                <w:rFonts w:ascii="Consolas" w:hAnsi="Consolas"/>
+                <w:sz w:val="19"/>
+              </w:rPr>
+              <w:t>SELECT * FROM test_attempts WITH (UPDLOCK, ROWLOCK) WHERE id = ?;</w:t>
+            </w:r>
+            <w:r>
+              <w:br/>
+            </w:r>
+            <w:r>
+              <w:rPr>
+                <w:rFonts w:ascii="Consolas" w:hAnsi="Consolas"/>
+                <w:sz w:val="19"/>
+              </w:rPr>
+            </w:r>
+            <w:r>
+              <w:br/>
+            </w:r>
+            <w:r>
+              <w:rPr>
+                <w:rFonts w:ascii="Consolas" w:hAnsi="Consolas"/>
+                <w:sz w:val="19"/>
+              </w:rPr>
+              <w:t>-- save each answer after grading</w:t>
+            </w:r>
+            <w:r>
+              <w:br/>
+            </w:r>
+            <w:r>
+              <w:rPr>
+                <w:rFonts w:ascii="Consolas" w:hAnsi="Consolas"/>
+                <w:sz w:val="19"/>
+              </w:rPr>
+              <w:t>INSERT INTO attempt_answers (attempt_id, question_id, selected_option, is_correct)</w:t>
+            </w:r>
+            <w:r>
+              <w:br/>
+            </w:r>
+            <w:r>
+              <w:rPr>
+                <w:rFonts w:ascii="Consolas" w:hAnsi="Consolas"/>
+                <w:sz w:val="19"/>
+              </w:rPr>
+              <w:t>VALUES (?, ?, ?, ?);</w:t>
+            </w:r>
+            <w:r>
+              <w:br/>
+            </w:r>
+            <w:r>
+              <w:rPr>
+                <w:rFonts w:ascii="Consolas" w:hAnsi="Consolas"/>
+                <w:sz w:val="19"/>
+              </w:rPr>
+            </w:r>
+            <w:r>
+              <w:br/>
+            </w:r>
+            <w:r>
+              <w:rPr>
+                <w:rFonts w:ascii="Consolas" w:hAnsi="Consolas"/>
+                <w:sz w:val="19"/>
+              </w:rPr>
+              <w:t>-- update the attempt after submission</w:t>
+            </w:r>
+            <w:r>
+              <w:br/>
+            </w:r>
+            <w:r>
+              <w:rPr>
+                <w:rFonts w:ascii="Consolas" w:hAnsi="Consolas"/>
+                <w:sz w:val="19"/>
+              </w:rPr>
+              <w:t>UPDATE test_attempts</w:t>
+            </w:r>
+            <w:r>
+              <w:br/>
+            </w:r>
+            <w:r>
+              <w:rPr>
+                <w:rFonts w:ascii="Consolas" w:hAnsi="Consolas"/>
+                <w:sz w:val="19"/>
+              </w:rPr>
+              <w:t>SET status = 'SUBMITTED', submitted_at = GETDATE(), score = ?</w:t>
+            </w:r>
+            <w:r>
+              <w:br/>
+            </w:r>
+            <w:r>
+              <w:rPr>
+                <w:rFonts w:ascii="Consolas" w:hAnsi="Consolas"/>
+                <w:sz w:val="19"/>
+              </w:rPr>
+              <w:t>WHERE id = ?;</w:t>
+            </w:r>
+          </w:p>
+        </w:tc>
+      </w:tr>
+    </w:tbl>
     <w:p>
       <w:pPr>
         <w:pStyle w:val="Heading3"/>
@@ -11337,7 +11402,7 @@
         <w:drawing>
           <wp:inline xmlns:a="http://schemas.openxmlformats.org/drawingml/2006/main" xmlns:pic="http://schemas.openxmlformats.org/drawingml/2006/picture">
             <wp:extent cx="5852160" cy="2289658"/>
-            <wp:docPr id="12" name="Picture 12"/>
+            <wp:docPr id="11" name="Picture 11"/>
             <wp:cNvGraphicFramePr>
               <a:graphicFrameLocks noChangeAspect="1"/>
             </wp:cNvGraphicFramePr>
@@ -11349,7 +11414,7 @@
                     <pic:cNvPicPr/>
                   </pic:nvPicPr>
                   <pic:blipFill>
-                    <a:blip r:embed="rId40"/>
+                    <a:blip r:embed="rId28"/>
                     <a:stretch>
                       <a:fillRect/>
                     </a:stretch>
@@ -11550,7 +11615,7 @@
         <w:drawing>
           <wp:inline xmlns:a="http://schemas.openxmlformats.org/drawingml/2006/main" xmlns:pic="http://schemas.openxmlformats.org/drawingml/2006/picture">
             <wp:extent cx="5852160" cy="2304288"/>
-            <wp:docPr id="13" name="Picture 13"/>
+            <wp:docPr id="12" name="Picture 12"/>
             <wp:cNvGraphicFramePr>
               <a:graphicFrameLocks noChangeAspect="1"/>
             </wp:cNvGraphicFramePr>
@@ -11562,7 +11627,7 @@
                     <pic:cNvPicPr/>
                   </pic:nvPicPr>
                   <pic:blipFill>
-                    <a:blip r:embed="rId41"/>
+                    <a:blip r:embed="rId29"/>
                     <a:stretch>
                       <a:fillRect/>
                     </a:stretch>
@@ -11591,133 +11656,164 @@
         <w:t>Database Queries</w:t>
       </w:r>
     </w:p>
-    <w:p>
-      <w:r>
-        <w:rPr>
-          <w:rFonts w:ascii="Consolas" w:hAnsi="Consolas"/>
-          <w:sz w:val="19"/>
-        </w:rPr>
-        <w:t>-- ownCardOrThrow(): verify card ownership before grading</w:t>
-      </w:r>
-      <w:r>
-        <w:br/>
-      </w:r>
-      <w:r>
-        <w:rPr>
-          <w:rFonts w:ascii="Consolas" w:hAnsi="Consolas"/>
-          <w:sz w:val="19"/>
-        </w:rPr>
-        <w:t>SELECT * FROM flashcards</w:t>
-      </w:r>
-      <w:r>
-        <w:br/>
-      </w:r>
-      <w:r>
-        <w:rPr>
-          <w:rFonts w:ascii="Consolas" w:hAnsi="Consolas"/>
-          <w:sz w:val="19"/>
-        </w:rPr>
-        <w:t>WHERE flashcard_id = ? AND student_id = ? AND is_deleted = 0;</w:t>
-      </w:r>
-      <w:r>
-        <w:br/>
-      </w:r>
-      <w:r>
-        <w:rPr>
-          <w:rFonts w:ascii="Consolas" w:hAnsi="Consolas"/>
-          <w:sz w:val="19"/>
-        </w:rPr>
-      </w:r>
-      <w:r>
-        <w:br/>
-      </w:r>
-      <w:r>
-        <w:rPr>
-          <w:rFonts w:ascii="Consolas" w:hAnsi="Consolas"/>
-          <w:sz w:val="19"/>
-        </w:rPr>
-        <w:t>-- applySm2() -&gt; save(): update the review schedule after grading</w:t>
-      </w:r>
-      <w:r>
-        <w:br/>
-      </w:r>
-      <w:r>
-        <w:rPr>
-          <w:rFonts w:ascii="Consolas" w:hAnsi="Consolas"/>
-          <w:sz w:val="19"/>
-        </w:rPr>
-        <w:t>UPDATE flashcards</w:t>
-      </w:r>
-      <w:r>
-        <w:br/>
-      </w:r>
-      <w:r>
-        <w:rPr>
-          <w:rFonts w:ascii="Consolas" w:hAnsi="Consolas"/>
-          <w:sz w:val="19"/>
-        </w:rPr>
-        <w:t>SET ease_factor = ?, interval_days = ?, repetition_count = ?,</w:t>
-      </w:r>
-      <w:r>
-        <w:br/>
-      </w:r>
-      <w:r>
-        <w:rPr>
-          <w:rFonts w:ascii="Consolas" w:hAnsi="Consolas"/>
-          <w:sz w:val="19"/>
-        </w:rPr>
-        <w:t xml:space="preserve">    next_review_date = ?, last_reviewed_at = GETDATE(), last_rating = ?</w:t>
-      </w:r>
-      <w:r>
-        <w:br/>
-      </w:r>
-      <w:r>
-        <w:rPr>
-          <w:rFonts w:ascii="Consolas" w:hAnsi="Consolas"/>
-          <w:sz w:val="19"/>
-        </w:rPr>
-        <w:t>WHERE flashcard_id = ?;</w:t>
-      </w:r>
-      <w:r>
-        <w:br/>
-      </w:r>
-      <w:r>
-        <w:rPr>
-          <w:rFonts w:ascii="Consolas" w:hAnsi="Consolas"/>
-          <w:sz w:val="19"/>
-        </w:rPr>
-      </w:r>
-      <w:r>
-        <w:br/>
-      </w:r>
-      <w:r>
-        <w:rPr>
-          <w:rFonts w:ascii="Consolas" w:hAnsi="Consolas"/>
-          <w:sz w:val="19"/>
-        </w:rPr>
-        <w:t>-- end of session: collect words answered wrong in THIS session</w:t>
-      </w:r>
-      <w:r>
-        <w:br/>
-      </w:r>
-      <w:r>
-        <w:rPr>
-          <w:rFonts w:ascii="Consolas" w:hAnsi="Consolas"/>
-          <w:sz w:val="19"/>
-        </w:rPr>
-        <w:t>SELECT * FROM flashcards</w:t>
-      </w:r>
-      <w:r>
-        <w:br/>
-      </w:r>
-      <w:r>
-        <w:rPr>
-          <w:rFonts w:ascii="Consolas" w:hAnsi="Consolas"/>
-          <w:sz w:val="19"/>
-        </w:rPr>
-        <w:t>WHERE student_id = ? AND last_session_id = ? AND content_type = 'VOCABULARY' AND last_rating = 'WRONG';</w:t>
-      </w:r>
-    </w:p>
+    <w:tbl>
+      <w:tblPr>
+        <w:tblW w:type="auto" w:w="0"/>
+        <w:tblLayout w:type="autofit"/>
+        <w:tblLook w:firstColumn="1" w:firstRow="1" w:lastColumn="0" w:lastRow="0" w:noHBand="0" w:noVBand="1" w:val="04A0"/>
+      </w:tblPr>
+      <w:tblGrid>
+        <w:gridCol w:w="9648"/>
+      </w:tblGrid>
+      <w:tr>
+        <w:tc>
+          <w:tcPr>
+            <w:tcW w:type="dxa" w:w="9648"/>
+            <w:shd w:val="clear" w:color="auto" w:fill="F2F6FC"/>
+            <w:tcBorders>
+              <w:top w:val="single" w:sz="12" w:space="0" w:color="8EAADB"/>
+              <w:left w:val="single" w:sz="12" w:space="0" w:color="8EAADB"/>
+              <w:bottom w:val="single" w:sz="12" w:space="0" w:color="8EAADB"/>
+              <w:right w:val="single" w:sz="12" w:space="0" w:color="8EAADB"/>
+            </w:tcBorders>
+            <w:tcMar>
+              <w:top w:w="120" w:type="dxa"/>
+              <w:bottom w:w="120" w:type="dxa"/>
+              <w:left w:w="160" w:type="dxa"/>
+              <w:right w:w="160" w:type="dxa"/>
+            </w:tcMar>
+          </w:tcPr>
+          <w:p>
+            <w:r/>
+            <w:r>
+              <w:rPr>
+                <w:rFonts w:ascii="Consolas" w:hAnsi="Consolas"/>
+                <w:sz w:val="19"/>
+              </w:rPr>
+              <w:t>-- ownCardOrThrow(): verify card ownership before grading</w:t>
+            </w:r>
+            <w:r>
+              <w:br/>
+            </w:r>
+            <w:r>
+              <w:rPr>
+                <w:rFonts w:ascii="Consolas" w:hAnsi="Consolas"/>
+                <w:sz w:val="19"/>
+              </w:rPr>
+              <w:t>SELECT * FROM flashcards</w:t>
+            </w:r>
+            <w:r>
+              <w:br/>
+            </w:r>
+            <w:r>
+              <w:rPr>
+                <w:rFonts w:ascii="Consolas" w:hAnsi="Consolas"/>
+                <w:sz w:val="19"/>
+              </w:rPr>
+              <w:t>WHERE flashcard_id = ? AND student_id = ? AND is_deleted = 0;</w:t>
+            </w:r>
+            <w:r>
+              <w:br/>
+            </w:r>
+            <w:r>
+              <w:rPr>
+                <w:rFonts w:ascii="Consolas" w:hAnsi="Consolas"/>
+                <w:sz w:val="19"/>
+              </w:rPr>
+            </w:r>
+            <w:r>
+              <w:br/>
+            </w:r>
+            <w:r>
+              <w:rPr>
+                <w:rFonts w:ascii="Consolas" w:hAnsi="Consolas"/>
+                <w:sz w:val="19"/>
+              </w:rPr>
+              <w:t>-- applySm2() -&gt; save(): update the review schedule after grading</w:t>
+            </w:r>
+            <w:r>
+              <w:br/>
+            </w:r>
+            <w:r>
+              <w:rPr>
+                <w:rFonts w:ascii="Consolas" w:hAnsi="Consolas"/>
+                <w:sz w:val="19"/>
+              </w:rPr>
+              <w:t>UPDATE flashcards</w:t>
+            </w:r>
+            <w:r>
+              <w:br/>
+            </w:r>
+            <w:r>
+              <w:rPr>
+                <w:rFonts w:ascii="Consolas" w:hAnsi="Consolas"/>
+                <w:sz w:val="19"/>
+              </w:rPr>
+              <w:t>SET ease_factor = ?, interval_days = ?, repetition_count = ?,</w:t>
+            </w:r>
+            <w:r>
+              <w:br/>
+            </w:r>
+            <w:r>
+              <w:rPr>
+                <w:rFonts w:ascii="Consolas" w:hAnsi="Consolas"/>
+                <w:sz w:val="19"/>
+              </w:rPr>
+              <w:t xml:space="preserve">    next_review_date = ?, last_reviewed_at = GETDATE(), last_rating = ?</w:t>
+            </w:r>
+            <w:r>
+              <w:br/>
+            </w:r>
+            <w:r>
+              <w:rPr>
+                <w:rFonts w:ascii="Consolas" w:hAnsi="Consolas"/>
+                <w:sz w:val="19"/>
+              </w:rPr>
+              <w:t>WHERE flashcard_id = ?;</w:t>
+            </w:r>
+            <w:r>
+              <w:br/>
+            </w:r>
+            <w:r>
+              <w:rPr>
+                <w:rFonts w:ascii="Consolas" w:hAnsi="Consolas"/>
+                <w:sz w:val="19"/>
+              </w:rPr>
+            </w:r>
+            <w:r>
+              <w:br/>
+            </w:r>
+            <w:r>
+              <w:rPr>
+                <w:rFonts w:ascii="Consolas" w:hAnsi="Consolas"/>
+                <w:sz w:val="19"/>
+              </w:rPr>
+              <w:t>-- end of session: collect words answered wrong in THIS session</w:t>
+            </w:r>
+            <w:r>
+              <w:br/>
+            </w:r>
+            <w:r>
+              <w:rPr>
+                <w:rFonts w:ascii="Consolas" w:hAnsi="Consolas"/>
+                <w:sz w:val="19"/>
+              </w:rPr>
+              <w:t>SELECT * FROM flashcards</w:t>
+            </w:r>
+            <w:r>
+              <w:br/>
+            </w:r>
+            <w:r>
+              <w:rPr>
+                <w:rFonts w:ascii="Consolas" w:hAnsi="Consolas"/>
+                <w:sz w:val="19"/>
+              </w:rPr>
+              <w:t>WHERE student_id = ? AND last_session_id = ? AND content_type = 'VOCABULARY' AND last_rating = 'WRONG';</w:t>
+            </w:r>
+          </w:p>
+        </w:tc>
+      </w:tr>
+    </w:tbl>
     <w:p>
       <w:pPr>
         <w:pStyle w:val="Heading3"/>
@@ -11739,7 +11835,7 @@
         <w:drawing>
           <wp:inline xmlns:a="http://schemas.openxmlformats.org/drawingml/2006/main" xmlns:pic="http://schemas.openxmlformats.org/drawingml/2006/picture">
             <wp:extent cx="5852160" cy="2655418"/>
-            <wp:docPr id="14" name="Picture 14"/>
+            <wp:docPr id="13" name="Picture 13"/>
             <wp:cNvGraphicFramePr>
               <a:graphicFrameLocks noChangeAspect="1"/>
             </wp:cNvGraphicFramePr>
@@ -11751,7 +11847,7 @@
                     <pic:cNvPicPr/>
                   </pic:nvPicPr>
                   <pic:blipFill>
-                    <a:blip r:embed="rId42"/>
+                    <a:blip r:embed="rId30"/>
                     <a:stretch>
                       <a:fillRect/>
                     </a:stretch>
@@ -11952,7 +12048,7 @@
         <w:drawing>
           <wp:inline xmlns:a="http://schemas.openxmlformats.org/drawingml/2006/main" xmlns:pic="http://schemas.openxmlformats.org/drawingml/2006/picture">
             <wp:extent cx="5852160" cy="2830982"/>
-            <wp:docPr id="15" name="Picture 15"/>
+            <wp:docPr id="14" name="Picture 14"/>
             <wp:cNvGraphicFramePr>
               <a:graphicFrameLocks noChangeAspect="1"/>
             </wp:cNvGraphicFramePr>
@@ -11964,7 +12060,7 @@
                     <pic:cNvPicPr/>
                   </pic:nvPicPr>
                   <pic:blipFill>
-                    <a:blip r:embed="rId43"/>
+                    <a:blip r:embed="rId31"/>
                     <a:stretch>
                       <a:fillRect/>
                     </a:stretch>
@@ -11993,64 +12089,95 @@
         <w:t>Database Queries</w:t>
       </w:r>
     </w:p>
-    <w:p>
-      <w:r>
-        <w:rPr>
-          <w:rFonts w:ascii="Consolas" w:hAnsi="Consolas"/>
-          <w:sz w:val="19"/>
-        </w:rPr>
-        <w:t>-- saveAttempt(): persist one completed writing attempt</w:t>
-      </w:r>
-      <w:r>
-        <w:br/>
-      </w:r>
-      <w:r>
-        <w:rPr>
-          <w:rFonts w:ascii="Consolas" w:hAnsi="Consolas"/>
-          <w:sz w:val="19"/>
-        </w:rPr>
-        <w:t>INSERT INTO kanji_writing_attempts</w:t>
-      </w:r>
-      <w:r>
-        <w:br/>
-      </w:r>
-      <w:r>
-        <w:rPr>
-          <w:rFonts w:ascii="Consolas" w:hAnsi="Consolas"/>
-          <w:sz w:val="19"/>
-        </w:rPr>
-        <w:t xml:space="preserve">    (student_id, kanji_id, character_value, total_strokes, avg_dtw_score, final_quality, stroke_details, created_by)</w:t>
-      </w:r>
-      <w:r>
-        <w:br/>
-      </w:r>
-      <w:r>
-        <w:rPr>
-          <w:rFonts w:ascii="Consolas" w:hAnsi="Consolas"/>
-          <w:sz w:val="19"/>
-        </w:rPr>
-        <w:t>VALUES (?, ?, ?, ?, ?, ?, ?, ?);</w:t>
-      </w:r>
-      <w:r>
-        <w:br/>
-      </w:r>
-      <w:r>
-        <w:rPr>
-          <w:rFonts w:ascii="Consolas" w:hAnsi="Consolas"/>
-          <w:sz w:val="19"/>
-        </w:rPr>
-      </w:r>
-      <w:r>
-        <w:br/>
-      </w:r>
-      <w:r>
-        <w:rPr>
-          <w:rFonts w:ascii="Consolas" w:hAnsi="Consolas"/>
-          <w:sz w:val="19"/>
-        </w:rPr>
-        <w:t>-- evaluateStroke() never queries the DB — all DTW computation happens in memory per request.</w:t>
-      </w:r>
-    </w:p>
+    <w:tbl>
+      <w:tblPr>
+        <w:tblW w:type="auto" w:w="0"/>
+        <w:tblLayout w:type="autofit"/>
+        <w:tblLook w:firstColumn="1" w:firstRow="1" w:lastColumn="0" w:lastRow="0" w:noHBand="0" w:noVBand="1" w:val="04A0"/>
+      </w:tblPr>
+      <w:tblGrid>
+        <w:gridCol w:w="9648"/>
+      </w:tblGrid>
+      <w:tr>
+        <w:tc>
+          <w:tcPr>
+            <w:tcW w:type="dxa" w:w="9648"/>
+            <w:shd w:val="clear" w:color="auto" w:fill="F2F6FC"/>
+            <w:tcBorders>
+              <w:top w:val="single" w:sz="12" w:space="0" w:color="8EAADB"/>
+              <w:left w:val="single" w:sz="12" w:space="0" w:color="8EAADB"/>
+              <w:bottom w:val="single" w:sz="12" w:space="0" w:color="8EAADB"/>
+              <w:right w:val="single" w:sz="12" w:space="0" w:color="8EAADB"/>
+            </w:tcBorders>
+            <w:tcMar>
+              <w:top w:w="120" w:type="dxa"/>
+              <w:bottom w:w="120" w:type="dxa"/>
+              <w:left w:w="160" w:type="dxa"/>
+              <w:right w:w="160" w:type="dxa"/>
+            </w:tcMar>
+          </w:tcPr>
+          <w:p>
+            <w:r/>
+            <w:r>
+              <w:rPr>
+                <w:rFonts w:ascii="Consolas" w:hAnsi="Consolas"/>
+                <w:sz w:val="19"/>
+              </w:rPr>
+              <w:t>-- saveAttempt(): persist one completed writing attempt</w:t>
+            </w:r>
+            <w:r>
+              <w:br/>
+            </w:r>
+            <w:r>
+              <w:rPr>
+                <w:rFonts w:ascii="Consolas" w:hAnsi="Consolas"/>
+                <w:sz w:val="19"/>
+              </w:rPr>
+              <w:t>INSERT INTO kanji_writing_attempts</w:t>
+            </w:r>
+            <w:r>
+              <w:br/>
+            </w:r>
+            <w:r>
+              <w:rPr>
+                <w:rFonts w:ascii="Consolas" w:hAnsi="Consolas"/>
+                <w:sz w:val="19"/>
+              </w:rPr>
+              <w:t xml:space="preserve">    (student_id, kanji_id, character_value, total_strokes, avg_dtw_score, final_quality, stroke_details, created_by)</w:t>
+            </w:r>
+            <w:r>
+              <w:br/>
+            </w:r>
+            <w:r>
+              <w:rPr>
+                <w:rFonts w:ascii="Consolas" w:hAnsi="Consolas"/>
+                <w:sz w:val="19"/>
+              </w:rPr>
+              <w:t>VALUES (?, ?, ?, ?, ?, ?, ?, ?);</w:t>
+            </w:r>
+            <w:r>
+              <w:br/>
+            </w:r>
+            <w:r>
+              <w:rPr>
+                <w:rFonts w:ascii="Consolas" w:hAnsi="Consolas"/>
+                <w:sz w:val="19"/>
+              </w:rPr>
+            </w:r>
+            <w:r>
+              <w:br/>
+            </w:r>
+            <w:r>
+              <w:rPr>
+                <w:rFonts w:ascii="Consolas" w:hAnsi="Consolas"/>
+                <w:sz w:val="19"/>
+              </w:rPr>
+              <w:t>-- evaluateStroke() never queries the DB — all DTW computation happens in memory per request.</w:t>
+            </w:r>
+          </w:p>
+        </w:tc>
+      </w:tr>
+    </w:tbl>
     <w:p>
       <w:pPr>
         <w:pStyle w:val="Heading3"/>
@@ -12072,7 +12199,7 @@
         <w:drawing>
           <wp:inline xmlns:a="http://schemas.openxmlformats.org/drawingml/2006/main" xmlns:pic="http://schemas.openxmlformats.org/drawingml/2006/picture">
             <wp:extent cx="5852160" cy="3247949"/>
-            <wp:docPr id="16" name="Picture 16"/>
+            <wp:docPr id="15" name="Picture 15"/>
             <wp:cNvGraphicFramePr>
               <a:graphicFrameLocks noChangeAspect="1"/>
             </wp:cNvGraphicFramePr>
@@ -12084,7 +12211,7 @@
                     <pic:cNvPicPr/>
                   </pic:nvPicPr>
                   <pic:blipFill>
-                    <a:blip r:embed="rId44"/>
+                    <a:blip r:embed="rId32"/>
                     <a:stretch>
                       <a:fillRect/>
                     </a:stretch>
@@ -12444,7 +12571,7 @@
         <w:drawing>
           <wp:inline xmlns:a="http://schemas.openxmlformats.org/drawingml/2006/main" xmlns:pic="http://schemas.openxmlformats.org/drawingml/2006/picture">
             <wp:extent cx="5852160" cy="2435962"/>
-            <wp:docPr id="17" name="Picture 17"/>
+            <wp:docPr id="16" name="Picture 16"/>
             <wp:cNvGraphicFramePr>
               <a:graphicFrameLocks noChangeAspect="1"/>
             </wp:cNvGraphicFramePr>
@@ -12456,7 +12583,7 @@
                     <pic:cNvPicPr/>
                   </pic:nvPicPr>
                   <pic:blipFill>
-                    <a:blip r:embed="rId45"/>
+                    <a:blip r:embed="rId33"/>
                     <a:stretch>
                       <a:fillRect/>
                     </a:stretch>
@@ -12485,172 +12612,203 @@
         <w:t>Database Queries</w:t>
       </w:r>
     </w:p>
-    <w:p>
-      <w:r>
-        <w:rPr>
-          <w:rFonts w:ascii="Consolas" w:hAnsi="Consolas"/>
-          <w:sz w:val="19"/>
-        </w:rPr>
-        <w:t>-- SpeakingService.submit(): create a new submission, awaiting teacher grading (no AI step anymore)</w:t>
-      </w:r>
-      <w:r>
-        <w:br/>
-      </w:r>
-      <w:r>
-        <w:rPr>
-          <w:rFonts w:ascii="Consolas" w:hAnsi="Consolas"/>
-          <w:sz w:val="19"/>
-        </w:rPr>
-        <w:t>INSERT INTO student_submissions (student_id, submission_type, status, exercise_id, recording_url, created_at)</w:t>
-      </w:r>
-      <w:r>
-        <w:br/>
-      </w:r>
-      <w:r>
-        <w:rPr>
-          <w:rFonts w:ascii="Consolas" w:hAnsi="Consolas"/>
-          <w:sz w:val="19"/>
-        </w:rPr>
-        <w:t>VALUES (?, 'SPEAKING', 'PENDING', ?, ?, GETDATE());</w:t>
-      </w:r>
-      <w:r>
-        <w:br/>
-      </w:r>
-      <w:r>
-        <w:rPr>
-          <w:rFonts w:ascii="Consolas" w:hAnsi="Consolas"/>
-          <w:sz w:val="19"/>
-        </w:rPr>
-      </w:r>
-      <w:r>
-        <w:br/>
-      </w:r>
-      <w:r>
-        <w:rPr>
-          <w:rFonts w:ascii="Consolas" w:hAnsi="Consolas"/>
-          <w:sz w:val="19"/>
-        </w:rPr>
-        <w:t>-- SupportTicketService.getAllSubmissions(): the speaking grading queue</w:t>
-      </w:r>
-      <w:r>
-        <w:br/>
-      </w:r>
-      <w:r>
-        <w:rPr>
-          <w:rFonts w:ascii="Consolas" w:hAnsi="Consolas"/>
-          <w:sz w:val="19"/>
-        </w:rPr>
-        <w:t>SELECT * FROM student_submissions</w:t>
-      </w:r>
-      <w:r>
-        <w:br/>
-      </w:r>
-      <w:r>
-        <w:rPr>
-          <w:rFonts w:ascii="Consolas" w:hAnsi="Consolas"/>
-          <w:sz w:val="19"/>
-        </w:rPr>
-        <w:t>WHERE submission_type = 'SPEAKING' AND (status = ? OR ? IS NULL)</w:t>
-      </w:r>
-      <w:r>
-        <w:br/>
-      </w:r>
-      <w:r>
-        <w:rPr>
-          <w:rFonts w:ascii="Consolas" w:hAnsi="Consolas"/>
-          <w:sz w:val="19"/>
-        </w:rPr>
-        <w:t>ORDER BY submitted_at ASC;</w:t>
-      </w:r>
-      <w:r>
-        <w:br/>
-      </w:r>
-      <w:r>
-        <w:rPr>
-          <w:rFonts w:ascii="Consolas" w:hAnsi="Consolas"/>
-          <w:sz w:val="19"/>
-        </w:rPr>
-      </w:r>
-      <w:r>
-        <w:br/>
-      </w:r>
-      <w:r>
-        <w:rPr>
-          <w:rFonts w:ascii="Consolas" w:hAnsi="Consolas"/>
-          <w:sz w:val="19"/>
-        </w:rPr>
-        <w:t>-- manualGrade(): record the teacher's score, change status (no longer checks status=AI_GRADED)</w:t>
-      </w:r>
-      <w:r>
-        <w:br/>
-      </w:r>
-      <w:r>
-        <w:rPr>
-          <w:rFonts w:ascii="Consolas" w:hAnsi="Consolas"/>
-          <w:sz w:val="19"/>
-        </w:rPr>
-        <w:t>UPDATE student_submissions</w:t>
-      </w:r>
-      <w:r>
-        <w:br/>
-      </w:r>
-      <w:r>
-        <w:rPr>
-          <w:rFonts w:ascii="Consolas" w:hAnsi="Consolas"/>
-          <w:sz w:val="19"/>
-        </w:rPr>
-        <w:t>SET manual_score = ?, manual_feedback = ?, graded_by = ?, graded_at = GETDATE(), status = 'GRADED'</w:t>
-      </w:r>
-      <w:r>
-        <w:br/>
-      </w:r>
-      <w:r>
-        <w:rPr>
-          <w:rFonts w:ascii="Consolas" w:hAnsi="Consolas"/>
-          <w:sz w:val="19"/>
-        </w:rPr>
-        <w:t>WHERE submission_id = ? AND status != 'REJECTED';</w:t>
-      </w:r>
-      <w:r>
-        <w:br/>
-      </w:r>
-      <w:r>
-        <w:rPr>
-          <w:rFonts w:ascii="Consolas" w:hAnsi="Consolas"/>
-          <w:sz w:val="19"/>
-        </w:rPr>
-      </w:r>
-      <w:r>
-        <w:br/>
-      </w:r>
-      <w:r>
-        <w:rPr>
-          <w:rFonts w:ascii="Consolas" w:hAnsi="Consolas"/>
-          <w:sz w:val="19"/>
-        </w:rPr>
-        <w:t>-- notify the Student once grading is done</w:t>
-      </w:r>
-      <w:r>
-        <w:br/>
-      </w:r>
-      <w:r>
-        <w:rPr>
-          <w:rFonts w:ascii="Consolas" w:hAnsi="Consolas"/>
-          <w:sz w:val="19"/>
-        </w:rPr>
-        <w:t>INSERT INTO notifications (student_id, title, message, notification_type, reference_key, created_by)</w:t>
-      </w:r>
-      <w:r>
-        <w:br/>
-      </w:r>
-      <w:r>
-        <w:rPr>
-          <w:rFonts w:ascii="Consolas" w:hAnsi="Consolas"/>
-          <w:sz w:val="19"/>
-        </w:rPr>
-        <w:t>VALUES (?, 'Your speaking submission has been graded', ?, 'ACHIEVEMENT', ?, ?);</w:t>
-      </w:r>
-    </w:p>
+    <w:tbl>
+      <w:tblPr>
+        <w:tblW w:type="auto" w:w="0"/>
+        <w:tblLayout w:type="autofit"/>
+        <w:tblLook w:firstColumn="1" w:firstRow="1" w:lastColumn="0" w:lastRow="0" w:noHBand="0" w:noVBand="1" w:val="04A0"/>
+      </w:tblPr>
+      <w:tblGrid>
+        <w:gridCol w:w="9648"/>
+      </w:tblGrid>
+      <w:tr>
+        <w:tc>
+          <w:tcPr>
+            <w:tcW w:type="dxa" w:w="9648"/>
+            <w:shd w:val="clear" w:color="auto" w:fill="F2F6FC"/>
+            <w:tcBorders>
+              <w:top w:val="single" w:sz="12" w:space="0" w:color="8EAADB"/>
+              <w:left w:val="single" w:sz="12" w:space="0" w:color="8EAADB"/>
+              <w:bottom w:val="single" w:sz="12" w:space="0" w:color="8EAADB"/>
+              <w:right w:val="single" w:sz="12" w:space="0" w:color="8EAADB"/>
+            </w:tcBorders>
+            <w:tcMar>
+              <w:top w:w="120" w:type="dxa"/>
+              <w:bottom w:w="120" w:type="dxa"/>
+              <w:left w:w="160" w:type="dxa"/>
+              <w:right w:w="160" w:type="dxa"/>
+            </w:tcMar>
+          </w:tcPr>
+          <w:p>
+            <w:r/>
+            <w:r>
+              <w:rPr>
+                <w:rFonts w:ascii="Consolas" w:hAnsi="Consolas"/>
+                <w:sz w:val="19"/>
+              </w:rPr>
+              <w:t>-- SpeakingService.submit(): create a new submission, awaiting teacher grading (no AI step anymore)</w:t>
+            </w:r>
+            <w:r>
+              <w:br/>
+            </w:r>
+            <w:r>
+              <w:rPr>
+                <w:rFonts w:ascii="Consolas" w:hAnsi="Consolas"/>
+                <w:sz w:val="19"/>
+              </w:rPr>
+              <w:t>INSERT INTO student_submissions (student_id, submission_type, status, exercise_id, recording_url, created_at)</w:t>
+            </w:r>
+            <w:r>
+              <w:br/>
+            </w:r>
+            <w:r>
+              <w:rPr>
+                <w:rFonts w:ascii="Consolas" w:hAnsi="Consolas"/>
+                <w:sz w:val="19"/>
+              </w:rPr>
+              <w:t>VALUES (?, 'SPEAKING', 'PENDING', ?, ?, GETDATE());</w:t>
+            </w:r>
+            <w:r>
+              <w:br/>
+            </w:r>
+            <w:r>
+              <w:rPr>
+                <w:rFonts w:ascii="Consolas" w:hAnsi="Consolas"/>
+                <w:sz w:val="19"/>
+              </w:rPr>
+            </w:r>
+            <w:r>
+              <w:br/>
+            </w:r>
+            <w:r>
+              <w:rPr>
+                <w:rFonts w:ascii="Consolas" w:hAnsi="Consolas"/>
+                <w:sz w:val="19"/>
+              </w:rPr>
+              <w:t>-- SupportTicketService.getAllSubmissions(): the speaking grading queue</w:t>
+            </w:r>
+            <w:r>
+              <w:br/>
+            </w:r>
+            <w:r>
+              <w:rPr>
+                <w:rFonts w:ascii="Consolas" w:hAnsi="Consolas"/>
+                <w:sz w:val="19"/>
+              </w:rPr>
+              <w:t>SELECT * FROM student_submissions</w:t>
+            </w:r>
+            <w:r>
+              <w:br/>
+            </w:r>
+            <w:r>
+              <w:rPr>
+                <w:rFonts w:ascii="Consolas" w:hAnsi="Consolas"/>
+                <w:sz w:val="19"/>
+              </w:rPr>
+              <w:t>WHERE submission_type = 'SPEAKING' AND (status = ? OR ? IS NULL)</w:t>
+            </w:r>
+            <w:r>
+              <w:br/>
+            </w:r>
+            <w:r>
+              <w:rPr>
+                <w:rFonts w:ascii="Consolas" w:hAnsi="Consolas"/>
+                <w:sz w:val="19"/>
+              </w:rPr>
+              <w:t>ORDER BY submitted_at ASC;</w:t>
+            </w:r>
+            <w:r>
+              <w:br/>
+            </w:r>
+            <w:r>
+              <w:rPr>
+                <w:rFonts w:ascii="Consolas" w:hAnsi="Consolas"/>
+                <w:sz w:val="19"/>
+              </w:rPr>
+            </w:r>
+            <w:r>
+              <w:br/>
+            </w:r>
+            <w:r>
+              <w:rPr>
+                <w:rFonts w:ascii="Consolas" w:hAnsi="Consolas"/>
+                <w:sz w:val="19"/>
+              </w:rPr>
+              <w:t>-- manualGrade(): record the teacher's score, change status (no longer checks status=AI_GRADED)</w:t>
+            </w:r>
+            <w:r>
+              <w:br/>
+            </w:r>
+            <w:r>
+              <w:rPr>
+                <w:rFonts w:ascii="Consolas" w:hAnsi="Consolas"/>
+                <w:sz w:val="19"/>
+              </w:rPr>
+              <w:t>UPDATE student_submissions</w:t>
+            </w:r>
+            <w:r>
+              <w:br/>
+            </w:r>
+            <w:r>
+              <w:rPr>
+                <w:rFonts w:ascii="Consolas" w:hAnsi="Consolas"/>
+                <w:sz w:val="19"/>
+              </w:rPr>
+              <w:t>SET manual_score = ?, manual_feedback = ?, graded_by = ?, graded_at = GETDATE(), status = 'GRADED'</w:t>
+            </w:r>
+            <w:r>
+              <w:br/>
+            </w:r>
+            <w:r>
+              <w:rPr>
+                <w:rFonts w:ascii="Consolas" w:hAnsi="Consolas"/>
+                <w:sz w:val="19"/>
+              </w:rPr>
+              <w:t>WHERE submission_id = ? AND status != 'REJECTED';</w:t>
+            </w:r>
+            <w:r>
+              <w:br/>
+            </w:r>
+            <w:r>
+              <w:rPr>
+                <w:rFonts w:ascii="Consolas" w:hAnsi="Consolas"/>
+                <w:sz w:val="19"/>
+              </w:rPr>
+            </w:r>
+            <w:r>
+              <w:br/>
+            </w:r>
+            <w:r>
+              <w:rPr>
+                <w:rFonts w:ascii="Consolas" w:hAnsi="Consolas"/>
+                <w:sz w:val="19"/>
+              </w:rPr>
+              <w:t>-- notify the Student once grading is done</w:t>
+            </w:r>
+            <w:r>
+              <w:br/>
+            </w:r>
+            <w:r>
+              <w:rPr>
+                <w:rFonts w:ascii="Consolas" w:hAnsi="Consolas"/>
+                <w:sz w:val="19"/>
+              </w:rPr>
+              <w:t>INSERT INTO notifications (student_id, title, message, notification_type, reference_key, created_by)</w:t>
+            </w:r>
+            <w:r>
+              <w:br/>
+            </w:r>
+            <w:r>
+              <w:rPr>
+                <w:rFonts w:ascii="Consolas" w:hAnsi="Consolas"/>
+                <w:sz w:val="19"/>
+              </w:rPr>
+              <w:t>VALUES (?, 'Your speaking submission has been graded', ?, 'ACHIEVEMENT', ?, ?);</w:t>
+            </w:r>
+          </w:p>
+        </w:tc>
+      </w:tr>
+    </w:tbl>
     <w:p>
       <w:pPr>
         <w:pStyle w:val="Heading3"/>
@@ -12672,7 +12830,7 @@
         <w:drawing>
           <wp:inline xmlns:a="http://schemas.openxmlformats.org/drawingml/2006/main" xmlns:pic="http://schemas.openxmlformats.org/drawingml/2006/picture">
             <wp:extent cx="5852160" cy="2823667"/>
-            <wp:docPr id="18" name="Picture 18"/>
+            <wp:docPr id="17" name="Picture 17"/>
             <wp:cNvGraphicFramePr>
               <a:graphicFrameLocks noChangeAspect="1"/>
             </wp:cNvGraphicFramePr>
@@ -12684,7 +12842,7 @@
                     <pic:cNvPicPr/>
                   </pic:nvPicPr>
                   <pic:blipFill>
-                    <a:blip r:embed="rId46"/>
+                    <a:blip r:embed="rId34"/>
                     <a:stretch>
                       <a:fillRect/>
                     </a:stretch>
@@ -12917,7 +13075,7 @@
         <w:drawing>
           <wp:inline xmlns:a="http://schemas.openxmlformats.org/drawingml/2006/main" xmlns:pic="http://schemas.openxmlformats.org/drawingml/2006/picture">
             <wp:extent cx="5852160" cy="2874874"/>
-            <wp:docPr id="19" name="Picture 19"/>
+            <wp:docPr id="18" name="Picture 18"/>
             <wp:cNvGraphicFramePr>
               <a:graphicFrameLocks noChangeAspect="1"/>
             </wp:cNvGraphicFramePr>
@@ -12929,7 +13087,7 @@
                     <pic:cNvPicPr/>
                   </pic:nvPicPr>
                   <pic:blipFill>
-                    <a:blip r:embed="rId47"/>
+                    <a:blip r:embed="rId35"/>
                     <a:stretch>
                       <a:fillRect/>
                     </a:stretch>
@@ -12958,164 +13116,2495 @@
         <w:t>Database Queries</w:t>
       </w:r>
     </w:p>
+    <w:tbl>
+      <w:tblPr>
+        <w:tblW w:type="auto" w:w="0"/>
+        <w:tblLayout w:type="autofit"/>
+        <w:tblLook w:firstColumn="1" w:firstRow="1" w:lastColumn="0" w:lastRow="0" w:noHBand="0" w:noVBand="1" w:val="04A0"/>
+      </w:tblPr>
+      <w:tblGrid>
+        <w:gridCol w:w="9648"/>
+      </w:tblGrid>
+      <w:tr>
+        <w:tc>
+          <w:tcPr>
+            <w:tcW w:type="dxa" w:w="9648"/>
+            <w:shd w:val="clear" w:color="auto" w:fill="F2F6FC"/>
+            <w:tcBorders>
+              <w:top w:val="single" w:sz="12" w:space="0" w:color="8EAADB"/>
+              <w:left w:val="single" w:sz="12" w:space="0" w:color="8EAADB"/>
+              <w:bottom w:val="single" w:sz="12" w:space="0" w:color="8EAADB"/>
+              <w:right w:val="single" w:sz="12" w:space="0" w:color="8EAADB"/>
+            </w:tcBorders>
+            <w:tcMar>
+              <w:top w:w="120" w:type="dxa"/>
+              <w:bottom w:w="120" w:type="dxa"/>
+              <w:left w:w="160" w:type="dxa"/>
+              <w:right w:w="160" w:type="dxa"/>
+            </w:tcMar>
+          </w:tcPr>
+          <w:p>
+            <w:r/>
+            <w:r>
+              <w:rPr>
+                <w:rFonts w:ascii="Consolas" w:hAnsi="Consolas"/>
+                <w:sz w:val="19"/>
+              </w:rPr>
+              <w:t>-- findActiveById(): fetch content awaiting review (example: the GRAMMAR handler)</w:t>
+            </w:r>
+            <w:r>
+              <w:br/>
+            </w:r>
+            <w:r>
+              <w:rPr>
+                <w:rFonts w:ascii="Consolas" w:hAnsi="Consolas"/>
+                <w:sz w:val="19"/>
+              </w:rPr>
+              <w:t>SELECT * FROM grammar_points WHERE grammar_id = ? AND status = 'pending_review';</w:t>
+            </w:r>
+            <w:r>
+              <w:br/>
+            </w:r>
+            <w:r>
+              <w:rPr>
+                <w:rFonts w:ascii="Consolas" w:hAnsi="Consolas"/>
+                <w:sz w:val="19"/>
+              </w:rPr>
+            </w:r>
+            <w:r>
+              <w:br/>
+            </w:r>
+            <w:r>
+              <w:rPr>
+                <w:rFonts w:ascii="Consolas" w:hAnsi="Consolas"/>
+                <w:sz w:val="19"/>
+              </w:rPr>
+              <w:t>-- approve(): only updates if still pending_review (prevents double approval)</w:t>
+            </w:r>
+            <w:r>
+              <w:br/>
+            </w:r>
+            <w:r>
+              <w:rPr>
+                <w:rFonts w:ascii="Consolas" w:hAnsi="Consolas"/>
+                <w:sz w:val="19"/>
+              </w:rPr>
+              <w:t>UPDATE grammar_points</w:t>
+            </w:r>
+            <w:r>
+              <w:br/>
+            </w:r>
+            <w:r>
+              <w:rPr>
+                <w:rFonts w:ascii="Consolas" w:hAnsi="Consolas"/>
+                <w:sz w:val="19"/>
+              </w:rPr>
+              <w:t>SET status = 'published', approved_by = ?, published_at = GETDATE()</w:t>
+            </w:r>
+            <w:r>
+              <w:br/>
+            </w:r>
+            <w:r>
+              <w:rPr>
+                <w:rFonts w:ascii="Consolas" w:hAnsi="Consolas"/>
+                <w:sz w:val="19"/>
+              </w:rPr>
+              <w:t>WHERE grammar_id = ? AND status = 'pending_review';</w:t>
+            </w:r>
+            <w:r>
+              <w:br/>
+            </w:r>
+            <w:r>
+              <w:rPr>
+                <w:rFonts w:ascii="Consolas" w:hAnsi="Consolas"/>
+                <w:sz w:val="19"/>
+              </w:rPr>
+            </w:r>
+            <w:r>
+              <w:br/>
+            </w:r>
+            <w:r>
+              <w:rPr>
+                <w:rFonts w:ascii="Consolas" w:hAnsi="Consolas"/>
+                <w:sz w:val="19"/>
+              </w:rPr>
+              <w:t>-- reject() / requestChanges(): move back to draft or rejected</w:t>
+            </w:r>
+            <w:r>
+              <w:br/>
+            </w:r>
+            <w:r>
+              <w:rPr>
+                <w:rFonts w:ascii="Consolas" w:hAnsi="Consolas"/>
+                <w:sz w:val="19"/>
+              </w:rPr>
+              <w:t>UPDATE grammar_points</w:t>
+            </w:r>
+            <w:r>
+              <w:br/>
+            </w:r>
+            <w:r>
+              <w:rPr>
+                <w:rFonts w:ascii="Consolas" w:hAnsi="Consolas"/>
+                <w:sz w:val="19"/>
+              </w:rPr>
+              <w:t>SET status = ?, updated_at = GETDATE()</w:t>
+            </w:r>
+            <w:r>
+              <w:br/>
+            </w:r>
+            <w:r>
+              <w:rPr>
+                <w:rFonts w:ascii="Consolas" w:hAnsi="Consolas"/>
+                <w:sz w:val="19"/>
+              </w:rPr>
+              <w:t>WHERE grammar_id = ? AND status = 'pending_review';</w:t>
+            </w:r>
+            <w:r>
+              <w:br/>
+            </w:r>
+            <w:r>
+              <w:rPr>
+                <w:rFonts w:ascii="Consolas" w:hAnsi="Consolas"/>
+                <w:sz w:val="19"/>
+              </w:rPr>
+            </w:r>
+            <w:r>
+              <w:br/>
+            </w:r>
+            <w:r>
+              <w:rPr>
+                <w:rFonts w:ascii="Consolas" w:hAnsi="Consolas"/>
+                <w:sz w:val="19"/>
+              </w:rPr>
+              <w:t>-- write an audit row for every review action</w:t>
+            </w:r>
+            <w:r>
+              <w:br/>
+            </w:r>
+            <w:r>
+              <w:rPr>
+                <w:rFonts w:ascii="Consolas" w:hAnsi="Consolas"/>
+                <w:sz w:val="19"/>
+              </w:rPr>
+              <w:t>INSERT INTO admin_audit_logs (staff_id, action, target_table, target_id, note, created_at)</w:t>
+            </w:r>
+            <w:r>
+              <w:br/>
+            </w:r>
+            <w:r>
+              <w:rPr>
+                <w:rFonts w:ascii="Consolas" w:hAnsi="Consolas"/>
+                <w:sz w:val="19"/>
+              </w:rPr>
+              <w:t>VALUES (?, ?, ?, ?, ?, GETDATE());</w:t>
+            </w:r>
+          </w:p>
+        </w:tc>
+      </w:tr>
+    </w:tbl>
+    <w:p>
+      <w:pPr>
+        <w:pStyle w:val="Heading3"/>
+      </w:pPr>
+      <w:r>
+        <w:t>3.7 Staff Content Authoring &amp; Submit for Review</w:t>
+      </w:r>
+    </w:p>
+    <w:p>
+      <w:pPr>
+        <w:pStyle w:val="Heading4"/>
+      </w:pPr>
+      <w:r>
+        <w:t>3.7.1 Class Diagram</w:t>
+      </w:r>
+    </w:p>
+    <w:p>
+      <w:r>
+        <w:drawing>
+          <wp:inline xmlns:a="http://schemas.openxmlformats.org/drawingml/2006/main" xmlns:pic="http://schemas.openxmlformats.org/drawingml/2006/picture">
+            <wp:extent cx="5852160" cy="3842070"/>
+            <wp:docPr id="19" name="Picture 19"/>
+            <wp:cNvGraphicFramePr>
+              <a:graphicFrameLocks noChangeAspect="1"/>
+            </wp:cNvGraphicFramePr>
+            <a:graphic>
+              <a:graphicData uri="http://schemas.openxmlformats.org/drawingml/2006/picture">
+                <pic:pic>
+                  <pic:nvPicPr>
+                    <pic:cNvPr id="0" name="class-staffcontent.png"/>
+                    <pic:cNvPicPr/>
+                  </pic:nvPicPr>
+                  <pic:blipFill>
+                    <a:blip r:embed="rId36"/>
+                    <a:stretch>
+                      <a:fillRect/>
+                    </a:stretch>
+                  </pic:blipFill>
+                  <pic:spPr>
+                    <a:xfrm>
+                      <a:off x="0" y="0"/>
+                      <a:ext cx="5852160" cy="3842070"/>
+                    </a:xfrm>
+                    <a:prstGeom prst="rect"/>
+                  </pic:spPr>
+                </pic:pic>
+              </a:graphicData>
+            </a:graphic>
+          </wp:inline>
+        </w:drawing>
+      </w:r>
+    </w:p>
     <w:p>
       <w:r>
         <w:rPr>
-          <w:rFonts w:ascii="Consolas" w:hAnsi="Consolas"/>
-          <w:sz w:val="19"/>
+          <w:b/>
+          <w:i w:val="0"/>
+          <w:sz w:val="21"/>
         </w:rPr>
-        <w:t>-- findActiveById(): fetch content awaiting review (example: the GRAMMAR handler)</w:t>
+        <w:t>Class Specifications</w:t>
       </w:r>
-      <w:r>
-        <w:br/>
-      </w:r>
+    </w:p>
+    <w:p>
       <w:r>
         <w:rPr>
-          <w:rFonts w:ascii="Consolas" w:hAnsi="Consolas"/>
-          <w:sz w:val="19"/>
+          <w:b/>
+          <w:i w:val="0"/>
+          <w:sz w:val="20"/>
         </w:rPr>
-        <w:t>SELECT * FROM grammar_points WHERE grammar_id = ? AND status = 'pending_review';</w:t>
+        <w:t>StaffGrammarServiceImpl Class (representative — the same create-draft / submit-for-review pattern is repeated per content type: StaffQuestionServiceImpl, StaffQuizService, StaffExamService, LearningContentServiceImpl for kanji/vocab/lesson)</w:t>
       </w:r>
+    </w:p>
+    <w:tbl>
+      <w:tblPr>
+        <w:tblStyle w:val="TableGrid"/>
+        <w:tblW w:type="auto" w:w="0"/>
+        <w:tblLook w:firstColumn="1" w:firstRow="1" w:lastColumn="0" w:lastRow="0" w:noHBand="0" w:noVBand="1" w:val="04A0"/>
+      </w:tblPr>
+      <w:tblGrid>
+        <w:gridCol w:w="3216"/>
+        <w:gridCol w:w="3216"/>
+        <w:gridCol w:w="3216"/>
+      </w:tblGrid>
+      <w:tr>
+        <w:tc>
+          <w:tcPr>
+            <w:tcW w:type="dxa" w:w="3216"/>
+          </w:tcPr>
+          <w:p>
+            <w:r>
+              <w:rPr>
+                <w:b/>
+              </w:rPr>
+              <w:t>No</w:t>
+            </w:r>
+          </w:p>
+        </w:tc>
+        <w:tc>
+          <w:tcPr>
+            <w:tcW w:type="dxa" w:w="3216"/>
+          </w:tcPr>
+          <w:p>
+            <w:r>
+              <w:rPr>
+                <w:b/>
+              </w:rPr>
+              <w:t>Method</w:t>
+            </w:r>
+          </w:p>
+        </w:tc>
+        <w:tc>
+          <w:tcPr>
+            <w:tcW w:type="dxa" w:w="3216"/>
+          </w:tcPr>
+          <w:p>
+            <w:r>
+              <w:rPr>
+                <w:b/>
+              </w:rPr>
+              <w:t>Description</w:t>
+            </w:r>
+          </w:p>
+        </w:tc>
+      </w:tr>
+      <w:tr>
+        <w:tc>
+          <w:tcPr>
+            <w:tcW w:type="dxa" w:w="3216"/>
+          </w:tcPr>
+          <w:p>
+            <w:r>
+              <w:t>01</w:t>
+            </w:r>
+          </w:p>
+        </w:tc>
+        <w:tc>
+          <w:tcPr>
+            <w:tcW w:type="dxa" w:w="3216"/>
+          </w:tcPr>
+          <w:p>
+            <w:r>
+              <w:t>createGrammar(CreateGrammarRequest, staffEmail)</w:t>
+            </w:r>
+          </w:p>
+        </w:tc>
+        <w:tc>
+          <w:tcPr>
+            <w:tcW w:type="dxa" w:w="3216"/>
+          </w:tcPr>
+          <w:p>
+            <w:r>
+              <w:t>Input: grammar fields, the authoring Staff's email. Parses jlptLevel server-side so only N1..N5 can ever be stored (never trusts client-side validation alone), forces status=DRAFT and createdBy=the calling Staff regardless of what the request body contains.</w:t>
+            </w:r>
+          </w:p>
+        </w:tc>
+      </w:tr>
+      <w:tr>
+        <w:tc>
+          <w:tcPr>
+            <w:tcW w:type="dxa" w:w="3216"/>
+          </w:tcPr>
+          <w:p>
+            <w:r>
+              <w:t>02</w:t>
+            </w:r>
+          </w:p>
+        </w:tc>
+        <w:tc>
+          <w:tcPr>
+            <w:tcW w:type="dxa" w:w="3216"/>
+          </w:tcPr>
+          <w:p>
+            <w:r>
+              <w:t>updateGrammar(grammarId, UpdateGrammarRequest, staffEmail)</w:t>
+            </w:r>
+          </w:p>
+        </w:tc>
+        <w:tc>
+          <w:tcPr>
+            <w:tcW w:type="dxa" w:w="3216"/>
+          </w:tcPr>
+          <w:p>
+            <w:r>
+              <w:t>Input: grammar id, partial fields to update. guardOwnershipOrManager blocks a Staff from editing another Staff's content (a Staff Manager may edit any). Editing is blocked once status=PUBLISHED, and only allowed from DRAFT/REJECTED otherwise (mirrors LESSON-005's intent: don't let content mutate while it's mid-workflow).</w:t>
+            </w:r>
+          </w:p>
+        </w:tc>
+      </w:tr>
+      <w:tr>
+        <w:tc>
+          <w:tcPr>
+            <w:tcW w:type="dxa" w:w="3216"/>
+          </w:tcPr>
+          <w:p>
+            <w:r>
+              <w:t>03</w:t>
+            </w:r>
+          </w:p>
+        </w:tc>
+        <w:tc>
+          <w:tcPr>
+            <w:tcW w:type="dxa" w:w="3216"/>
+          </w:tcPr>
+          <w:p>
+            <w:r>
+              <w:t>submitForReview(grammarId, staffEmail)</w:t>
+            </w:r>
+          </w:p>
+        </w:tc>
+        <w:tc>
+          <w:tcPr>
+            <w:tcW w:type="dxa" w:w="3216"/>
+          </w:tcPr>
+          <w:p>
+            <w:r>
+              <w:t>Input: grammar id + the calling Staff's email. Re-checks ownership, then guards every mandatory field (structure/meaning/usageExplanation/exampleSentenceJp/jlptLevel) server-side even though the FE form already validates them — the server never trusts that the FE ran its checks. Only DRAFT or REJECTED can be submitted; moves status to PENDING_REVIEW, which is exactly what ContentReviewService's review queue reads (§3.6).</w:t>
+            </w:r>
+          </w:p>
+        </w:tc>
+      </w:tr>
+    </w:tbl>
+    <w:p>
+      <w:pPr>
+        <w:pStyle w:val="Heading4"/>
+      </w:pPr>
       <w:r>
-        <w:br/>
+        <w:t>3.7.2 Staff Submit-for-Review Sequence</w:t>
       </w:r>
+    </w:p>
+    <w:p>
+      <w:r>
+        <w:drawing>
+          <wp:inline xmlns:a="http://schemas.openxmlformats.org/drawingml/2006/main" xmlns:pic="http://schemas.openxmlformats.org/drawingml/2006/picture">
+            <wp:extent cx="5852160" cy="2825181"/>
+            <wp:docPr id="20" name="Picture 20"/>
+            <wp:cNvGraphicFramePr>
+              <a:graphicFrameLocks noChangeAspect="1"/>
+            </wp:cNvGraphicFramePr>
+            <a:graphic>
+              <a:graphicData uri="http://schemas.openxmlformats.org/drawingml/2006/picture">
+                <pic:pic>
+                  <pic:nvPicPr>
+                    <pic:cNvPr id="0" name="seq-staffcontent.png"/>
+                    <pic:cNvPicPr/>
+                  </pic:nvPicPr>
+                  <pic:blipFill>
+                    <a:blip r:embed="rId37"/>
+                    <a:stretch>
+                      <a:fillRect/>
+                    </a:stretch>
+                  </pic:blipFill>
+                  <pic:spPr>
+                    <a:xfrm>
+                      <a:off x="0" y="0"/>
+                      <a:ext cx="5852160" cy="2825181"/>
+                    </a:xfrm>
+                    <a:prstGeom prst="rect"/>
+                  </pic:spPr>
+                </pic:pic>
+              </a:graphicData>
+            </a:graphic>
+          </wp:inline>
+        </w:drawing>
+      </w:r>
+    </w:p>
+    <w:p>
       <w:r>
         <w:rPr>
-          <w:rFonts w:ascii="Consolas" w:hAnsi="Consolas"/>
-          <w:sz w:val="19"/>
+          <w:b/>
+          <w:i w:val="0"/>
+          <w:sz w:val="21"/>
         </w:rPr>
+        <w:t>Database Queries</w:t>
       </w:r>
+    </w:p>
+    <w:tbl>
+      <w:tblPr>
+        <w:tblW w:type="auto" w:w="0"/>
+        <w:tblLayout w:type="autofit"/>
+        <w:tblLook w:firstColumn="1" w:firstRow="1" w:lastColumn="0" w:lastRow="0" w:noHBand="0" w:noVBand="1" w:val="04A0"/>
+      </w:tblPr>
+      <w:tblGrid>
+        <w:gridCol w:w="9648"/>
+      </w:tblGrid>
+      <w:tr>
+        <w:tc>
+          <w:tcPr>
+            <w:tcW w:type="dxa" w:w="9648"/>
+            <w:shd w:val="clear" w:color="auto" w:fill="F2F6FC"/>
+            <w:tcBorders>
+              <w:top w:val="single" w:sz="12" w:space="0" w:color="8EAADB"/>
+              <w:left w:val="single" w:sz="12" w:space="0" w:color="8EAADB"/>
+              <w:bottom w:val="single" w:sz="12" w:space="0" w:color="8EAADB"/>
+              <w:right w:val="single" w:sz="12" w:space="0" w:color="8EAADB"/>
+            </w:tcBorders>
+            <w:tcMar>
+              <w:top w:w="120" w:type="dxa"/>
+              <w:bottom w:w="120" w:type="dxa"/>
+              <w:left w:w="160" w:type="dxa"/>
+              <w:right w:w="160" w:type="dxa"/>
+            </w:tcMar>
+          </w:tcPr>
+          <w:p>
+            <w:r/>
+            <w:r>
+              <w:rPr>
+                <w:rFonts w:ascii="Consolas" w:hAnsi="Consolas"/>
+                <w:sz w:val="19"/>
+              </w:rPr>
+              <w:t>-- createGrammar(): always starts as DRAFT, creator is whoever is authenticated (not client-supplied)</w:t>
+            </w:r>
+            <w:r>
+              <w:br/>
+            </w:r>
+            <w:r>
+              <w:rPr>
+                <w:rFonts w:ascii="Consolas" w:hAnsi="Consolas"/>
+                <w:sz w:val="19"/>
+              </w:rPr>
+              <w:t>INSERT INTO grammar_points (title, structure, meaning, jlpt_level, status, created_by, created_at)</w:t>
+            </w:r>
+            <w:r>
+              <w:br/>
+            </w:r>
+            <w:r>
+              <w:rPr>
+                <w:rFonts w:ascii="Consolas" w:hAnsi="Consolas"/>
+                <w:sz w:val="19"/>
+              </w:rPr>
+              <w:t>VALUES (?, ?, ?, ?, 'DRAFT', ?, GETDATE());</w:t>
+            </w:r>
+            <w:r>
+              <w:br/>
+            </w:r>
+            <w:r>
+              <w:rPr>
+                <w:rFonts w:ascii="Consolas" w:hAnsi="Consolas"/>
+                <w:sz w:val="19"/>
+              </w:rPr>
+            </w:r>
+            <w:r>
+              <w:br/>
+            </w:r>
+            <w:r>
+              <w:rPr>
+                <w:rFonts w:ascii="Consolas" w:hAnsi="Consolas"/>
+                <w:sz w:val="19"/>
+              </w:rPr>
+              <w:t>-- submitForReview(): only DRAFT/REJECTED content can move to PENDING_REVIEW</w:t>
+            </w:r>
+            <w:r>
+              <w:br/>
+            </w:r>
+            <w:r>
+              <w:rPr>
+                <w:rFonts w:ascii="Consolas" w:hAnsi="Consolas"/>
+                <w:sz w:val="19"/>
+              </w:rPr>
+              <w:t>UPDATE grammar_points</w:t>
+            </w:r>
+            <w:r>
+              <w:br/>
+            </w:r>
+            <w:r>
+              <w:rPr>
+                <w:rFonts w:ascii="Consolas" w:hAnsi="Consolas"/>
+                <w:sz w:val="19"/>
+              </w:rPr>
+              <w:t>SET status = 'PENDING_REVIEW'</w:t>
+            </w:r>
+            <w:r>
+              <w:br/>
+            </w:r>
+            <w:r>
+              <w:rPr>
+                <w:rFonts w:ascii="Consolas" w:hAnsi="Consolas"/>
+                <w:sz w:val="19"/>
+              </w:rPr>
+              <w:t>WHERE grammar_id = ? AND status IN ('DRAFT', 'REJECTED');</w:t>
+            </w:r>
+            <w:r>
+              <w:br/>
+            </w:r>
+            <w:r>
+              <w:rPr>
+                <w:rFonts w:ascii="Consolas" w:hAnsi="Consolas"/>
+                <w:sz w:val="19"/>
+              </w:rPr>
+            </w:r>
+            <w:r>
+              <w:br/>
+            </w:r>
+            <w:r>
+              <w:rPr>
+                <w:rFonts w:ascii="Consolas" w:hAnsi="Consolas"/>
+                <w:sz w:val="19"/>
+              </w:rPr>
+              <w:t>-- listGrammars(): a Staff only ever sees their own drafts/submissions (a Manager sees all via a separate query)</w:t>
+            </w:r>
+            <w:r>
+              <w:br/>
+            </w:r>
+            <w:r>
+              <w:rPr>
+                <w:rFonts w:ascii="Consolas" w:hAnsi="Consolas"/>
+                <w:sz w:val="19"/>
+              </w:rPr>
+              <w:t>SELECT * FROM grammar_points</w:t>
+            </w:r>
+            <w:r>
+              <w:br/>
+            </w:r>
+            <w:r>
+              <w:rPr>
+                <w:rFonts w:ascii="Consolas" w:hAnsi="Consolas"/>
+                <w:sz w:val="19"/>
+              </w:rPr>
+              <w:t>WHERE created_by = ? AND (jlpt_level = ? OR ? IS NULL) AND (status = ? OR ? IS NULL) AND status != 'DELETED';</w:t>
+            </w:r>
+          </w:p>
+        </w:tc>
+      </w:tr>
+    </w:tbl>
+    <w:p>
+      <w:pPr>
+        <w:pStyle w:val="Heading3"/>
+      </w:pPr>
       <w:r>
-        <w:br/>
+        <w:t>3.8 Admin User Management</w:t>
       </w:r>
+    </w:p>
+    <w:p>
+      <w:pPr>
+        <w:pStyle w:val="Heading4"/>
+      </w:pPr>
+      <w:r>
+        <w:t>3.8.1 Class Diagram</w:t>
+      </w:r>
+    </w:p>
+    <w:p>
+      <w:r>
+        <w:drawing>
+          <wp:inline xmlns:a="http://schemas.openxmlformats.org/drawingml/2006/main" xmlns:pic="http://schemas.openxmlformats.org/drawingml/2006/picture">
+            <wp:extent cx="5852160" cy="3504935"/>
+            <wp:docPr id="21" name="Picture 21"/>
+            <wp:cNvGraphicFramePr>
+              <a:graphicFrameLocks noChangeAspect="1"/>
+            </wp:cNvGraphicFramePr>
+            <a:graphic>
+              <a:graphicData uri="http://schemas.openxmlformats.org/drawingml/2006/picture">
+                <pic:pic>
+                  <pic:nvPicPr>
+                    <pic:cNvPr id="0" name="class-admin-user.png"/>
+                    <pic:cNvPicPr/>
+                  </pic:nvPicPr>
+                  <pic:blipFill>
+                    <a:blip r:embed="rId38"/>
+                    <a:stretch>
+                      <a:fillRect/>
+                    </a:stretch>
+                  </pic:blipFill>
+                  <pic:spPr>
+                    <a:xfrm>
+                      <a:off x="0" y="0"/>
+                      <a:ext cx="5852160" cy="3504935"/>
+                    </a:xfrm>
+                    <a:prstGeom prst="rect"/>
+                  </pic:spPr>
+                </pic:pic>
+              </a:graphicData>
+            </a:graphic>
+          </wp:inline>
+        </w:drawing>
+      </w:r>
+    </w:p>
+    <w:p>
       <w:r>
         <w:rPr>
-          <w:rFonts w:ascii="Consolas" w:hAnsi="Consolas"/>
-          <w:sz w:val="19"/>
+          <w:b/>
+          <w:i w:val="0"/>
+          <w:sz w:val="21"/>
         </w:rPr>
-        <w:t>-- approve(): only updates if still pending_review (prevents double approval)</w:t>
+        <w:t>Class Specifications</w:t>
       </w:r>
-      <w:r>
-        <w:br/>
-      </w:r>
+    </w:p>
+    <w:p>
       <w:r>
         <w:rPr>
-          <w:rFonts w:ascii="Consolas" w:hAnsi="Consolas"/>
-          <w:sz w:val="19"/>
+          <w:b/>
+          <w:i w:val="0"/>
+          <w:sz w:val="20"/>
         </w:rPr>
-        <w:t>UPDATE grammar_points</w:t>
+        <w:t>AdminUserService Class</w:t>
       </w:r>
+    </w:p>
+    <w:tbl>
+      <w:tblPr>
+        <w:tblStyle w:val="TableGrid"/>
+        <w:tblW w:type="auto" w:w="0"/>
+        <w:tblLook w:firstColumn="1" w:firstRow="1" w:lastColumn="0" w:lastRow="0" w:noHBand="0" w:noVBand="1" w:val="04A0"/>
+      </w:tblPr>
+      <w:tblGrid>
+        <w:gridCol w:w="3216"/>
+        <w:gridCol w:w="3216"/>
+        <w:gridCol w:w="3216"/>
+      </w:tblGrid>
+      <w:tr>
+        <w:tc>
+          <w:tcPr>
+            <w:tcW w:type="dxa" w:w="3216"/>
+          </w:tcPr>
+          <w:p>
+            <w:r>
+              <w:rPr>
+                <w:b/>
+              </w:rPr>
+              <w:t>No</w:t>
+            </w:r>
+          </w:p>
+        </w:tc>
+        <w:tc>
+          <w:tcPr>
+            <w:tcW w:type="dxa" w:w="3216"/>
+          </w:tcPr>
+          <w:p>
+            <w:r>
+              <w:rPr>
+                <w:b/>
+              </w:rPr>
+              <w:t>Method</w:t>
+            </w:r>
+          </w:p>
+        </w:tc>
+        <w:tc>
+          <w:tcPr>
+            <w:tcW w:type="dxa" w:w="3216"/>
+          </w:tcPr>
+          <w:p>
+            <w:r>
+              <w:rPr>
+                <w:b/>
+              </w:rPr>
+              <w:t>Description</w:t>
+            </w:r>
+          </w:p>
+        </w:tc>
+      </w:tr>
+      <w:tr>
+        <w:tc>
+          <w:tcPr>
+            <w:tcW w:type="dxa" w:w="3216"/>
+          </w:tcPr>
+          <w:p>
+            <w:r>
+              <w:t>01</w:t>
+            </w:r>
+          </w:p>
+        </w:tc>
+        <w:tc>
+          <w:tcPr>
+            <w:tcW w:type="dxa" w:w="3216"/>
+          </w:tcPr>
+          <w:p>
+            <w:r>
+              <w:t>createStaff(adminEmail, CreateStaffRequest)</w:t>
+            </w:r>
+          </w:p>
+        </w:tc>
+        <w:tc>
+          <w:tcPr>
+            <w:tcW w:type="dxa" w:w="3216"/>
+          </w:tcPr>
+          <w:p>
+            <w:r>
+              <w:t>Input: email/name/staffRole. Rejects if the email already exists across all 3 account tables (student/staff/admin), creates a StaffUser with status=PENDING (cannot log in yet), issues a 24h EMAIL_VERIFICATION auth_tokens row, and emails an invitation link — the Staff sets their own password via setupStaffPassword (never issued in plaintext by the Admin).</w:t>
+            </w:r>
+          </w:p>
+        </w:tc>
+      </w:tr>
+      <w:tr>
+        <w:tc>
+          <w:tcPr>
+            <w:tcW w:type="dxa" w:w="3216"/>
+          </w:tcPr>
+          <w:p>
+            <w:r>
+              <w:t>02</w:t>
+            </w:r>
+          </w:p>
+        </w:tc>
+        <w:tc>
+          <w:tcPr>
+            <w:tcW w:type="dxa" w:w="3216"/>
+          </w:tcPr>
+          <w:p>
+            <w:r>
+              <w:t>suspendUser(adminEmail, type, userId, SuspendUserRequest)</w:t>
+            </w:r>
+          </w:p>
+        </w:tc>
+        <w:tc>
+          <w:tcPr>
+            <w:tcW w:type="dxa" w:w="3216"/>
+          </w:tcPr>
+          <w:p>
+            <w:r>
+              <w:t>checkSelfModification blocks an Admin from suspending their own account. Sets status=SUSPENDED + suspendReason, then revokes every currently-active refresh token for that user (LESSON-based defense-in-depth: a suspended account's existing sessions stop working immediately, not just future logins) via AuthTokenRepository.revokeAllActiveByStudentId/StaffId.</w:t>
+            </w:r>
+          </w:p>
+        </w:tc>
+      </w:tr>
+      <w:tr>
+        <w:tc>
+          <w:tcPr>
+            <w:tcW w:type="dxa" w:w="3216"/>
+          </w:tcPr>
+          <w:p>
+            <w:r>
+              <w:t>03</w:t>
+            </w:r>
+          </w:p>
+        </w:tc>
+        <w:tc>
+          <w:tcPr>
+            <w:tcW w:type="dxa" w:w="3216"/>
+          </w:tcPr>
+          <w:p>
+            <w:r>
+              <w:t>softDeleteUser(adminEmail, type, userId)</w:t>
+            </w:r>
+          </w:p>
+        </w:tc>
+        <w:tc>
+          <w:tcPr>
+            <w:tcW w:type="dxa" w:w="3216"/>
+          </w:tcPr>
+          <w:p>
+            <w:r>
+              <w:t>Same self-modification + status guard as suspend, but sets status=DELETED (ADR-004: soft delete only — no DELETE FROM). Deleting an Admin account through this endpoint is explicitly rejected (BusinessRuleException) — Admin accounts can't be removed this way.</w:t>
+            </w:r>
+          </w:p>
+        </w:tc>
+      </w:tr>
+      <w:tr>
+        <w:tc>
+          <w:tcPr>
+            <w:tcW w:type="dxa" w:w="3216"/>
+          </w:tcPr>
+          <w:p>
+            <w:r>
+              <w:t>04</w:t>
+            </w:r>
+          </w:p>
+        </w:tc>
+        <w:tc>
+          <w:tcPr>
+            <w:tcW w:type="dxa" w:w="3216"/>
+          </w:tcPr>
+          <w:p>
+            <w:r>
+              <w:t>restoreUser(adminEmail, type, userId)</w:t>
+            </w:r>
+          </w:p>
+        </w:tc>
+        <w:tc>
+          <w:tcPr>
+            <w:tcW w:type="dxa" w:w="3216"/>
+          </w:tcPr>
+          <w:p>
+            <w:r>
+              <w:t>Only valid from status=DELETED (else BusinessRuleException); flips back to ACTIVE. Every mutating call also writes an admin_audit_logs row via the private auditLog() helper (action, targetTable, targetId, description) so every account-management action is traceable.</w:t>
+            </w:r>
+          </w:p>
+        </w:tc>
+      </w:tr>
+    </w:tbl>
+    <w:p>
+      <w:pPr>
+        <w:pStyle w:val="Heading4"/>
+      </w:pPr>
       <w:r>
-        <w:br/>
+        <w:t>3.8.2 Suspend User Sequence</w:t>
       </w:r>
+    </w:p>
+    <w:p>
+      <w:r>
+        <w:drawing>
+          <wp:inline xmlns:a="http://schemas.openxmlformats.org/drawingml/2006/main" xmlns:pic="http://schemas.openxmlformats.org/drawingml/2006/picture">
+            <wp:extent cx="5852160" cy="2687659"/>
+            <wp:docPr id="22" name="Picture 22"/>
+            <wp:cNvGraphicFramePr>
+              <a:graphicFrameLocks noChangeAspect="1"/>
+            </wp:cNvGraphicFramePr>
+            <a:graphic>
+              <a:graphicData uri="http://schemas.openxmlformats.org/drawingml/2006/picture">
+                <pic:pic>
+                  <pic:nvPicPr>
+                    <pic:cNvPr id="0" name="seq-admin-user.png"/>
+                    <pic:cNvPicPr/>
+                  </pic:nvPicPr>
+                  <pic:blipFill>
+                    <a:blip r:embed="rId39"/>
+                    <a:stretch>
+                      <a:fillRect/>
+                    </a:stretch>
+                  </pic:blipFill>
+                  <pic:spPr>
+                    <a:xfrm>
+                      <a:off x="0" y="0"/>
+                      <a:ext cx="5852160" cy="2687659"/>
+                    </a:xfrm>
+                    <a:prstGeom prst="rect"/>
+                  </pic:spPr>
+                </pic:pic>
+              </a:graphicData>
+            </a:graphic>
+          </wp:inline>
+        </w:drawing>
+      </w:r>
+    </w:p>
+    <w:p>
       <w:r>
         <w:rPr>
-          <w:rFonts w:ascii="Consolas" w:hAnsi="Consolas"/>
-          <w:sz w:val="19"/>
+          <w:b/>
+          <w:i w:val="0"/>
+          <w:sz w:val="21"/>
         </w:rPr>
-        <w:t>SET status = 'published', approved_by = ?, published_at = GETDATE()</w:t>
+        <w:t>Database Queries</w:t>
       </w:r>
+    </w:p>
+    <w:tbl>
+      <w:tblPr>
+        <w:tblW w:type="auto" w:w="0"/>
+        <w:tblLayout w:type="autofit"/>
+        <w:tblLook w:firstColumn="1" w:firstRow="1" w:lastColumn="0" w:lastRow="0" w:noHBand="0" w:noVBand="1" w:val="04A0"/>
+      </w:tblPr>
+      <w:tblGrid>
+        <w:gridCol w:w="9648"/>
+      </w:tblGrid>
+      <w:tr>
+        <w:tc>
+          <w:tcPr>
+            <w:tcW w:type="dxa" w:w="9648"/>
+            <w:shd w:val="clear" w:color="auto" w:fill="F2F6FC"/>
+            <w:tcBorders>
+              <w:top w:val="single" w:sz="12" w:space="0" w:color="8EAADB"/>
+              <w:left w:val="single" w:sz="12" w:space="0" w:color="8EAADB"/>
+              <w:bottom w:val="single" w:sz="12" w:space="0" w:color="8EAADB"/>
+              <w:right w:val="single" w:sz="12" w:space="0" w:color="8EAADB"/>
+            </w:tcBorders>
+            <w:tcMar>
+              <w:top w:w="120" w:type="dxa"/>
+              <w:bottom w:w="120" w:type="dxa"/>
+              <w:left w:w="160" w:type="dxa"/>
+              <w:right w:w="160" w:type="dxa"/>
+            </w:tcMar>
+          </w:tcPr>
+          <w:p>
+            <w:r/>
+            <w:r>
+              <w:rPr>
+                <w:rFonts w:ascii="Consolas" w:hAnsi="Consolas"/>
+                <w:sz w:val="19"/>
+              </w:rPr>
+              <w:t>-- suspendUser(): change status and store the reason</w:t>
+            </w:r>
+            <w:r>
+              <w:br/>
+            </w:r>
+            <w:r>
+              <w:rPr>
+                <w:rFonts w:ascii="Consolas" w:hAnsi="Consolas"/>
+                <w:sz w:val="19"/>
+              </w:rPr>
+              <w:t>UPDATE student_users SET status = 'SUSPENDED', suspend_reason = ? WHERE id = ?;</w:t>
+            </w:r>
+            <w:r>
+              <w:br/>
+            </w:r>
+            <w:r>
+              <w:rPr>
+                <w:rFonts w:ascii="Consolas" w:hAnsi="Consolas"/>
+                <w:sz w:val="19"/>
+              </w:rPr>
+            </w:r>
+            <w:r>
+              <w:br/>
+            </w:r>
+            <w:r>
+              <w:rPr>
+                <w:rFonts w:ascii="Consolas" w:hAnsi="Consolas"/>
+                <w:sz w:val="19"/>
+              </w:rPr>
+              <w:t>-- immediately invalidate that user's existing sessions (not just block future logins)</w:t>
+            </w:r>
+            <w:r>
+              <w:br/>
+            </w:r>
+            <w:r>
+              <w:rPr>
+                <w:rFonts w:ascii="Consolas" w:hAnsi="Consolas"/>
+                <w:sz w:val="19"/>
+              </w:rPr>
+              <w:t>UPDATE auth_tokens SET revoked_at = ? WHERE actor_id = ? AND actor_type = 'STUDENT' AND revoked_at IS NULL;</w:t>
+            </w:r>
+            <w:r>
+              <w:br/>
+            </w:r>
+            <w:r>
+              <w:rPr>
+                <w:rFonts w:ascii="Consolas" w:hAnsi="Consolas"/>
+                <w:sz w:val="19"/>
+              </w:rPr>
+            </w:r>
+            <w:r>
+              <w:br/>
+            </w:r>
+            <w:r>
+              <w:rPr>
+                <w:rFonts w:ascii="Consolas" w:hAnsi="Consolas"/>
+                <w:sz w:val="19"/>
+              </w:rPr>
+              <w:t>-- every admin action is audited</w:t>
+            </w:r>
+            <w:r>
+              <w:br/>
+            </w:r>
+            <w:r>
+              <w:rPr>
+                <w:rFonts w:ascii="Consolas" w:hAnsi="Consolas"/>
+                <w:sz w:val="19"/>
+              </w:rPr>
+              <w:t>INSERT INTO admin_audit_logs (admin_id, action, target_table, target_id, description, created_at)</w:t>
+            </w:r>
+            <w:r>
+              <w:br/>
+            </w:r>
+            <w:r>
+              <w:rPr>
+                <w:rFonts w:ascii="Consolas" w:hAnsi="Consolas"/>
+                <w:sz w:val="19"/>
+              </w:rPr>
+              <w:t>VALUES (?, 'suspend_user', 'student_users', ?, ?, GETDATE());</w:t>
+            </w:r>
+            <w:r>
+              <w:br/>
+            </w:r>
+            <w:r>
+              <w:rPr>
+                <w:rFonts w:ascii="Consolas" w:hAnsi="Consolas"/>
+                <w:sz w:val="19"/>
+              </w:rPr>
+            </w:r>
+            <w:r>
+              <w:br/>
+            </w:r>
+            <w:r>
+              <w:rPr>
+                <w:rFonts w:ascii="Consolas" w:hAnsi="Consolas"/>
+                <w:sz w:val="19"/>
+              </w:rPr>
+              <w:t>-- restoreUser(): only DELETED -&gt; ACTIVE is allowed</w:t>
+            </w:r>
+            <w:r>
+              <w:br/>
+            </w:r>
+            <w:r>
+              <w:rPr>
+                <w:rFonts w:ascii="Consolas" w:hAnsi="Consolas"/>
+                <w:sz w:val="19"/>
+              </w:rPr>
+              <w:t>UPDATE student_users SET status = 'ACTIVE' WHERE id = ? AND status = 'DELETED';</w:t>
+            </w:r>
+          </w:p>
+        </w:tc>
+      </w:tr>
+    </w:tbl>
+    <w:p>
+      <w:pPr>
+        <w:pStyle w:val="Heading3"/>
+      </w:pPr>
       <w:r>
-        <w:br/>
+        <w:t>3.9 Student Support Ticket</w:t>
       </w:r>
+    </w:p>
+    <w:p>
+      <w:pPr>
+        <w:pStyle w:val="Heading4"/>
+      </w:pPr>
+      <w:r>
+        <w:t>3.9.1 Class Diagram</w:t>
+      </w:r>
+    </w:p>
+    <w:p>
+      <w:r>
+        <w:drawing>
+          <wp:inline xmlns:a="http://schemas.openxmlformats.org/drawingml/2006/main" xmlns:pic="http://schemas.openxmlformats.org/drawingml/2006/picture">
+            <wp:extent cx="5852160" cy="4035654"/>
+            <wp:docPr id="23" name="Picture 23"/>
+            <wp:cNvGraphicFramePr>
+              <a:graphicFrameLocks noChangeAspect="1"/>
+            </wp:cNvGraphicFramePr>
+            <a:graphic>
+              <a:graphicData uri="http://schemas.openxmlformats.org/drawingml/2006/picture">
+                <pic:pic>
+                  <pic:nvPicPr>
+                    <pic:cNvPr id="0" name="class-support-ticket.png"/>
+                    <pic:cNvPicPr/>
+                  </pic:nvPicPr>
+                  <pic:blipFill>
+                    <a:blip r:embed="rId40"/>
+                    <a:stretch>
+                      <a:fillRect/>
+                    </a:stretch>
+                  </pic:blipFill>
+                  <pic:spPr>
+                    <a:xfrm>
+                      <a:off x="0" y="0"/>
+                      <a:ext cx="5852160" cy="4035654"/>
+                    </a:xfrm>
+                    <a:prstGeom prst="rect"/>
+                  </pic:spPr>
+                </pic:pic>
+              </a:graphicData>
+            </a:graphic>
+          </wp:inline>
+        </w:drawing>
+      </w:r>
+    </w:p>
+    <w:p>
       <w:r>
         <w:rPr>
-          <w:rFonts w:ascii="Consolas" w:hAnsi="Consolas"/>
-          <w:sz w:val="19"/>
+          <w:b/>
+          <w:i w:val="0"/>
+          <w:sz w:val="21"/>
         </w:rPr>
-        <w:t>WHERE grammar_id = ? AND status = 'pending_review';</w:t>
+        <w:t>Class Specifications</w:t>
       </w:r>
-      <w:r>
-        <w:br/>
-      </w:r>
+    </w:p>
+    <w:p>
       <w:r>
         <w:rPr>
-          <w:rFonts w:ascii="Consolas" w:hAnsi="Consolas"/>
-          <w:sz w:val="19"/>
+          <w:b/>
+          <w:i w:val="0"/>
+          <w:sz w:val="20"/>
         </w:rPr>
+        <w:t>SupportTicketService Class</w:t>
       </w:r>
+    </w:p>
+    <w:tbl>
+      <w:tblPr>
+        <w:tblStyle w:val="TableGrid"/>
+        <w:tblW w:type="auto" w:w="0"/>
+        <w:tblLook w:firstColumn="1" w:firstRow="1" w:lastColumn="0" w:lastRow="0" w:noHBand="0" w:noVBand="1" w:val="04A0"/>
+      </w:tblPr>
+      <w:tblGrid>
+        <w:gridCol w:w="3216"/>
+        <w:gridCol w:w="3216"/>
+        <w:gridCol w:w="3216"/>
+      </w:tblGrid>
+      <w:tr>
+        <w:tc>
+          <w:tcPr>
+            <w:tcW w:type="dxa" w:w="3216"/>
+          </w:tcPr>
+          <w:p>
+            <w:r>
+              <w:rPr>
+                <w:b/>
+              </w:rPr>
+              <w:t>No</w:t>
+            </w:r>
+          </w:p>
+        </w:tc>
+        <w:tc>
+          <w:tcPr>
+            <w:tcW w:type="dxa" w:w="3216"/>
+          </w:tcPr>
+          <w:p>
+            <w:r>
+              <w:rPr>
+                <w:b/>
+              </w:rPr>
+              <w:t>Method</w:t>
+            </w:r>
+          </w:p>
+        </w:tc>
+        <w:tc>
+          <w:tcPr>
+            <w:tcW w:type="dxa" w:w="3216"/>
+          </w:tcPr>
+          <w:p>
+            <w:r>
+              <w:rPr>
+                <w:b/>
+              </w:rPr>
+              <w:t>Description</w:t>
+            </w:r>
+          </w:p>
+        </w:tc>
+      </w:tr>
+      <w:tr>
+        <w:tc>
+          <w:tcPr>
+            <w:tcW w:type="dxa" w:w="3216"/>
+          </w:tcPr>
+          <w:p>
+            <w:r>
+              <w:t>01</w:t>
+            </w:r>
+          </w:p>
+        </w:tc>
+        <w:tc>
+          <w:tcPr>
+            <w:tcW w:type="dxa" w:w="3216"/>
+          </w:tcPr>
+          <w:p>
+            <w:r>
+              <w:t>createTicket(studentId, TicketRequest)</w:t>
+            </w:r>
+          </w:p>
+        </w:tc>
+        <w:tc>
+          <w:tcPr>
+            <w:tcW w:type="dxa" w:w="3216"/>
+          </w:tcPr>
+          <w:p>
+            <w:r>
+              <w:t>Input: subject, content, category, optional priority (defaults NORMAL). Always creates status=OPEN — the Student cannot set an initial status.</w:t>
+            </w:r>
+          </w:p>
+        </w:tc>
+      </w:tr>
+      <w:tr>
+        <w:tc>
+          <w:tcPr>
+            <w:tcW w:type="dxa" w:w="3216"/>
+          </w:tcPr>
+          <w:p>
+            <w:r>
+              <w:t>02</w:t>
+            </w:r>
+          </w:p>
+        </w:tc>
+        <w:tc>
+          <w:tcPr>
+            <w:tcW w:type="dxa" w:w="3216"/>
+          </w:tcPr>
+          <w:p>
+            <w:r>
+              <w:t>addStaffReply(ticketId, staffEmail, TicketReplyRequest)</w:t>
+            </w:r>
+          </w:p>
+        </w:tc>
+        <w:tc>
+          <w:tcPr>
+            <w:tcW w:type="dxa" w:w="3216"/>
+          </w:tcPr>
+          <w:p>
+            <w:r>
+              <w:t>Blocks replying on a closed ticket (checkTicketNotClosed). Authorization is neither 'any Staff' nor 'FE hides the button': only the assigned Staff or a STAFF_MANAGER may reply — enforced server-side (ForbiddenException otherwise). The first Staff reply on an OPEN/ASSIGNED ticket auto-advances it to IN_PROGRESS. Fires a notifyStudent() IN_APP notification so the Student learns about the reply without polling.</w:t>
+            </w:r>
+          </w:p>
+        </w:tc>
+      </w:tr>
+      <w:tr>
+        <w:tc>
+          <w:tcPr>
+            <w:tcW w:type="dxa" w:w="3216"/>
+          </w:tcPr>
+          <w:p>
+            <w:r>
+              <w:t>03</w:t>
+            </w:r>
+          </w:p>
+        </w:tc>
+        <w:tc>
+          <w:tcPr>
+            <w:tcW w:type="dxa" w:w="3216"/>
+          </w:tcPr>
+          <w:p>
+            <w:r>
+              <w:t>assignTicket(ticketId, assignToStaffId, actorEmail, isAdmin)</w:t>
+            </w:r>
+          </w:p>
+        </w:tc>
+        <w:tc>
+          <w:tcPr>
+            <w:tcW w:type="dxa" w:w="3216"/>
+          </w:tcPr>
+          <w:p>
+            <w:r>
+              <w:t>Only a STAFF_MANAGER (or an Admin acting via a separate admin path, isAdmin=true) may assign a ticket. Rejects assigning to a non-ACTIVE staff member (422). Assigning an OPEN ticket moves it to ASSIGNED — this is the approval gate before a Staff can touch it.</w:t>
+            </w:r>
+          </w:p>
+        </w:tc>
+      </w:tr>
+      <w:tr>
+        <w:tc>
+          <w:tcPr>
+            <w:tcW w:type="dxa" w:w="3216"/>
+          </w:tcPr>
+          <w:p>
+            <w:r>
+              <w:t>04</w:t>
+            </w:r>
+          </w:p>
+        </w:tc>
+        <w:tc>
+          <w:tcPr>
+            <w:tcW w:type="dxa" w:w="3216"/>
+          </w:tcPr>
+          <w:p>
+            <w:r>
+              <w:t>closeTicket(ticketId, actorEmail)</w:t>
+            </w:r>
+          </w:p>
+        </w:tc>
+        <w:tc>
+          <w:tcPr>
+            <w:tcW w:type="dxa" w:w="3216"/>
+          </w:tcPr>
+          <w:p>
+            <w:r>
+              <w:t>Staff/Manager-side close -&gt; RESOLVED (vs. closeStudentTicket, the Student's own close -&gt; CLOSED, which additionally checks ownership and that the ticket isn't already closed). Both paths set resolvedAt and, for the Staff path, notify the Student and write an admin_audit_logs row.</w:t>
+            </w:r>
+          </w:p>
+        </w:tc>
+      </w:tr>
+    </w:tbl>
+    <w:p>
+      <w:pPr>
+        <w:pStyle w:val="Heading4"/>
+      </w:pPr>
       <w:r>
-        <w:br/>
+        <w:t>3.9.2 Ticket Lifecycle Sequence</w:t>
       </w:r>
+    </w:p>
+    <w:p>
+      <w:r>
+        <w:drawing>
+          <wp:inline xmlns:a="http://schemas.openxmlformats.org/drawingml/2006/main" xmlns:pic="http://schemas.openxmlformats.org/drawingml/2006/picture">
+            <wp:extent cx="5852160" cy="3121152"/>
+            <wp:docPr id="24" name="Picture 24"/>
+            <wp:cNvGraphicFramePr>
+              <a:graphicFrameLocks noChangeAspect="1"/>
+            </wp:cNvGraphicFramePr>
+            <a:graphic>
+              <a:graphicData uri="http://schemas.openxmlformats.org/drawingml/2006/picture">
+                <pic:pic>
+                  <pic:nvPicPr>
+                    <pic:cNvPr id="0" name="seq-support-ticket.png"/>
+                    <pic:cNvPicPr/>
+                  </pic:nvPicPr>
+                  <pic:blipFill>
+                    <a:blip r:embed="rId41"/>
+                    <a:stretch>
+                      <a:fillRect/>
+                    </a:stretch>
+                  </pic:blipFill>
+                  <pic:spPr>
+                    <a:xfrm>
+                      <a:off x="0" y="0"/>
+                      <a:ext cx="5852160" cy="3121152"/>
+                    </a:xfrm>
+                    <a:prstGeom prst="rect"/>
+                  </pic:spPr>
+                </pic:pic>
+              </a:graphicData>
+            </a:graphic>
+          </wp:inline>
+        </w:drawing>
+      </w:r>
+    </w:p>
+    <w:p>
       <w:r>
         <w:rPr>
-          <w:rFonts w:ascii="Consolas" w:hAnsi="Consolas"/>
-          <w:sz w:val="19"/>
+          <w:b/>
+          <w:i w:val="0"/>
+          <w:sz w:val="21"/>
         </w:rPr>
-        <w:t>-- reject() / requestChanges(): move back to draft or rejected</w:t>
+        <w:t>Database Queries</w:t>
       </w:r>
+    </w:p>
+    <w:tbl>
+      <w:tblPr>
+        <w:tblW w:type="auto" w:w="0"/>
+        <w:tblLayout w:type="autofit"/>
+        <w:tblLook w:firstColumn="1" w:firstRow="1" w:lastColumn="0" w:lastRow="0" w:noHBand="0" w:noVBand="1" w:val="04A0"/>
+      </w:tblPr>
+      <w:tblGrid>
+        <w:gridCol w:w="9648"/>
+      </w:tblGrid>
+      <w:tr>
+        <w:tc>
+          <w:tcPr>
+            <w:tcW w:type="dxa" w:w="9648"/>
+            <w:shd w:val="clear" w:color="auto" w:fill="F2F6FC"/>
+            <w:tcBorders>
+              <w:top w:val="single" w:sz="12" w:space="0" w:color="8EAADB"/>
+              <w:left w:val="single" w:sz="12" w:space="0" w:color="8EAADB"/>
+              <w:bottom w:val="single" w:sz="12" w:space="0" w:color="8EAADB"/>
+              <w:right w:val="single" w:sz="12" w:space="0" w:color="8EAADB"/>
+            </w:tcBorders>
+            <w:tcMar>
+              <w:top w:w="120" w:type="dxa"/>
+              <w:bottom w:w="120" w:type="dxa"/>
+              <w:left w:w="160" w:type="dxa"/>
+              <w:right w:w="160" w:type="dxa"/>
+            </w:tcMar>
+          </w:tcPr>
+          <w:p>
+            <w:r/>
+            <w:r>
+              <w:rPr>
+                <w:rFonts w:ascii="Consolas" w:hAnsi="Consolas"/>
+                <w:sz w:val="19"/>
+              </w:rPr>
+              <w:t>-- createTicket(): every new ticket starts OPEN, owned by the creating student</w:t>
+            </w:r>
+            <w:r>
+              <w:br/>
+            </w:r>
+            <w:r>
+              <w:rPr>
+                <w:rFonts w:ascii="Consolas" w:hAnsi="Consolas"/>
+                <w:sz w:val="19"/>
+              </w:rPr>
+              <w:t>INSERT INTO tickets (student_id, subject, content, category, priority, status, created_at)</w:t>
+            </w:r>
+            <w:r>
+              <w:br/>
+            </w:r>
+            <w:r>
+              <w:rPr>
+                <w:rFonts w:ascii="Consolas" w:hAnsi="Consolas"/>
+                <w:sz w:val="19"/>
+              </w:rPr>
+              <w:t>VALUES (?, ?, ?, ?, ?, 'OPEN', GETDATE());</w:t>
+            </w:r>
+            <w:r>
+              <w:br/>
+            </w:r>
+            <w:r>
+              <w:rPr>
+                <w:rFonts w:ascii="Consolas" w:hAnsi="Consolas"/>
+                <w:sz w:val="19"/>
+              </w:rPr>
+            </w:r>
+            <w:r>
+              <w:br/>
+            </w:r>
+            <w:r>
+              <w:rPr>
+                <w:rFonts w:ascii="Consolas" w:hAnsi="Consolas"/>
+                <w:sz w:val="19"/>
+              </w:rPr>
+              <w:t>-- assignTicket(): Staff Manager approves + hands off to a specific Staff</w:t>
+            </w:r>
+            <w:r>
+              <w:br/>
+            </w:r>
+            <w:r>
+              <w:rPr>
+                <w:rFonts w:ascii="Consolas" w:hAnsi="Consolas"/>
+                <w:sz w:val="19"/>
+              </w:rPr>
+              <w:t>UPDATE tickets SET assigned_to = ?, status = 'ASSIGNED' WHERE ticket_id = ? AND status = 'OPEN';</w:t>
+            </w:r>
+            <w:r>
+              <w:br/>
+            </w:r>
+            <w:r>
+              <w:rPr>
+                <w:rFonts w:ascii="Consolas" w:hAnsi="Consolas"/>
+                <w:sz w:val="19"/>
+              </w:rPr>
+            </w:r>
+            <w:r>
+              <w:br/>
+            </w:r>
+            <w:r>
+              <w:rPr>
+                <w:rFonts w:ascii="Consolas" w:hAnsi="Consolas"/>
+                <w:sz w:val="19"/>
+              </w:rPr>
+              <w:t>-- addStaffReply(): only the assignee or a manager may write here (checked in Java, not SQL)</w:t>
+            </w:r>
+            <w:r>
+              <w:br/>
+            </w:r>
+            <w:r>
+              <w:rPr>
+                <w:rFonts w:ascii="Consolas" w:hAnsi="Consolas"/>
+                <w:sz w:val="19"/>
+              </w:rPr>
+              <w:t>INSERT INTO ticket_replies (ticket_id, staff_sender_id, message, created_at) VALUES (?, ?, ?, GETDATE());</w:t>
+            </w:r>
+            <w:r>
+              <w:br/>
+            </w:r>
+            <w:r>
+              <w:rPr>
+                <w:rFonts w:ascii="Consolas" w:hAnsi="Consolas"/>
+                <w:sz w:val="19"/>
+              </w:rPr>
+              <w:t>UPDATE tickets SET status = 'IN_PROGRESS', last_reply_at = GETDATE() WHERE ticket_id = ? AND status IN ('OPEN','ASSIGNED');</w:t>
+            </w:r>
+            <w:r>
+              <w:br/>
+            </w:r>
+            <w:r>
+              <w:rPr>
+                <w:rFonts w:ascii="Consolas" w:hAnsi="Consolas"/>
+                <w:sz w:val="19"/>
+              </w:rPr>
+            </w:r>
+            <w:r>
+              <w:br/>
+            </w:r>
+            <w:r>
+              <w:rPr>
+                <w:rFonts w:ascii="Consolas" w:hAnsi="Consolas"/>
+                <w:sz w:val="19"/>
+              </w:rPr>
+              <w:t>-- closeTicket() (staff/manager path): terminal state RESOLVED</w:t>
+            </w:r>
+            <w:r>
+              <w:br/>
+            </w:r>
+            <w:r>
+              <w:rPr>
+                <w:rFonts w:ascii="Consolas" w:hAnsi="Consolas"/>
+                <w:sz w:val="19"/>
+              </w:rPr>
+              <w:t>UPDATE tickets SET status = 'RESOLVED', resolved_at = GETDATE() WHERE ticket_id = ?;</w:t>
+            </w:r>
+          </w:p>
+        </w:tc>
+      </w:tr>
+    </w:tbl>
+    <w:p>
+      <w:pPr>
+        <w:pStyle w:val="Heading3"/>
+      </w:pPr>
       <w:r>
-        <w:br/>
+        <w:t>3.10 Staff Broadcast Notification</w:t>
       </w:r>
+    </w:p>
+    <w:p>
+      <w:pPr>
+        <w:pStyle w:val="Heading4"/>
+      </w:pPr>
+      <w:r>
+        <w:t>3.10.1 Class Diagram</w:t>
+      </w:r>
+    </w:p>
+    <w:p>
+      <w:r>
+        <w:drawing>
+          <wp:inline xmlns:a="http://schemas.openxmlformats.org/drawingml/2006/main" xmlns:pic="http://schemas.openxmlformats.org/drawingml/2006/picture">
+            <wp:extent cx="5852160" cy="2374969"/>
+            <wp:docPr id="25" name="Picture 25"/>
+            <wp:cNvGraphicFramePr>
+              <a:graphicFrameLocks noChangeAspect="1"/>
+            </wp:cNvGraphicFramePr>
+            <a:graphic>
+              <a:graphicData uri="http://schemas.openxmlformats.org/drawingml/2006/picture">
+                <pic:pic>
+                  <pic:nvPicPr>
+                    <pic:cNvPr id="0" name="class-notification.png"/>
+                    <pic:cNvPicPr/>
+                  </pic:nvPicPr>
+                  <pic:blipFill>
+                    <a:blip r:embed="rId42"/>
+                    <a:stretch>
+                      <a:fillRect/>
+                    </a:stretch>
+                  </pic:blipFill>
+                  <pic:spPr>
+                    <a:xfrm>
+                      <a:off x="0" y="0"/>
+                      <a:ext cx="5852160" cy="2374969"/>
+                    </a:xfrm>
+                    <a:prstGeom prst="rect"/>
+                  </pic:spPr>
+                </pic:pic>
+              </a:graphicData>
+            </a:graphic>
+          </wp:inline>
+        </w:drawing>
+      </w:r>
+    </w:p>
+    <w:p>
       <w:r>
         <w:rPr>
-          <w:rFonts w:ascii="Consolas" w:hAnsi="Consolas"/>
-          <w:sz w:val="19"/>
+          <w:b/>
+          <w:i w:val="0"/>
+          <w:sz w:val="21"/>
         </w:rPr>
-        <w:t>UPDATE grammar_points</w:t>
+        <w:t>Class Specifications</w:t>
       </w:r>
-      <w:r>
-        <w:br/>
-      </w:r>
+    </w:p>
+    <w:p>
       <w:r>
         <w:rPr>
-          <w:rFonts w:ascii="Consolas" w:hAnsi="Consolas"/>
-          <w:sz w:val="19"/>
+          <w:b/>
+          <w:i w:val="0"/>
+          <w:sz w:val="20"/>
         </w:rPr>
-        <w:t>SET status = ?, updated_at = GETDATE()</w:t>
+        <w:t>NotificationService / NotificationDispatcher Classes</w:t>
       </w:r>
-      <w:r>
-        <w:br/>
-      </w:r>
+    </w:p>
+    <w:tbl>
+      <w:tblPr>
+        <w:tblStyle w:val="TableGrid"/>
+        <w:tblW w:type="auto" w:w="0"/>
+        <w:tblLook w:firstColumn="1" w:firstRow="1" w:lastColumn="0" w:lastRow="0" w:noHBand="0" w:noVBand="1" w:val="04A0"/>
+      </w:tblPr>
+      <w:tblGrid>
+        <w:gridCol w:w="3216"/>
+        <w:gridCol w:w="3216"/>
+        <w:gridCol w:w="3216"/>
+      </w:tblGrid>
+      <w:tr>
+        <w:tc>
+          <w:tcPr>
+            <w:tcW w:type="dxa" w:w="3216"/>
+          </w:tcPr>
+          <w:p>
+            <w:r>
+              <w:rPr>
+                <w:b/>
+              </w:rPr>
+              <w:t>No</w:t>
+            </w:r>
+          </w:p>
+        </w:tc>
+        <w:tc>
+          <w:tcPr>
+            <w:tcW w:type="dxa" w:w="3216"/>
+          </w:tcPr>
+          <w:p>
+            <w:r>
+              <w:rPr>
+                <w:b/>
+              </w:rPr>
+              <w:t>Method</w:t>
+            </w:r>
+          </w:p>
+        </w:tc>
+        <w:tc>
+          <w:tcPr>
+            <w:tcW w:type="dxa" w:w="3216"/>
+          </w:tcPr>
+          <w:p>
+            <w:r>
+              <w:rPr>
+                <w:b/>
+              </w:rPr>
+              <w:t>Description</w:t>
+            </w:r>
+          </w:p>
+        </w:tc>
+      </w:tr>
+      <w:tr>
+        <w:tc>
+          <w:tcPr>
+            <w:tcW w:type="dxa" w:w="3216"/>
+          </w:tcPr>
+          <w:p>
+            <w:r>
+              <w:t>01</w:t>
+            </w:r>
+          </w:p>
+        </w:tc>
+        <w:tc>
+          <w:tcPr>
+            <w:tcW w:type="dxa" w:w="3216"/>
+          </w:tcPr>
+          <w:p>
+            <w:r>
+              <w:t>broadcast(actorEmail, SendNotificationRequest)</w:t>
+            </w:r>
+          </w:p>
+        </w:tc>
+        <w:tc>
+          <w:tcPr>
+            <w:tcW w:type="dxa" w:w="3216"/>
+          </w:tcPr>
+          <w:p>
+            <w:r>
+              <w:t>staffManagerGuard.requireManager blocks any non-STAFF_MANAGER from broadcasting system-wide (LESSON-003 pattern: role check, not UI hiding). resolveTargets(targetJlptLevel) resolves the audience — 'ALL'/blank = every ACTIVE student, otherwise students at one JLPT level. Returns a synthetic jobId immediately (job_notification_&lt;epochMillis&gt;) without waiting for the fan-out to finish.</w:t>
+            </w:r>
+          </w:p>
+        </w:tc>
+      </w:tr>
+      <w:tr>
+        <w:tc>
+          <w:tcPr>
+            <w:tcW w:type="dxa" w:w="3216"/>
+          </w:tcPr>
+          <w:p>
+            <w:r>
+              <w:t>02</w:t>
+            </w:r>
+          </w:p>
+        </w:tc>
+        <w:tc>
+          <w:tcPr>
+            <w:tcW w:type="dxa" w:w="3216"/>
+          </w:tcPr>
+          <w:p>
+            <w:r>
+              <w:t>NotificationDispatcher.broadcastAsync(targets, request, staff)</w:t>
+            </w:r>
+          </w:p>
+        </w:tc>
+        <w:tc>
+          <w:tcPr>
+            <w:tcW w:type="dxa" w:w="3216"/>
+          </w:tcPr>
+          <w:p>
+            <w:r>
+              <w:t>Runs on a separate @Async bean specifically so @Async isn't bypassed by Spring's self-invocation proxy limitation (a same-class call would run synchronously). Writes one Notification row per target student on a background thread — the HTTP response already returned before this finishes (Async AI/Integration anti-pattern avoided: always returns a job id, never blocks the request thread, per ADR/anti-pattern table 'Sync AI Calls').</w:t>
+            </w:r>
+          </w:p>
+        </w:tc>
+      </w:tr>
+      <w:tr>
+        <w:tc>
+          <w:tcPr>
+            <w:tcW w:type="dxa" w:w="3216"/>
+          </w:tcPr>
+          <w:p>
+            <w:r>
+              <w:t>03</w:t>
+            </w:r>
+          </w:p>
+        </w:tc>
+        <w:tc>
+          <w:tcPr>
+            <w:tcW w:type="dxa" w:w="3216"/>
+          </w:tcPr>
+          <w:p>
+            <w:r>
+              <w:t>NotificationDispatcher.deliverPendingEmails()</w:t>
+            </w:r>
+          </w:p>
+        </w:tc>
+        <w:tc>
+          <w:tcPr>
+            <w:tcW w:type="dxa" w:w="3216"/>
+          </w:tcPr>
+          <w:p>
+            <w:r>
+              <w:t>@Scheduled(fixedDelay=60_000) — every 60s, batches up to 100 notifications whose channel is EMAIL/BOTH and sentAt IS NULL and scheduledAt has arrived, and emails each one. Best-effort: a failed send is logged but sentAt is still stamped, so a permanently-broken address can't loop-retry forever (documented trade-off, not silent failure — LESSON-006 partially applies: failures are logged, though there's no retry/backoff here since notifications are non-critical).</w:t>
+            </w:r>
+          </w:p>
+        </w:tc>
+      </w:tr>
+    </w:tbl>
+    <w:p>
       <w:r>
         <w:rPr>
-          <w:rFonts w:ascii="Consolas" w:hAnsi="Consolas"/>
-          <w:sz w:val="19"/>
+          <w:b/>
+          <w:i w:val="0"/>
+          <w:sz w:val="20"/>
         </w:rPr>
-        <w:t>WHERE grammar_id = ? AND status = 'pending_review';</w:t>
+        <w:t>NotificationRuleService Class (Admin-side configuration, UC-40)</w:t>
       </w:r>
+    </w:p>
+    <w:tbl>
+      <w:tblPr>
+        <w:tblStyle w:val="TableGrid"/>
+        <w:tblW w:type="auto" w:w="0"/>
+        <w:tblLook w:firstColumn="1" w:firstRow="1" w:lastColumn="0" w:lastRow="0" w:noHBand="0" w:noVBand="1" w:val="04A0"/>
+      </w:tblPr>
+      <w:tblGrid>
+        <w:gridCol w:w="3216"/>
+        <w:gridCol w:w="3216"/>
+        <w:gridCol w:w="3216"/>
+      </w:tblGrid>
+      <w:tr>
+        <w:tc>
+          <w:tcPr>
+            <w:tcW w:type="dxa" w:w="3216"/>
+          </w:tcPr>
+          <w:p>
+            <w:r>
+              <w:rPr>
+                <w:b/>
+              </w:rPr>
+              <w:t>No</w:t>
+            </w:r>
+          </w:p>
+        </w:tc>
+        <w:tc>
+          <w:tcPr>
+            <w:tcW w:type="dxa" w:w="3216"/>
+          </w:tcPr>
+          <w:p>
+            <w:r>
+              <w:rPr>
+                <w:b/>
+              </w:rPr>
+              <w:t>Method</w:t>
+            </w:r>
+          </w:p>
+        </w:tc>
+        <w:tc>
+          <w:tcPr>
+            <w:tcW w:type="dxa" w:w="3216"/>
+          </w:tcPr>
+          <w:p>
+            <w:r>
+              <w:rPr>
+                <w:b/>
+              </w:rPr>
+              <w:t>Description</w:t>
+            </w:r>
+          </w:p>
+        </w:tc>
+      </w:tr>
+      <w:tr>
+        <w:tc>
+          <w:tcPr>
+            <w:tcW w:type="dxa" w:w="3216"/>
+          </w:tcPr>
+          <w:p>
+            <w:r>
+              <w:t>01</w:t>
+            </w:r>
+          </w:p>
+        </w:tc>
+        <w:tc>
+          <w:tcPr>
+            <w:tcW w:type="dxa" w:w="3216"/>
+          </w:tcPr>
+          <w:p>
+            <w:r>
+              <w:t>createRule/updateRule(NotificationRuleRequest, adminId)</w:t>
+            </w:r>
+          </w:p>
+        </w:tc>
+        <w:tc>
+          <w:tcPr>
+            <w:tcW w:type="dxa" w:w="3216"/>
+          </w:tcPr>
+          <w:p>
+            <w:r>
+              <w:t>Stores each rule as a JSON blob in system_settings (settingGroup='notification', settingKey=ruleKey) — enabled flag, trigger condition, channel, and message template. As of this build, this is configuration metadata only: no scheduled/event-driven consumer reads triggerCondition to fire notifications automatically yet; actual sends still go through the explicit broadcast()/notifyStudent() calls documented above.</w:t>
+            </w:r>
+          </w:p>
+        </w:tc>
+      </w:tr>
+    </w:tbl>
+    <w:p>
+      <w:pPr>
+        <w:pStyle w:val="Heading4"/>
+      </w:pPr>
       <w:r>
-        <w:br/>
+        <w:t>3.10.2 Broadcast + Scheduled Email Delivery Sequence</w:t>
       </w:r>
+    </w:p>
+    <w:p>
+      <w:r>
+        <w:drawing>
+          <wp:inline xmlns:a="http://schemas.openxmlformats.org/drawingml/2006/main" xmlns:pic="http://schemas.openxmlformats.org/drawingml/2006/picture">
+            <wp:extent cx="5852160" cy="2560320"/>
+            <wp:docPr id="26" name="Picture 26"/>
+            <wp:cNvGraphicFramePr>
+              <a:graphicFrameLocks noChangeAspect="1"/>
+            </wp:cNvGraphicFramePr>
+            <a:graphic>
+              <a:graphicData uri="http://schemas.openxmlformats.org/drawingml/2006/picture">
+                <pic:pic>
+                  <pic:nvPicPr>
+                    <pic:cNvPr id="0" name="seq-notification.png"/>
+                    <pic:cNvPicPr/>
+                  </pic:nvPicPr>
+                  <pic:blipFill>
+                    <a:blip r:embed="rId43"/>
+                    <a:stretch>
+                      <a:fillRect/>
+                    </a:stretch>
+                  </pic:blipFill>
+                  <pic:spPr>
+                    <a:xfrm>
+                      <a:off x="0" y="0"/>
+                      <a:ext cx="5852160" cy="2560320"/>
+                    </a:xfrm>
+                    <a:prstGeom prst="rect"/>
+                  </pic:spPr>
+                </pic:pic>
+              </a:graphicData>
+            </a:graphic>
+          </wp:inline>
+        </w:drawing>
+      </w:r>
+    </w:p>
+    <w:p>
       <w:r>
         <w:rPr>
-          <w:rFonts w:ascii="Consolas" w:hAnsi="Consolas"/>
-          <w:sz w:val="19"/>
+          <w:b/>
+          <w:i w:val="0"/>
+          <w:sz w:val="21"/>
         </w:rPr>
+        <w:t>Database Queries</w:t>
       </w:r>
+    </w:p>
+    <w:tbl>
+      <w:tblPr>
+        <w:tblW w:type="auto" w:w="0"/>
+        <w:tblLayout w:type="autofit"/>
+        <w:tblLook w:firstColumn="1" w:firstRow="1" w:lastColumn="0" w:lastRow="0" w:noHBand="0" w:noVBand="1" w:val="04A0"/>
+      </w:tblPr>
+      <w:tblGrid>
+        <w:gridCol w:w="9648"/>
+      </w:tblGrid>
+      <w:tr>
+        <w:tc>
+          <w:tcPr>
+            <w:tcW w:type="dxa" w:w="9648"/>
+            <w:shd w:val="clear" w:color="auto" w:fill="F2F6FC"/>
+            <w:tcBorders>
+              <w:top w:val="single" w:sz="12" w:space="0" w:color="8EAADB"/>
+              <w:left w:val="single" w:sz="12" w:space="0" w:color="8EAADB"/>
+              <w:bottom w:val="single" w:sz="12" w:space="0" w:color="8EAADB"/>
+              <w:right w:val="single" w:sz="12" w:space="0" w:color="8EAADB"/>
+            </w:tcBorders>
+            <w:tcMar>
+              <w:top w:w="120" w:type="dxa"/>
+              <w:bottom w:w="120" w:type="dxa"/>
+              <w:left w:w="160" w:type="dxa"/>
+              <w:right w:w="160" w:type="dxa"/>
+            </w:tcMar>
+          </w:tcPr>
+          <w:p>
+            <w:r/>
+            <w:r>
+              <w:rPr>
+                <w:rFonts w:ascii="Consolas" w:hAnsi="Consolas"/>
+                <w:sz w:val="19"/>
+              </w:rPr>
+              <w:t>-- broadcastAsync(): one row per targeted student, written off the request thread</w:t>
+            </w:r>
+            <w:r>
+              <w:br/>
+            </w:r>
+            <w:r>
+              <w:rPr>
+                <w:rFonts w:ascii="Consolas" w:hAnsi="Consolas"/>
+                <w:sz w:val="19"/>
+              </w:rPr>
+              <w:t>INSERT INTO notifications (student_id, title, content, notification_type, channel, is_auto, staff_creator_id, created_at)</w:t>
+            </w:r>
+            <w:r>
+              <w:br/>
+            </w:r>
+            <w:r>
+              <w:rPr>
+                <w:rFonts w:ascii="Consolas" w:hAnsi="Consolas"/>
+                <w:sz w:val="19"/>
+              </w:rPr>
+              <w:t>VALUES (?, ?, ?, ?, ?, 0, ?, GETDATE());</w:t>
+            </w:r>
+            <w:r>
+              <w:br/>
+            </w:r>
+            <w:r>
+              <w:rPr>
+                <w:rFonts w:ascii="Consolas" w:hAnsi="Consolas"/>
+                <w:sz w:val="19"/>
+              </w:rPr>
+            </w:r>
+            <w:r>
+              <w:br/>
+            </w:r>
+            <w:r>
+              <w:rPr>
+                <w:rFonts w:ascii="Consolas" w:hAnsi="Consolas"/>
+                <w:sz w:val="19"/>
+              </w:rPr>
+              <w:t>-- deliverPendingEmails(): due batch, channel EMAIL/BOTH, not yet sent</w:t>
+            </w:r>
+            <w:r>
+              <w:br/>
+            </w:r>
+            <w:r>
+              <w:rPr>
+                <w:rFonts w:ascii="Consolas" w:hAnsi="Consolas"/>
+                <w:sz w:val="19"/>
+              </w:rPr>
+              <w:t>SELECT * FROM notifications</w:t>
+            </w:r>
+            <w:r>
+              <w:br/>
+            </w:r>
+            <w:r>
+              <w:rPr>
+                <w:rFonts w:ascii="Consolas" w:hAnsi="Consolas"/>
+                <w:sz w:val="19"/>
+              </w:rPr>
+              <w:t>WHERE channel IN ('EMAIL','BOTH') AND sent_at IS NULL AND scheduled_at &lt;= GETDATE()</w:t>
+            </w:r>
+            <w:r>
+              <w:br/>
+            </w:r>
+            <w:r>
+              <w:rPr>
+                <w:rFonts w:ascii="Consolas" w:hAnsi="Consolas"/>
+                <w:sz w:val="19"/>
+              </w:rPr>
+              <w:t>ORDER BY scheduled_at ASC LIMIT 100;</w:t>
+            </w:r>
+            <w:r>
+              <w:br/>
+            </w:r>
+            <w:r>
+              <w:rPr>
+                <w:rFonts w:ascii="Consolas" w:hAnsi="Consolas"/>
+                <w:sz w:val="19"/>
+              </w:rPr>
+            </w:r>
+            <w:r>
+              <w:br/>
+            </w:r>
+            <w:r>
+              <w:rPr>
+                <w:rFonts w:ascii="Consolas" w:hAnsi="Consolas"/>
+                <w:sz w:val="19"/>
+              </w:rPr>
+              <w:t>UPDATE notifications SET sent_at = GETDATE() WHERE notification_id = ?;</w:t>
+            </w:r>
+            <w:r>
+              <w:br/>
+            </w:r>
+            <w:r>
+              <w:rPr>
+                <w:rFonts w:ascii="Consolas" w:hAnsi="Consolas"/>
+                <w:sz w:val="19"/>
+              </w:rPr>
+            </w:r>
+            <w:r>
+              <w:br/>
+            </w:r>
+            <w:r>
+              <w:rPr>
+                <w:rFonts w:ascii="Consolas" w:hAnsi="Consolas"/>
+                <w:sz w:val="19"/>
+              </w:rPr>
+              <w:t>-- NotificationRuleService: rules live in the generic system_settings table, not a dedicated table</w:t>
+            </w:r>
+            <w:r>
+              <w:br/>
+            </w:r>
+            <w:r>
+              <w:rPr>
+                <w:rFonts w:ascii="Consolas" w:hAnsi="Consolas"/>
+                <w:sz w:val="19"/>
+              </w:rPr>
+              <w:t>INSERT INTO system_settings (setting_group, setting_key, setting_value, is_editable, updated_by)</w:t>
+            </w:r>
+            <w:r>
+              <w:br/>
+            </w:r>
+            <w:r>
+              <w:rPr>
+                <w:rFonts w:ascii="Consolas" w:hAnsi="Consolas"/>
+                <w:sz w:val="19"/>
+              </w:rPr>
+              <w:t>VALUES ('notification', ?, ?, 1, ?);</w:t>
+            </w:r>
+          </w:p>
+        </w:tc>
+      </w:tr>
+    </w:tbl>
+    <w:p>
+      <w:pPr>
+        <w:pStyle w:val="Heading3"/>
+      </w:pPr>
       <w:r>
-        <w:br/>
+        <w:t>3.11 Published Content Lifecycle (Unpublish/Archive/Delete/Restore)</w:t>
       </w:r>
+    </w:p>
+    <w:p>
+      <w:pPr>
+        <w:pStyle w:val="Heading4"/>
+      </w:pPr>
+      <w:r>
+        <w:t>3.11.1 Class Diagram</w:t>
+      </w:r>
+    </w:p>
+    <w:p>
+      <w:r>
+        <w:drawing>
+          <wp:inline xmlns:a="http://schemas.openxmlformats.org/drawingml/2006/main" xmlns:pic="http://schemas.openxmlformats.org/drawingml/2006/picture">
+            <wp:extent cx="5852160" cy="2216824"/>
+            <wp:docPr id="27" name="Picture 27"/>
+            <wp:cNvGraphicFramePr>
+              <a:graphicFrameLocks noChangeAspect="1"/>
+            </wp:cNvGraphicFramePr>
+            <a:graphic>
+              <a:graphicData uri="http://schemas.openxmlformats.org/drawingml/2006/picture">
+                <pic:pic>
+                  <pic:nvPicPr>
+                    <pic:cNvPr id="0" name="class-publishedcontent.png"/>
+                    <pic:cNvPicPr/>
+                  </pic:nvPicPr>
+                  <pic:blipFill>
+                    <a:blip r:embed="rId44"/>
+                    <a:stretch>
+                      <a:fillRect/>
+                    </a:stretch>
+                  </pic:blipFill>
+                  <pic:spPr>
+                    <a:xfrm>
+                      <a:off x="0" y="0"/>
+                      <a:ext cx="5852160" cy="2216824"/>
+                    </a:xfrm>
+                    <a:prstGeom prst="rect"/>
+                  </pic:spPr>
+                </pic:pic>
+              </a:graphicData>
+            </a:graphic>
+          </wp:inline>
+        </w:drawing>
+      </w:r>
+    </w:p>
+    <w:p>
       <w:r>
         <w:rPr>
-          <w:rFonts w:ascii="Consolas" w:hAnsi="Consolas"/>
-          <w:sz w:val="19"/>
+          <w:b/>
+          <w:i w:val="0"/>
+          <w:sz w:val="21"/>
         </w:rPr>
-        <w:t>-- write an audit row for every review action</w:t>
+        <w:t>Class Specifications</w:t>
       </w:r>
-      <w:r>
-        <w:br/>
-      </w:r>
+    </w:p>
+    <w:p>
       <w:r>
         <w:rPr>
-          <w:rFonts w:ascii="Consolas" w:hAnsi="Consolas"/>
-          <w:sz w:val="19"/>
+          <w:b/>
+          <w:i w:val="0"/>
+          <w:sz w:val="20"/>
         </w:rPr>
-        <w:t>INSERT INTO admin_audit_logs (staff_id, action, target_table, target_id, note, created_at)</w:t>
+        <w:t>PublishedContentService Class</w:t>
       </w:r>
+    </w:p>
+    <w:tbl>
+      <w:tblPr>
+        <w:tblStyle w:val="TableGrid"/>
+        <w:tblW w:type="auto" w:w="0"/>
+        <w:tblLook w:firstColumn="1" w:firstRow="1" w:lastColumn="0" w:lastRow="0" w:noHBand="0" w:noVBand="1" w:val="04A0"/>
+      </w:tblPr>
+      <w:tblGrid>
+        <w:gridCol w:w="3216"/>
+        <w:gridCol w:w="3216"/>
+        <w:gridCol w:w="3216"/>
+      </w:tblGrid>
+      <w:tr>
+        <w:tc>
+          <w:tcPr>
+            <w:tcW w:type="dxa" w:w="3216"/>
+          </w:tcPr>
+          <w:p>
+            <w:r>
+              <w:rPr>
+                <w:b/>
+              </w:rPr>
+              <w:t>No</w:t>
+            </w:r>
+          </w:p>
+        </w:tc>
+        <w:tc>
+          <w:tcPr>
+            <w:tcW w:type="dxa" w:w="3216"/>
+          </w:tcPr>
+          <w:p>
+            <w:r>
+              <w:rPr>
+                <w:b/>
+              </w:rPr>
+              <w:t>Method</w:t>
+            </w:r>
+          </w:p>
+        </w:tc>
+        <w:tc>
+          <w:tcPr>
+            <w:tcW w:type="dxa" w:w="3216"/>
+          </w:tcPr>
+          <w:p>
+            <w:r>
+              <w:rPr>
+                <w:b/>
+              </w:rPr>
+              <w:t>Description</w:t>
+            </w:r>
+          </w:p>
+        </w:tc>
+      </w:tr>
+      <w:tr>
+        <w:tc>
+          <w:tcPr>
+            <w:tcW w:type="dxa" w:w="3216"/>
+          </w:tcPr>
+          <w:p>
+            <w:r>
+              <w:t>01</w:t>
+            </w:r>
+          </w:p>
+        </w:tc>
+        <w:tc>
+          <w:tcPr>
+            <w:tcW w:type="dxa" w:w="3216"/>
+          </w:tcPr>
+          <w:p>
+            <w:r>
+              <w:t>changeStatus(managerEmail, contentId, ChangeStatusRequest)</w:t>
+            </w:r>
+          </w:p>
+        </w:tc>
+        <w:tc>
+          <w:tcPr>
+            <w:tcW w:type="dxa" w:w="3216"/>
+          </w:tcPr>
+          <w:p>
+            <w:r>
+              <w:t>requireManager guards STAFF_MANAGER-only (enforced in the Service layer since the JWT only grants ROLE_STAFF to every staff account — the Controller's @PreAuthorize can't tell managers apart from regular Staff). Only operates on status=published content. findBlockingReferences runs in the SAME transaction right before the status flip (FR-34-14..17): e.g. a Question still assigned to a live Quiz can't be archived/deleted until that reference is removed — throws ResourceInUseException listing every blocker.</w:t>
+            </w:r>
+          </w:p>
+        </w:tc>
+      </w:tr>
+      <w:tr>
+        <w:tc>
+          <w:tcPr>
+            <w:tcW w:type="dxa" w:w="3216"/>
+          </w:tcPr>
+          <w:p>
+            <w:r>
+              <w:t>02</w:t>
+            </w:r>
+          </w:p>
+        </w:tc>
+        <w:tc>
+          <w:tcPr>
+            <w:tcW w:type="dxa" w:w="3216"/>
+          </w:tcPr>
+          <w:p>
+            <w:r>
+              <w:t>ManagedContentHandler.changeStatus(contentId, target, now)</w:t>
+            </w:r>
+          </w:p>
+        </w:tc>
+        <w:tc>
+          <w:tcPr>
+            <w:tcW w:type="dxa" w:w="3216"/>
+          </w:tcPr>
+          <w:p>
+            <w:r>
+              <w:t>One handler implementation per content type (lesson/kanji/vocabulary/grammar/question/assessment), same resolver pattern as ContentReviewService in §3.6. The UPDATE is conditioned on status='published'; if 0 rows are affected the content left 'published' concurrently (another Manager acted first) and the service throws InvalidStateTransitionException instead of silently no-op'ing — the same optimistic-concurrency guard as ContentReviewService.ensureUpdated().</w:t>
+            </w:r>
+          </w:p>
+        </w:tc>
+      </w:tr>
+      <w:tr>
+        <w:tc>
+          <w:tcPr>
+            <w:tcW w:type="dxa" w:w="3216"/>
+          </w:tcPr>
+          <w:p>
+            <w:r>
+              <w:t>03</w:t>
+            </w:r>
+          </w:p>
+        </w:tc>
+        <w:tc>
+          <w:tcPr>
+            <w:tcW w:type="dxa" w:w="3216"/>
+          </w:tcPr>
+          <w:p>
+            <w:r>
+              <w:t>restore(managerEmail, contentId, RestoreContentRequest)</w:t>
+            </w:r>
+          </w:p>
+        </w:tc>
+        <w:tc>
+          <w:tcPr>
+            <w:tcW w:type="dxa" w:w="3216"/>
+          </w:tcPr>
+          <w:p>
+            <w:r>
+              <w:t>'deleted' is a terminal state — restoring a deleted item throws RestoreNotAllowedException (ADR-004: soft delete is one-way from the Manager's UI; a DBA could still reverse it directly, but the API never does). Only 'archived' -&gt; 'published' is a valid restore; anything else is InvalidStateTransitionException.</w:t>
+            </w:r>
+          </w:p>
+        </w:tc>
+      </w:tr>
+    </w:tbl>
+    <w:p>
+      <w:pPr>
+        <w:pStyle w:val="Heading4"/>
+      </w:pPr>
       <w:r>
-        <w:br/>
+        <w:t>3.11.2 Change Status / Restore Sequence</w:t>
       </w:r>
+    </w:p>
+    <w:p>
+      <w:r>
+        <w:drawing>
+          <wp:inline xmlns:a="http://schemas.openxmlformats.org/drawingml/2006/main" xmlns:pic="http://schemas.openxmlformats.org/drawingml/2006/picture">
+            <wp:extent cx="5852160" cy="2756179"/>
+            <wp:docPr id="28" name="Picture 28"/>
+            <wp:cNvGraphicFramePr>
+              <a:graphicFrameLocks noChangeAspect="1"/>
+            </wp:cNvGraphicFramePr>
+            <a:graphic>
+              <a:graphicData uri="http://schemas.openxmlformats.org/drawingml/2006/picture">
+                <pic:pic>
+                  <pic:nvPicPr>
+                    <pic:cNvPr id="0" name="seq-publishedcontent.png"/>
+                    <pic:cNvPicPr/>
+                  </pic:nvPicPr>
+                  <pic:blipFill>
+                    <a:blip r:embed="rId45"/>
+                    <a:stretch>
+                      <a:fillRect/>
+                    </a:stretch>
+                  </pic:blipFill>
+                  <pic:spPr>
+                    <a:xfrm>
+                      <a:off x="0" y="0"/>
+                      <a:ext cx="5852160" cy="2756179"/>
+                    </a:xfrm>
+                    <a:prstGeom prst="rect"/>
+                  </pic:spPr>
+                </pic:pic>
+              </a:graphicData>
+            </a:graphic>
+          </wp:inline>
+        </w:drawing>
+      </w:r>
+    </w:p>
+    <w:p>
       <w:r>
         <w:rPr>
-          <w:rFonts w:ascii="Consolas" w:hAnsi="Consolas"/>
-          <w:sz w:val="19"/>
+          <w:b/>
+          <w:i w:val="0"/>
+          <w:sz w:val="21"/>
         </w:rPr>
-        <w:t>VALUES (?, ?, ?, ?, ?, GETDATE());</w:t>
+        <w:t>Database Queries</w:t>
       </w:r>
     </w:p>
+    <w:tbl>
+      <w:tblPr>
+        <w:tblW w:type="auto" w:w="0"/>
+        <w:tblLayout w:type="autofit"/>
+        <w:tblLook w:firstColumn="1" w:firstRow="1" w:lastColumn="0" w:lastRow="0" w:noHBand="0" w:noVBand="1" w:val="04A0"/>
+      </w:tblPr>
+      <w:tblGrid>
+        <w:gridCol w:w="9648"/>
+      </w:tblGrid>
+      <w:tr>
+        <w:tc>
+          <w:tcPr>
+            <w:tcW w:type="dxa" w:w="9648"/>
+            <w:shd w:val="clear" w:color="auto" w:fill="F2F6FC"/>
+            <w:tcBorders>
+              <w:top w:val="single" w:sz="12" w:space="0" w:color="8EAADB"/>
+              <w:left w:val="single" w:sz="12" w:space="0" w:color="8EAADB"/>
+              <w:bottom w:val="single" w:sz="12" w:space="0" w:color="8EAADB"/>
+              <w:right w:val="single" w:sz="12" w:space="0" w:color="8EAADB"/>
+            </w:tcBorders>
+            <w:tcMar>
+              <w:top w:w="120" w:type="dxa"/>
+              <w:bottom w:w="120" w:type="dxa"/>
+              <w:left w:w="160" w:type="dxa"/>
+              <w:right w:w="160" w:type="dxa"/>
+            </w:tcMar>
+          </w:tcPr>
+          <w:p>
+            <w:r/>
+            <w:r>
+              <w:rPr>
+                <w:rFonts w:ascii="Consolas" w:hAnsi="Consolas"/>
+                <w:sz w:val="19"/>
+              </w:rPr>
+              <w:t>-- changeStatus(): guarded by both the current status AND absence of blocking references</w:t>
+            </w:r>
+            <w:r>
+              <w:br/>
+            </w:r>
+            <w:r>
+              <w:rPr>
+                <w:rFonts w:ascii="Consolas" w:hAnsi="Consolas"/>
+                <w:sz w:val="19"/>
+              </w:rPr>
+              <w:t>UPDATE questions SET status = ?, updated_at = ? WHERE question_id = ? AND status = 'published';</w:t>
+            </w:r>
+            <w:r>
+              <w:br/>
+            </w:r>
+            <w:r>
+              <w:rPr>
+                <w:rFonts w:ascii="Consolas" w:hAnsi="Consolas"/>
+                <w:sz w:val="19"/>
+              </w:rPr>
+            </w:r>
+            <w:r>
+              <w:br/>
+            </w:r>
+            <w:r>
+              <w:rPr>
+                <w:rFonts w:ascii="Consolas" w:hAnsi="Consolas"/>
+                <w:sz w:val="19"/>
+              </w:rPr>
+              <w:t>-- findBlockingReferences() example: is this question still assigned to any assessment?</w:t>
+            </w:r>
+            <w:r>
+              <w:br/>
+            </w:r>
+            <w:r>
+              <w:rPr>
+                <w:rFonts w:ascii="Consolas" w:hAnsi="Consolas"/>
+                <w:sz w:val="19"/>
+              </w:rPr>
+              <w:t>SELECT * FROM question_assignments WHERE question_id = ? AND parent_type = 'ASSESSMENT';</w:t>
+            </w:r>
+            <w:r>
+              <w:br/>
+            </w:r>
+            <w:r>
+              <w:rPr>
+                <w:rFonts w:ascii="Consolas" w:hAnsi="Consolas"/>
+                <w:sz w:val="19"/>
+              </w:rPr>
+            </w:r>
+            <w:r>
+              <w:br/>
+            </w:r>
+            <w:r>
+              <w:rPr>
+                <w:rFonts w:ascii="Consolas" w:hAnsi="Consolas"/>
+                <w:sz w:val="19"/>
+              </w:rPr>
+              <w:t>-- restore(): archived -&gt; published only; deleted is terminal and can never be restored via this API</w:t>
+            </w:r>
+            <w:r>
+              <w:br/>
+            </w:r>
+            <w:r>
+              <w:rPr>
+                <w:rFonts w:ascii="Consolas" w:hAnsi="Consolas"/>
+                <w:sz w:val="19"/>
+              </w:rPr>
+              <w:t>UPDATE questions SET status = 'published', updated_at = ? WHERE question_id = ? AND status = 'archived';</w:t>
+            </w:r>
+            <w:r>
+              <w:br/>
+            </w:r>
+            <w:r>
+              <w:rPr>
+                <w:rFonts w:ascii="Consolas" w:hAnsi="Consolas"/>
+                <w:sz w:val="19"/>
+              </w:rPr>
+            </w:r>
+            <w:r>
+              <w:br/>
+            </w:r>
+            <w:r>
+              <w:rPr>
+                <w:rFonts w:ascii="Consolas" w:hAnsi="Consolas"/>
+                <w:sz w:val="19"/>
+              </w:rPr>
+              <w:t>-- every lifecycle transition is audited (reuses ContentReview's audit table)</w:t>
+            </w:r>
+            <w:r>
+              <w:br/>
+            </w:r>
+            <w:r>
+              <w:rPr>
+                <w:rFonts w:ascii="Consolas" w:hAnsi="Consolas"/>
+                <w:sz w:val="19"/>
+              </w:rPr>
+              <w:t>INSERT INTO admin_audit_logs (staff_id, action, target_table, target_id, note, created_at)</w:t>
+            </w:r>
+            <w:r>
+              <w:br/>
+            </w:r>
+            <w:r>
+              <w:rPr>
+                <w:rFonts w:ascii="Consolas" w:hAnsi="Consolas"/>
+                <w:sz w:val="19"/>
+              </w:rPr>
+              <w:t>VALUES (?, ?, ?, ?, ?, GETDATE());</w:t>
+            </w:r>
+          </w:p>
+        </w:tc>
+      </w:tr>
+    </w:tbl>
     <w:sectPr>
-      <w:footerReference w:type="default" r:id="rId29"/>
+      <w:footerReference w:type="default" r:id="rId15"/>
       <w:pgSz w:w="12240" w:h="15840"/>
       <w:pgMar w:top="1152" w:right="1296" w:bottom="1152" w:left="1296" w:header="720" w:footer="720" w:gutter="0"/>
       <w:cols w:space="720"/>
@@ -13127,7 +15616,7 @@
 </file>
 
 <file path=word/endnotes.xml><?xml version="1.0" encoding="utf-8"?>
-<w:endnotes xmlns:wpc="http://schemas.microsoft.com/office/word/2010/wordprocessingCanvas" xmlns:cx="http://schemas.microsoft.com/office/drawing/2014/chartex" xmlns:cx1="http://schemas.microsoft.com/office/drawing/2015/9/8/chartex" xmlns:mc="http://schemas.openxmlformats.org/markup-compatibility/2006" xmlns:o="urn:schemas-microsoft-com:office:office" xmlns:r="http://schemas.openxmlformats.org/officeDocument/2006/relationships" xmlns:m="http://schemas.openxmlformats.org/officeDocument/2006/math" xmlns:v="urn:schemas-microsoft-com:vml" xmlns:wp14="http://schemas.microsoft.com/office/word/2010/wordprocessingDrawing" xmlns:wp="http://schemas.openxmlformats.org/drawingml/2006/wordprocessingDrawing" xmlns:w10="urn:schemas-microsoft-com:office:word" xmlns:w="http://schemas.openxmlformats.org/wordprocessingml/2006/main" xmlns:w14="http://schemas.microsoft.com/office/word/2010/wordml" xmlns:w15="http://schemas.microsoft.com/office/word/2012/wordml" xmlns:w16se="http://schemas.microsoft.com/office/word/2015/wordml/symex" xmlns:wpg="http://schemas.microsoft.com/office/word/2010/wordprocessingGroup" xmlns:wpi="http://schemas.microsoft.com/office/word/2010/wordprocessingInk" xmlns:wne="http://schemas.microsoft.com/office/word/2006/wordml" xmlns:wps="http://schemas.microsoft.com/office/word/2010/wordprocessingShape" mc:Ignorable="w14 w15 w16se wp14">
+<w:endnotes xmlns:wpc="http://schemas.microsoft.com/office/word/2010/wordprocessingCanvas" xmlns:cx="http://schemas.microsoft.com/office/drawing/2014/chartex" xmlns:cx1="http://schemas.microsoft.com/office/drawing/2015/9/8/chartex" xmlns:cx2="http://schemas.microsoft.com/office/drawing/2015/10/21/chartex" xmlns:cx3="http://schemas.microsoft.com/office/drawing/2016/5/9/chartex" xmlns:cx4="http://schemas.microsoft.com/office/drawing/2016/5/10/chartex" xmlns:cx5="http://schemas.microsoft.com/office/drawing/2016/5/11/chartex" xmlns:cx6="http://schemas.microsoft.com/office/drawing/2016/5/12/chartex" xmlns:cx7="http://schemas.microsoft.com/office/drawing/2016/5/13/chartex" xmlns:cx8="http://schemas.microsoft.com/office/drawing/2016/5/14/chartex" xmlns:mc="http://schemas.openxmlformats.org/markup-compatibility/2006" xmlns:aink="http://schemas.microsoft.com/office/drawing/2016/ink" xmlns:am3d="http://schemas.microsoft.com/office/drawing/2017/model3d" xmlns:o="urn:schemas-microsoft-com:office:office" xmlns:r="http://schemas.openxmlformats.org/officeDocument/2006/relationships" xmlns:m="http://schemas.openxmlformats.org/officeDocument/2006/math" xmlns:v="urn:schemas-microsoft-com:vml" xmlns:wp14="http://schemas.microsoft.com/office/word/2010/wordprocessingDrawing" xmlns:wp="http://schemas.openxmlformats.org/drawingml/2006/wordprocessingDrawing" xmlns:w10="urn:schemas-microsoft-com:office:word" xmlns:w="http://schemas.openxmlformats.org/wordprocessingml/2006/main" xmlns:w14="http://schemas.microsoft.com/office/word/2010/wordml" xmlns:w15="http://schemas.microsoft.com/office/word/2012/wordml" xmlns:w16cex="http://schemas.microsoft.com/office/word/2018/wordml/cex" xmlns:w16cid="http://schemas.microsoft.com/office/word/2016/wordml/cid" xmlns:w16="http://schemas.microsoft.com/office/word/2018/wordml" xmlns:w16sdtdh="http://schemas.microsoft.com/office/word/2020/wordml/sdtdatahash" xmlns:w16se="http://schemas.microsoft.com/office/word/2015/wordml/symex" xmlns:wpg="http://schemas.microsoft.com/office/word/2010/wordprocessingGroup" xmlns:wpi="http://schemas.microsoft.com/office/word/2010/wordprocessingInk" xmlns:wne="http://schemas.microsoft.com/office/word/2006/wordml" xmlns:wps="http://schemas.microsoft.com/office/word/2010/wordprocessingShape" mc:Ignorable="w14 w15 w16se w16cid w16 w16cex w16sdtdh wp14">
   <w:endnote w:type="separator" w:id="-1">
     <w:p>
       <w:pPr>
@@ -13152,7 +15641,7 @@
 </file>
 
 <file path=word/footer1.xml><?xml version="1.0" encoding="utf-8"?>
-<w:ftr xmlns:wpc="http://schemas.microsoft.com/office/word/2010/wordprocessingCanvas" xmlns:cx="http://schemas.microsoft.com/office/drawing/2014/chartex" xmlns:cx1="http://schemas.microsoft.com/office/drawing/2015/9/8/chartex" xmlns:mc="http://schemas.openxmlformats.org/markup-compatibility/2006" xmlns:o="urn:schemas-microsoft-com:office:office" xmlns:r="http://schemas.openxmlformats.org/officeDocument/2006/relationships" xmlns:m="http://schemas.openxmlformats.org/officeDocument/2006/math" xmlns:v="urn:schemas-microsoft-com:vml" xmlns:wp14="http://schemas.microsoft.com/office/word/2010/wordprocessingDrawing" xmlns:wp="http://schemas.openxmlformats.org/drawingml/2006/wordprocessingDrawing" xmlns:w10="urn:schemas-microsoft-com:office:word" xmlns:w="http://schemas.openxmlformats.org/wordprocessingml/2006/main" xmlns:w14="http://schemas.microsoft.com/office/word/2010/wordml" xmlns:w15="http://schemas.microsoft.com/office/word/2012/wordml" xmlns:w16se="http://schemas.microsoft.com/office/word/2015/wordml/symex" xmlns:wpg="http://schemas.microsoft.com/office/word/2010/wordprocessingGroup" xmlns:wpi="http://schemas.microsoft.com/office/word/2010/wordprocessingInk" xmlns:wne="http://schemas.microsoft.com/office/word/2006/wordml" xmlns:wps="http://schemas.microsoft.com/office/word/2010/wordprocessingShape" mc:Ignorable="w14 w15 w16se wp14">
+<w:ftr xmlns:wpc="http://schemas.microsoft.com/office/word/2010/wordprocessingCanvas" xmlns:cx="http://schemas.microsoft.com/office/drawing/2014/chartex" xmlns:cx1="http://schemas.microsoft.com/office/drawing/2015/9/8/chartex" xmlns:cx2="http://schemas.microsoft.com/office/drawing/2015/10/21/chartex" xmlns:cx3="http://schemas.microsoft.com/office/drawing/2016/5/9/chartex" xmlns:cx4="http://schemas.microsoft.com/office/drawing/2016/5/10/chartex" xmlns:cx5="http://schemas.microsoft.com/office/drawing/2016/5/11/chartex" xmlns:cx6="http://schemas.microsoft.com/office/drawing/2016/5/12/chartex" xmlns:cx7="http://schemas.microsoft.com/office/drawing/2016/5/13/chartex" xmlns:cx8="http://schemas.microsoft.com/office/drawing/2016/5/14/chartex" xmlns:mc="http://schemas.openxmlformats.org/markup-compatibility/2006" xmlns:aink="http://schemas.microsoft.com/office/drawing/2016/ink" xmlns:am3d="http://schemas.microsoft.com/office/drawing/2017/model3d" xmlns:o="urn:schemas-microsoft-com:office:office" xmlns:r="http://schemas.openxmlformats.org/officeDocument/2006/relationships" xmlns:m="http://schemas.openxmlformats.org/officeDocument/2006/math" xmlns:v="urn:schemas-microsoft-com:vml" xmlns:wp14="http://schemas.microsoft.com/office/word/2010/wordprocessingDrawing" xmlns:wp="http://schemas.openxmlformats.org/drawingml/2006/wordprocessingDrawing" xmlns:w10="urn:schemas-microsoft-com:office:word" xmlns:w="http://schemas.openxmlformats.org/wordprocessingml/2006/main" xmlns:w14="http://schemas.microsoft.com/office/word/2010/wordml" xmlns:w15="http://schemas.microsoft.com/office/word/2012/wordml" xmlns:w16cex="http://schemas.microsoft.com/office/word/2018/wordml/cex" xmlns:w16cid="http://schemas.microsoft.com/office/word/2016/wordml/cid" xmlns:w16="http://schemas.microsoft.com/office/word/2018/wordml" xmlns:w16sdtdh="http://schemas.microsoft.com/office/word/2020/wordml/sdtdatahash" xmlns:w16se="http://schemas.microsoft.com/office/word/2015/wordml/symex" xmlns:wpg="http://schemas.microsoft.com/office/word/2010/wordprocessingGroup" xmlns:wpi="http://schemas.microsoft.com/office/word/2010/wordprocessingInk" xmlns:wne="http://schemas.microsoft.com/office/word/2006/wordml" xmlns:wps="http://schemas.microsoft.com/office/word/2010/wordprocessingShape" mc:Ignorable="w14 w15 w16se w16cid w16 w16cex w16sdtdh wp14">
   <w:p>
     <w:pPr>
       <w:widowControl w:val="0"/>
@@ -13266,10 +15755,9 @@
           </w:r>
           <w:r>
             <w:rPr>
-              <w:noProof/>
               <w:color w:val="000000"/>
             </w:rPr>
-            <w:t>28</w:t>
+            <w:t>2</w:t>
           </w:r>
           <w:r>
             <w:rPr>
@@ -13317,7 +15805,7 @@
 </file>
 
 <file path=word/footnotes.xml><?xml version="1.0" encoding="utf-8"?>
-<w:footnotes xmlns:wpc="http://schemas.microsoft.com/office/word/2010/wordprocessingCanvas" xmlns:cx="http://schemas.microsoft.com/office/drawing/2014/chartex" xmlns:cx1="http://schemas.microsoft.com/office/drawing/2015/9/8/chartex" xmlns:mc="http://schemas.openxmlformats.org/markup-compatibility/2006" xmlns:o="urn:schemas-microsoft-com:office:office" xmlns:r="http://schemas.openxmlformats.org/officeDocument/2006/relationships" xmlns:m="http://schemas.openxmlformats.org/officeDocument/2006/math" xmlns:v="urn:schemas-microsoft-com:vml" xmlns:wp14="http://schemas.microsoft.com/office/word/2010/wordprocessingDrawing" xmlns:wp="http://schemas.openxmlformats.org/drawingml/2006/wordprocessingDrawing" xmlns:w10="urn:schemas-microsoft-com:office:word" xmlns:w="http://schemas.openxmlformats.org/wordprocessingml/2006/main" xmlns:w14="http://schemas.microsoft.com/office/word/2010/wordml" xmlns:w15="http://schemas.microsoft.com/office/word/2012/wordml" xmlns:w16se="http://schemas.microsoft.com/office/word/2015/wordml/symex" xmlns:wpg="http://schemas.microsoft.com/office/word/2010/wordprocessingGroup" xmlns:wpi="http://schemas.microsoft.com/office/word/2010/wordprocessingInk" xmlns:wne="http://schemas.microsoft.com/office/word/2006/wordml" xmlns:wps="http://schemas.microsoft.com/office/word/2010/wordprocessingShape" mc:Ignorable="w14 w15 w16se wp14">
+<w:footnotes xmlns:wpc="http://schemas.microsoft.com/office/word/2010/wordprocessingCanvas" xmlns:cx="http://schemas.microsoft.com/office/drawing/2014/chartex" xmlns:cx1="http://schemas.microsoft.com/office/drawing/2015/9/8/chartex" xmlns:cx2="http://schemas.microsoft.com/office/drawing/2015/10/21/chartex" xmlns:cx3="http://schemas.microsoft.com/office/drawing/2016/5/9/chartex" xmlns:cx4="http://schemas.microsoft.com/office/drawing/2016/5/10/chartex" xmlns:cx5="http://schemas.microsoft.com/office/drawing/2016/5/11/chartex" xmlns:cx6="http://schemas.microsoft.com/office/drawing/2016/5/12/chartex" xmlns:cx7="http://schemas.microsoft.com/office/drawing/2016/5/13/chartex" xmlns:cx8="http://schemas.microsoft.com/office/drawing/2016/5/14/chartex" xmlns:mc="http://schemas.openxmlformats.org/markup-compatibility/2006" xmlns:aink="http://schemas.microsoft.com/office/drawing/2016/ink" xmlns:am3d="http://schemas.microsoft.com/office/drawing/2017/model3d" xmlns:o="urn:schemas-microsoft-com:office:office" xmlns:r="http://schemas.openxmlformats.org/officeDocument/2006/relationships" xmlns:m="http://schemas.openxmlformats.org/officeDocument/2006/math" xmlns:v="urn:schemas-microsoft-com:vml" xmlns:wp14="http://schemas.microsoft.com/office/word/2010/wordprocessingDrawing" xmlns:wp="http://schemas.openxmlformats.org/drawingml/2006/wordprocessingDrawing" xmlns:w10="urn:schemas-microsoft-com:office:word" xmlns:w="http://schemas.openxmlformats.org/wordprocessingml/2006/main" xmlns:w14="http://schemas.microsoft.com/office/word/2010/wordml" xmlns:w15="http://schemas.microsoft.com/office/word/2012/wordml" xmlns:w16cex="http://schemas.microsoft.com/office/word/2018/wordml/cex" xmlns:w16cid="http://schemas.microsoft.com/office/word/2016/wordml/cid" xmlns:w16="http://schemas.microsoft.com/office/word/2018/wordml" xmlns:w16sdtdh="http://schemas.microsoft.com/office/word/2020/wordml/sdtdatahash" xmlns:w16se="http://schemas.microsoft.com/office/word/2015/wordml/symex" xmlns:wpg="http://schemas.microsoft.com/office/word/2010/wordprocessingGroup" xmlns:wpi="http://schemas.microsoft.com/office/word/2010/wordprocessingInk" xmlns:wne="http://schemas.microsoft.com/office/word/2006/wordml" xmlns:wps="http://schemas.microsoft.com/office/word/2010/wordprocessingShape" mc:Ignorable="w14 w15 w16se w16cid w16 w16cex w16sdtdh wp14">
   <w:footnote w:type="separator" w:id="-1">
     <w:p>
       <w:pPr>
@@ -13342,7 +15830,7 @@
 </file>
 
 <file path=word/numbering.xml><?xml version="1.0" encoding="utf-8"?>
-<w:numbering xmlns:wpc="http://schemas.microsoft.com/office/word/2010/wordprocessingCanvas" xmlns:cx="http://schemas.microsoft.com/office/drawing/2014/chartex" xmlns:cx1="http://schemas.microsoft.com/office/drawing/2015/9/8/chartex" xmlns:mc="http://schemas.openxmlformats.org/markup-compatibility/2006" xmlns:o="urn:schemas-microsoft-com:office:office" xmlns:r="http://schemas.openxmlformats.org/officeDocument/2006/relationships" xmlns:m="http://schemas.openxmlformats.org/officeDocument/2006/math" xmlns:v="urn:schemas-microsoft-com:vml" xmlns:wp14="http://schemas.microsoft.com/office/word/2010/wordprocessingDrawing" xmlns:wp="http://schemas.openxmlformats.org/drawingml/2006/wordprocessingDrawing" xmlns:w10="urn:schemas-microsoft-com:office:word" xmlns:w="http://schemas.openxmlformats.org/wordprocessingml/2006/main" xmlns:w14="http://schemas.microsoft.com/office/word/2010/wordml" xmlns:w15="http://schemas.microsoft.com/office/word/2012/wordml" xmlns:w16se="http://schemas.microsoft.com/office/word/2015/wordml/symex" xmlns:wpg="http://schemas.microsoft.com/office/word/2010/wordprocessingGroup" xmlns:wpi="http://schemas.microsoft.com/office/word/2010/wordprocessingInk" xmlns:wne="http://schemas.microsoft.com/office/word/2006/wordml" xmlns:wps="http://schemas.microsoft.com/office/word/2010/wordprocessingShape" mc:Ignorable="w14 w15 w16se wp14">
+<w:numbering xmlns:wpc="http://schemas.microsoft.com/office/word/2010/wordprocessingCanvas" xmlns:cx="http://schemas.microsoft.com/office/drawing/2014/chartex" xmlns:cx1="http://schemas.microsoft.com/office/drawing/2015/9/8/chartex" xmlns:cx2="http://schemas.microsoft.com/office/drawing/2015/10/21/chartex" xmlns:cx3="http://schemas.microsoft.com/office/drawing/2016/5/9/chartex" xmlns:cx4="http://schemas.microsoft.com/office/drawing/2016/5/10/chartex" xmlns:cx5="http://schemas.microsoft.com/office/drawing/2016/5/11/chartex" xmlns:cx6="http://schemas.microsoft.com/office/drawing/2016/5/12/chartex" xmlns:cx7="http://schemas.microsoft.com/office/drawing/2016/5/13/chartex" xmlns:cx8="http://schemas.microsoft.com/office/drawing/2016/5/14/chartex" xmlns:mc="http://schemas.openxmlformats.org/markup-compatibility/2006" xmlns:aink="http://schemas.microsoft.com/office/drawing/2016/ink" xmlns:am3d="http://schemas.microsoft.com/office/drawing/2017/model3d" xmlns:o="urn:schemas-microsoft-com:office:office" xmlns:r="http://schemas.openxmlformats.org/officeDocument/2006/relationships" xmlns:m="http://schemas.openxmlformats.org/officeDocument/2006/math" xmlns:v="urn:schemas-microsoft-com:vml" xmlns:wp14="http://schemas.microsoft.com/office/word/2010/wordprocessingDrawing" xmlns:wp="http://schemas.openxmlformats.org/drawingml/2006/wordprocessingDrawing" xmlns:w10="urn:schemas-microsoft-com:office:word" xmlns:w="http://schemas.openxmlformats.org/wordprocessingml/2006/main" xmlns:w14="http://schemas.microsoft.com/office/word/2010/wordml" xmlns:w15="http://schemas.microsoft.com/office/word/2012/wordml" xmlns:w16cex="http://schemas.microsoft.com/office/word/2018/wordml/cex" xmlns:w16cid="http://schemas.microsoft.com/office/word/2016/wordml/cid" xmlns:w16="http://schemas.microsoft.com/office/word/2018/wordml" xmlns:w16sdtdh="http://schemas.microsoft.com/office/word/2020/wordml/sdtdatahash" xmlns:w16se="http://schemas.microsoft.com/office/word/2015/wordml/symex" xmlns:wpg="http://schemas.microsoft.com/office/word/2010/wordprocessingGroup" xmlns:wpi="http://schemas.microsoft.com/office/word/2010/wordprocessingInk" xmlns:wne="http://schemas.microsoft.com/office/word/2006/wordml" xmlns:wps="http://schemas.microsoft.com/office/word/2010/wordprocessingShape" mc:Ignorable="w14 w15 w16se w16cid w16 w16cex w16sdtdh wp14">
   <w:abstractNum w:abstractNumId="0" w15:restartNumberingAfterBreak="0">
     <w:nsid w:val="12E9202F"/>
     <w:multiLevelType w:val="hybridMultilevel"/>
@@ -13954,7 +16442,7 @@
 </file>
 
 <file path=word/styles.xml><?xml version="1.0" encoding="utf-8"?>
-<w:styles xmlns:mc="http://schemas.openxmlformats.org/markup-compatibility/2006" xmlns:r="http://schemas.openxmlformats.org/officeDocument/2006/relationships" xmlns:w="http://schemas.openxmlformats.org/wordprocessingml/2006/main" xmlns:w14="http://schemas.microsoft.com/office/word/2010/wordml" xmlns:w15="http://schemas.microsoft.com/office/word/2012/wordml" xmlns:w16se="http://schemas.microsoft.com/office/word/2015/wordml/symex" mc:Ignorable="w14 w15 w16se">
+<w:styles xmlns:mc="http://schemas.openxmlformats.org/markup-compatibility/2006" xmlns:r="http://schemas.openxmlformats.org/officeDocument/2006/relationships" xmlns:w="http://schemas.openxmlformats.org/wordprocessingml/2006/main" xmlns:w14="http://schemas.microsoft.com/office/word/2010/wordml" xmlns:w15="http://schemas.microsoft.com/office/word/2012/wordml" xmlns:w16cex="http://schemas.microsoft.com/office/word/2018/wordml/cex" xmlns:w16cid="http://schemas.microsoft.com/office/word/2016/wordml/cid" xmlns:w16="http://schemas.microsoft.com/office/word/2018/wordml" xmlns:w16sdtdh="http://schemas.microsoft.com/office/word/2020/wordml/sdtdatahash" xmlns:w16se="http://schemas.microsoft.com/office/word/2015/wordml/symex" mc:Ignorable="w14 w15 w16se w16cid w16 w16cex w16sdtdh">
   <w:docDefaults>
     <w:rPrDefault>
       <w:rPr>
@@ -13970,7 +16458,7 @@
       </w:pPr>
     </w:pPrDefault>
   </w:docDefaults>
-  <w:latentStyles w:defLockedState="0" w:defUIPriority="99" w:defSemiHidden="0" w:defUnhideWhenUsed="0" w:defQFormat="0" w:count="371">
+  <w:latentStyles w:defLockedState="0" w:defUIPriority="99" w:defSemiHidden="0" w:defUnhideWhenUsed="0" w:defQFormat="0" w:count="376">
     <w:lsdException w:name="Normal" w:uiPriority="0" w:qFormat="1"/>
     <w:lsdException w:name="heading 1" w:uiPriority="9" w:qFormat="1"/>
     <w:lsdException w:name="heading 2" w:semiHidden="1" w:uiPriority="9" w:unhideWhenUsed="1" w:qFormat="1"/>
@@ -14125,6 +16613,7 @@
     <w:lsdException w:name="Table Web 2" w:semiHidden="1" w:unhideWhenUsed="1"/>
     <w:lsdException w:name="Table Web 3" w:semiHidden="1" w:unhideWhenUsed="1"/>
     <w:lsdException w:name="Balloon Text" w:semiHidden="1" w:unhideWhenUsed="1"/>
+    <w:lsdException w:name="Table Grid" w:uiPriority="39"/>
     <w:lsdException w:name="Table Theme" w:semiHidden="1" w:unhideWhenUsed="1"/>
     <w:lsdException w:name="Placeholder Text" w:semiHidden="1"/>
     <w:lsdException w:name="No Spacing" w:uiPriority="1" w:qFormat="1"/>
@@ -14341,11 +16830,15 @@
     <w:lsdException w:name="List Table 5 Dark Accent 6" w:uiPriority="50"/>
     <w:lsdException w:name="List Table 6 Colorful Accent 6" w:uiPriority="51"/>
     <w:lsdException w:name="List Table 7 Colorful Accent 6" w:uiPriority="52"/>
+    <w:lsdException w:name="Mention" w:semiHidden="1" w:unhideWhenUsed="1"/>
+    <w:lsdException w:name="Smart Hyperlink" w:semiHidden="1" w:unhideWhenUsed="1"/>
+    <w:lsdException w:name="Hashtag" w:semiHidden="1" w:unhideWhenUsed="1"/>
+    <w:lsdException w:name="Unresolved Mention" w:semiHidden="1" w:unhideWhenUsed="1"/>
+    <w:lsdException w:name="Smart Link" w:semiHidden="1" w:unhideWhenUsed="1"/>
   </w:latentStyles>
   <w:style w:type="paragraph" w:default="1" w:styleId="Normal">
     <w:name w:val="Normal"/>
     <w:qFormat/>
-    <w:rsid w:val="00972B4B"/>
   </w:style>
   <w:style w:type="paragraph" w:styleId="Heading1">
     <w:name w:val="heading 1"/>
@@ -14546,7 +17039,7 @@
   <w:style w:type="table" w:styleId="TableGrid">
     <w:name w:val="Table Grid"/>
     <w:basedOn w:val="TableNormal"/>
-    <w:uiPriority w:val="99"/>
+    <w:uiPriority w:val="39"/>
     <w:rsid w:val="00282B13"/>
     <w:pPr>
       <w:spacing w:after="0" w:line="240" w:lineRule="auto"/>
@@ -15063,7 +17556,7 @@
 </file>
 
 <file path=customXml/itemProps1.xml><?xml version="1.0" encoding="utf-8"?>
-<ds:datastoreItem xmlns:ds="http://schemas.openxmlformats.org/officeDocument/2006/customXml" ds:itemID="{C72AE237-BD7F-4B41-950D-256B5243C10C}">
+<ds:datastoreItem xmlns:ds="http://schemas.openxmlformats.org/officeDocument/2006/customXml" ds:itemID="{3DDEED10-AB46-4DEF-905D-480CA415ECFA}">
   <ds:schemaRefs>
     <ds:schemaRef ds:uri="http://schemas.openxmlformats.org/officeDocument/2006/bibliography"/>
   </ds:schemaRefs>

</xml_diff>